<commit_message>
Update Logic for Card Set
</commit_message>
<xml_diff>
--- a/Document/Thiết_kế_hệ_thống.docx
+++ b/Document/Thiết_kế_hệ_thống.docx
@@ -1,10 +1,38 @@
 
 <file path=word/document.xml><?xml version="1.0" encoding="utf-8"?>
-<w:document xmlns:wpc="http://schemas.microsoft.com/office/word/2010/wordprocessingCanvas" xmlns:mc="http://schemas.openxmlformats.org/markup-compatibility/2006" xmlns:o="urn:schemas-microsoft-com:office:office" xmlns:r="http://schemas.openxmlformats.org/officeDocument/2006/relationships" xmlns:m="http://schemas.openxmlformats.org/officeDocument/2006/math" xmlns:v="urn:schemas-microsoft-com:vml" xmlns:wp14="http://schemas.microsoft.com/office/word/2010/wordprocessingDrawing" xmlns:wp="http://schemas.openxmlformats.org/drawingml/2006/wordprocessingDrawing" xmlns:w10="urn:schemas-microsoft-com:office:word" xmlns:w="http://schemas.openxmlformats.org/wordprocessingml/2006/main" xmlns:w14="http://schemas.microsoft.com/office/word/2010/wordml" xmlns:w15="http://schemas.microsoft.com/office/word/2012/wordml" xmlns:wpg="http://schemas.microsoft.com/office/word/2010/wordprocessingGroup" xmlns:wpi="http://schemas.microsoft.com/office/word/2010/wordprocessingInk" xmlns:wne="http://schemas.microsoft.com/office/word/2006/wordml" xmlns:wps="http://schemas.microsoft.com/office/word/2010/wordprocessingShape" mc:Ignorable="w14 w15 wp14">
+<w:document xmlns:wpc="http://schemas.microsoft.com/office/word/2010/wordprocessingCanvas" xmlns:cx="http://schemas.microsoft.com/office/drawing/2014/chartex" xmlns:mc="http://schemas.openxmlformats.org/markup-compatibility/2006" xmlns:o="urn:schemas-microsoft-com:office:office" xmlns:r="http://schemas.openxmlformats.org/officeDocument/2006/relationships" xmlns:m="http://schemas.openxmlformats.org/officeDocument/2006/math" xmlns:v="urn:schemas-microsoft-com:vml" xmlns:wp14="http://schemas.microsoft.com/office/word/2010/wordprocessingDrawing" xmlns:wp="http://schemas.openxmlformats.org/drawingml/2006/wordprocessingDrawing" xmlns:w10="urn:schemas-microsoft-com:office:word" xmlns:w="http://schemas.openxmlformats.org/wordprocessingml/2006/main" xmlns:w14="http://schemas.microsoft.com/office/word/2010/wordml" xmlns:w15="http://schemas.microsoft.com/office/word/2012/wordml" xmlns:w16se="http://schemas.microsoft.com/office/word/2015/wordml/symex" xmlns:wpg="http://schemas.microsoft.com/office/word/2010/wordprocessingGroup" xmlns:wpi="http://schemas.microsoft.com/office/word/2010/wordprocessingInk" xmlns:wne="http://schemas.microsoft.com/office/word/2006/wordml" xmlns:wps="http://schemas.microsoft.com/office/word/2010/wordprocessingShape" mc:Ignorable="w14 w15 w16se wp14">
   <w:body>
     <w:p>
-      <w:bookmarkStart w:id="0" w:name="_GoBack"/>
-      <w:r>
+      <w:pPr>
+        <w:rPr>
+          <w:noProof/>
+        </w:rPr>
+      </w:pPr>
+      <w:r>
+        <w:rPr>
+          <w:noProof/>
+        </w:rPr>
+        <w:t>1.  Thiết kế cơ sở dữ liệu</w:t>
+      </w:r>
+    </w:p>
+    <w:p>
+      <w:pPr>
+        <w:rPr>
+          <w:noProof/>
+        </w:rPr>
+      </w:pPr>
+      <w:r>
+        <w:rPr>
+          <w:noProof/>
+        </w:rPr>
+        <w:t xml:space="preserve">-EED: </w:t>
+      </w:r>
+    </w:p>
+    <w:p>
+      <w:r>
+        <w:rPr>
+          <w:noProof/>
+        </w:rPr>
         <w:drawing>
           <wp:inline distT="0" distB="0" distL="0" distR="0" wp14:anchorId="12138E2C" wp14:editId="6C3757D8">
             <wp:extent cx="5943600" cy="3343275"/>
@@ -21,7 +49,7 @@
                     <pic:cNvPicPr/>
                   </pic:nvPicPr>
                   <pic:blipFill>
-                    <a:blip r:embed="rId4"/>
+                    <a:blip r:embed="rId5"/>
                     <a:stretch>
                       <a:fillRect/>
                     </a:stretch>
@@ -41,7 +69,1618 @@
           </wp:inline>
         </w:drawing>
       </w:r>
+    </w:p>
+    <w:p>
+      <w:r>
+        <w:t>-</w:t>
+      </w:r>
+      <w:proofErr w:type="spellStart"/>
+      <w:r>
+        <w:t>FlashCardSQLiteHelper</w:t>
+      </w:r>
+      <w:proofErr w:type="spellEnd"/>
+      <w:r>
+        <w:t xml:space="preserve">: </w:t>
+      </w:r>
+      <w:proofErr w:type="spellStart"/>
+      <w:r>
+        <w:t>tạo</w:t>
+      </w:r>
+      <w:proofErr w:type="spellEnd"/>
+      <w:r>
+        <w:t xml:space="preserve"> </w:t>
+      </w:r>
+      <w:proofErr w:type="spellStart"/>
+      <w:r>
+        <w:t>và</w:t>
+      </w:r>
+      <w:proofErr w:type="spellEnd"/>
+      <w:r>
+        <w:t xml:space="preserve"> </w:t>
+      </w:r>
+      <w:proofErr w:type="spellStart"/>
+      <w:r>
+        <w:t>quản</w:t>
+      </w:r>
+      <w:proofErr w:type="spellEnd"/>
+      <w:r>
+        <w:t xml:space="preserve"> </w:t>
+      </w:r>
+      <w:proofErr w:type="spellStart"/>
+      <w:r>
+        <w:t>lý</w:t>
+      </w:r>
+      <w:proofErr w:type="spellEnd"/>
+      <w:r>
+        <w:t xml:space="preserve"> database</w:t>
+      </w:r>
+    </w:p>
+    <w:p>
+      <w:r>
+        <w:drawing>
+          <wp:inline distT="0" distB="0" distL="0" distR="0" wp14:anchorId="66DB47A7" wp14:editId="4986164C">
+            <wp:extent cx="4320330" cy="2318023"/>
+            <wp:effectExtent l="0" t="0" r="4445" b="6350"/>
+            <wp:docPr id="5" name="Picture 5"/>
+            <wp:cNvGraphicFramePr>
+              <a:graphicFrameLocks xmlns:a="http://schemas.openxmlformats.org/drawingml/2006/main" noChangeAspect="1"/>
+            </wp:cNvGraphicFramePr>
+            <a:graphic xmlns:a="http://schemas.openxmlformats.org/drawingml/2006/main">
+              <a:graphicData uri="http://schemas.openxmlformats.org/drawingml/2006/picture">
+                <pic:pic xmlns:pic="http://schemas.openxmlformats.org/drawingml/2006/picture">
+                  <pic:nvPicPr>
+                    <pic:cNvPr id="1" name=""/>
+                    <pic:cNvPicPr/>
+                  </pic:nvPicPr>
+                  <pic:blipFill>
+                    <a:blip r:embed="rId6"/>
+                    <a:stretch>
+                      <a:fillRect/>
+                    </a:stretch>
+                  </pic:blipFill>
+                  <pic:spPr>
+                    <a:xfrm>
+                      <a:off x="0" y="0"/>
+                      <a:ext cx="4333113" cy="2324882"/>
+                    </a:xfrm>
+                    <a:prstGeom prst="rect">
+                      <a:avLst/>
+                    </a:prstGeom>
+                  </pic:spPr>
+                </pic:pic>
+              </a:graphicData>
+            </a:graphic>
+          </wp:inline>
+        </w:drawing>
+      </w:r>
+    </w:p>
+    <w:p>
+      <w:pPr>
+        <w:rPr>
+          <w:sz w:val="28"/>
+          <w:szCs w:val="28"/>
+        </w:rPr>
+      </w:pPr>
+      <w:r>
+        <w:rPr>
+          <w:sz w:val="28"/>
+          <w:szCs w:val="28"/>
+        </w:rPr>
+        <w:t xml:space="preserve">2. </w:t>
+      </w:r>
+      <w:proofErr w:type="spellStart"/>
+      <w:r>
+        <w:rPr>
+          <w:sz w:val="28"/>
+          <w:szCs w:val="28"/>
+        </w:rPr>
+        <w:t>Thiết</w:t>
+      </w:r>
+      <w:proofErr w:type="spellEnd"/>
+      <w:r>
+        <w:rPr>
+          <w:sz w:val="28"/>
+          <w:szCs w:val="28"/>
+        </w:rPr>
+        <w:t xml:space="preserve"> </w:t>
+      </w:r>
+      <w:proofErr w:type="spellStart"/>
+      <w:r>
+        <w:rPr>
+          <w:sz w:val="28"/>
+          <w:szCs w:val="28"/>
+        </w:rPr>
+        <w:t>kế</w:t>
+      </w:r>
+      <w:proofErr w:type="spellEnd"/>
+      <w:r>
+        <w:rPr>
+          <w:sz w:val="28"/>
+          <w:szCs w:val="28"/>
+        </w:rPr>
+        <w:t xml:space="preserve"> </w:t>
+      </w:r>
+      <w:proofErr w:type="spellStart"/>
+      <w:r>
+        <w:rPr>
+          <w:sz w:val="28"/>
+          <w:szCs w:val="28"/>
+        </w:rPr>
+        <w:t>giao</w:t>
+      </w:r>
+      <w:proofErr w:type="spellEnd"/>
+      <w:r>
+        <w:rPr>
+          <w:sz w:val="28"/>
+          <w:szCs w:val="28"/>
+        </w:rPr>
+        <w:t xml:space="preserve"> </w:t>
+      </w:r>
+      <w:proofErr w:type="spellStart"/>
+      <w:r>
+        <w:rPr>
+          <w:sz w:val="28"/>
+          <w:szCs w:val="28"/>
+        </w:rPr>
+        <w:t>diện</w:t>
+      </w:r>
+      <w:proofErr w:type="spellEnd"/>
+    </w:p>
+    <w:p>
+      <w:pPr>
+        <w:ind w:left="360"/>
+        <w:jc w:val="center"/>
+        <w:rPr>
+          <w:sz w:val="28"/>
+          <w:szCs w:val="28"/>
+        </w:rPr>
+      </w:pPr>
+      <w:r>
+        <w:lastRenderedPageBreak/>
+        <w:drawing>
+          <wp:inline distT="0" distB="0" distL="0" distR="0" wp14:anchorId="28BB0352" wp14:editId="72BF5B1F">
+            <wp:extent cx="2428584" cy="5008228"/>
+            <wp:effectExtent l="0" t="0" r="0" b="2540"/>
+            <wp:docPr id="2" name="Picture 2"/>
+            <wp:cNvGraphicFramePr>
+              <a:graphicFrameLocks xmlns:a="http://schemas.openxmlformats.org/drawingml/2006/main" noChangeAspect="1"/>
+            </wp:cNvGraphicFramePr>
+            <a:graphic xmlns:a="http://schemas.openxmlformats.org/drawingml/2006/main">
+              <a:graphicData uri="http://schemas.openxmlformats.org/drawingml/2006/picture">
+                <pic:pic xmlns:pic="http://schemas.openxmlformats.org/drawingml/2006/picture">
+                  <pic:nvPicPr>
+                    <pic:cNvPr id="1" name=""/>
+                    <pic:cNvPicPr/>
+                  </pic:nvPicPr>
+                  <pic:blipFill>
+                    <a:blip r:embed="rId7"/>
+                    <a:stretch>
+                      <a:fillRect/>
+                    </a:stretch>
+                  </pic:blipFill>
+                  <pic:spPr>
+                    <a:xfrm>
+                      <a:off x="0" y="0"/>
+                      <a:ext cx="2439744" cy="5031241"/>
+                    </a:xfrm>
+                    <a:prstGeom prst="rect">
+                      <a:avLst/>
+                    </a:prstGeom>
+                  </pic:spPr>
+                </pic:pic>
+              </a:graphicData>
+            </a:graphic>
+          </wp:inline>
+        </w:drawing>
+      </w:r>
+    </w:p>
+    <w:p>
+      <w:pPr>
+        <w:rPr>
+          <w:sz w:val="28"/>
+          <w:szCs w:val="28"/>
+        </w:rPr>
+      </w:pPr>
+      <w:r>
+        <w:rPr>
+          <w:sz w:val="28"/>
+          <w:szCs w:val="28"/>
+        </w:rPr>
+        <w:t xml:space="preserve">-ở </w:t>
+      </w:r>
+      <w:proofErr w:type="spellStart"/>
+      <w:r>
+        <w:rPr>
+          <w:sz w:val="28"/>
+          <w:szCs w:val="28"/>
+        </w:rPr>
+        <w:t>trang</w:t>
+      </w:r>
+      <w:proofErr w:type="spellEnd"/>
+      <w:r>
+        <w:rPr>
+          <w:sz w:val="28"/>
+          <w:szCs w:val="28"/>
+        </w:rPr>
+        <w:t xml:space="preserve"> </w:t>
+      </w:r>
+      <w:proofErr w:type="spellStart"/>
+      <w:r>
+        <w:rPr>
+          <w:sz w:val="28"/>
+          <w:szCs w:val="28"/>
+        </w:rPr>
+        <w:t>chủ</w:t>
+      </w:r>
+      <w:proofErr w:type="spellEnd"/>
+      <w:r>
+        <w:rPr>
+          <w:sz w:val="28"/>
+          <w:szCs w:val="28"/>
+        </w:rPr>
+        <w:t xml:space="preserve">, </w:t>
+      </w:r>
+      <w:proofErr w:type="spellStart"/>
+      <w:r>
+        <w:rPr>
+          <w:sz w:val="28"/>
+          <w:szCs w:val="28"/>
+        </w:rPr>
+        <w:t>màn</w:t>
+      </w:r>
+      <w:proofErr w:type="spellEnd"/>
+      <w:r>
+        <w:rPr>
+          <w:sz w:val="28"/>
+          <w:szCs w:val="28"/>
+        </w:rPr>
+        <w:t xml:space="preserve"> </w:t>
+      </w:r>
+      <w:proofErr w:type="spellStart"/>
+      <w:r>
+        <w:rPr>
+          <w:sz w:val="28"/>
+          <w:szCs w:val="28"/>
+        </w:rPr>
+        <w:t>hình</w:t>
+      </w:r>
+      <w:proofErr w:type="spellEnd"/>
+      <w:r>
+        <w:rPr>
+          <w:sz w:val="28"/>
+          <w:szCs w:val="28"/>
+        </w:rPr>
+        <w:t xml:space="preserve"> </w:t>
+      </w:r>
+      <w:proofErr w:type="spellStart"/>
+      <w:r>
+        <w:rPr>
+          <w:sz w:val="28"/>
+          <w:szCs w:val="28"/>
+        </w:rPr>
+        <w:t>sẽ</w:t>
+      </w:r>
+      <w:proofErr w:type="spellEnd"/>
+      <w:r>
+        <w:rPr>
+          <w:sz w:val="28"/>
+          <w:szCs w:val="28"/>
+        </w:rPr>
+        <w:t xml:space="preserve"> </w:t>
+      </w:r>
+      <w:proofErr w:type="spellStart"/>
+      <w:r>
+        <w:rPr>
+          <w:sz w:val="28"/>
+          <w:szCs w:val="28"/>
+        </w:rPr>
+        <w:t>hiển</w:t>
+      </w:r>
+      <w:proofErr w:type="spellEnd"/>
+      <w:r>
+        <w:rPr>
+          <w:sz w:val="28"/>
+          <w:szCs w:val="28"/>
+        </w:rPr>
+        <w:t xml:space="preserve"> </w:t>
+      </w:r>
+      <w:proofErr w:type="spellStart"/>
+      <w:r>
+        <w:rPr>
+          <w:sz w:val="28"/>
+          <w:szCs w:val="28"/>
+        </w:rPr>
+        <w:t>thị</w:t>
+      </w:r>
+      <w:proofErr w:type="spellEnd"/>
+      <w:r>
+        <w:rPr>
+          <w:sz w:val="28"/>
+          <w:szCs w:val="28"/>
+        </w:rPr>
+        <w:t xml:space="preserve"> </w:t>
+      </w:r>
+      <w:proofErr w:type="spellStart"/>
+      <w:r>
+        <w:rPr>
+          <w:sz w:val="28"/>
+          <w:szCs w:val="28"/>
+        </w:rPr>
+        <w:t>danh</w:t>
+      </w:r>
+      <w:proofErr w:type="spellEnd"/>
+      <w:r>
+        <w:rPr>
+          <w:sz w:val="28"/>
+          <w:szCs w:val="28"/>
+        </w:rPr>
+        <w:t xml:space="preserve"> </w:t>
+      </w:r>
+      <w:proofErr w:type="spellStart"/>
+      <w:r>
+        <w:rPr>
+          <w:sz w:val="28"/>
+          <w:szCs w:val="28"/>
+        </w:rPr>
+        <w:t>sách</w:t>
+      </w:r>
+      <w:proofErr w:type="spellEnd"/>
+      <w:r>
+        <w:rPr>
+          <w:sz w:val="28"/>
+          <w:szCs w:val="28"/>
+        </w:rPr>
+        <w:t xml:space="preserve"> </w:t>
+      </w:r>
+      <w:proofErr w:type="spellStart"/>
+      <w:r>
+        <w:rPr>
+          <w:sz w:val="28"/>
+          <w:szCs w:val="28"/>
+        </w:rPr>
+        <w:t>các</w:t>
+      </w:r>
+      <w:proofErr w:type="spellEnd"/>
+      <w:r>
+        <w:rPr>
+          <w:sz w:val="28"/>
+          <w:szCs w:val="28"/>
+        </w:rPr>
+        <w:t xml:space="preserve"> set </w:t>
+      </w:r>
+      <w:proofErr w:type="spellStart"/>
+      <w:r>
+        <w:rPr>
+          <w:sz w:val="28"/>
+          <w:szCs w:val="28"/>
+        </w:rPr>
+        <w:t>thẻ</w:t>
+      </w:r>
+      <w:proofErr w:type="spellEnd"/>
+      <w:r>
+        <w:rPr>
+          <w:sz w:val="28"/>
+          <w:szCs w:val="28"/>
+        </w:rPr>
+        <w:t xml:space="preserve"> </w:t>
+      </w:r>
+      <w:proofErr w:type="spellStart"/>
+      <w:r>
+        <w:rPr>
+          <w:sz w:val="28"/>
+          <w:szCs w:val="28"/>
+        </w:rPr>
+        <w:t>n</w:t>
+      </w:r>
+      <w:bookmarkStart w:id="0" w:name="_GoBack"/>
       <w:bookmarkEnd w:id="0"/>
+      <w:r>
+        <w:rPr>
+          <w:sz w:val="28"/>
+          <w:szCs w:val="28"/>
+        </w:rPr>
+        <w:t>hớ</w:t>
+      </w:r>
+      <w:proofErr w:type="spellEnd"/>
+      <w:r>
+        <w:rPr>
+          <w:sz w:val="28"/>
+          <w:szCs w:val="28"/>
+        </w:rPr>
+        <w:t xml:space="preserve"> </w:t>
+      </w:r>
+      <w:proofErr w:type="spellStart"/>
+      <w:r>
+        <w:rPr>
+          <w:sz w:val="28"/>
+          <w:szCs w:val="28"/>
+        </w:rPr>
+        <w:t>đã</w:t>
+      </w:r>
+      <w:proofErr w:type="spellEnd"/>
+      <w:r>
+        <w:rPr>
+          <w:sz w:val="28"/>
+          <w:szCs w:val="28"/>
+        </w:rPr>
+        <w:t xml:space="preserve"> </w:t>
+      </w:r>
+      <w:proofErr w:type="spellStart"/>
+      <w:r>
+        <w:rPr>
+          <w:sz w:val="28"/>
+          <w:szCs w:val="28"/>
+        </w:rPr>
+        <w:t>được</w:t>
+      </w:r>
+      <w:proofErr w:type="spellEnd"/>
+      <w:r>
+        <w:rPr>
+          <w:sz w:val="28"/>
+          <w:szCs w:val="28"/>
+        </w:rPr>
+        <w:t xml:space="preserve"> </w:t>
+      </w:r>
+      <w:proofErr w:type="spellStart"/>
+      <w:r>
+        <w:rPr>
+          <w:sz w:val="28"/>
+          <w:szCs w:val="28"/>
+        </w:rPr>
+        <w:t>tạo</w:t>
+      </w:r>
+      <w:proofErr w:type="spellEnd"/>
+      <w:r>
+        <w:rPr>
+          <w:sz w:val="28"/>
+          <w:szCs w:val="28"/>
+        </w:rPr>
+        <w:t xml:space="preserve"> </w:t>
+      </w:r>
+      <w:proofErr w:type="spellStart"/>
+      <w:r>
+        <w:rPr>
+          <w:sz w:val="28"/>
+          <w:szCs w:val="28"/>
+        </w:rPr>
+        <w:t>trong</w:t>
+      </w:r>
+      <w:proofErr w:type="spellEnd"/>
+      <w:r>
+        <w:rPr>
+          <w:sz w:val="28"/>
+          <w:szCs w:val="28"/>
+        </w:rPr>
+        <w:t xml:space="preserve"> </w:t>
+      </w:r>
+      <w:proofErr w:type="spellStart"/>
+      <w:r>
+        <w:rPr>
+          <w:sz w:val="28"/>
+          <w:szCs w:val="28"/>
+        </w:rPr>
+        <w:t>csdl</w:t>
+      </w:r>
+      <w:proofErr w:type="spellEnd"/>
+      <w:r>
+        <w:rPr>
+          <w:sz w:val="28"/>
+          <w:szCs w:val="28"/>
+        </w:rPr>
+        <w:t>.</w:t>
+      </w:r>
+    </w:p>
+    <w:p>
+      <w:pPr>
+        <w:rPr>
+          <w:sz w:val="28"/>
+          <w:szCs w:val="28"/>
+        </w:rPr>
+      </w:pPr>
+      <w:r>
+        <w:rPr>
+          <w:sz w:val="28"/>
+          <w:szCs w:val="28"/>
+        </w:rPr>
+        <w:t>+</w:t>
+      </w:r>
+      <w:proofErr w:type="spellStart"/>
+      <w:r>
+        <w:rPr>
+          <w:sz w:val="28"/>
+          <w:szCs w:val="28"/>
+        </w:rPr>
+        <w:t>Hiển</w:t>
+      </w:r>
+      <w:proofErr w:type="spellEnd"/>
+      <w:r>
+        <w:rPr>
+          <w:sz w:val="28"/>
+          <w:szCs w:val="28"/>
+        </w:rPr>
+        <w:t xml:space="preserve"> </w:t>
+      </w:r>
+      <w:proofErr w:type="spellStart"/>
+      <w:r>
+        <w:rPr>
+          <w:sz w:val="28"/>
+          <w:szCs w:val="28"/>
+        </w:rPr>
+        <w:t>thị</w:t>
+      </w:r>
+      <w:proofErr w:type="spellEnd"/>
+      <w:r>
+        <w:rPr>
+          <w:sz w:val="28"/>
+          <w:szCs w:val="28"/>
+        </w:rPr>
+        <w:t xml:space="preserve"> </w:t>
+      </w:r>
+      <w:proofErr w:type="spellStart"/>
+      <w:r>
+        <w:rPr>
+          <w:sz w:val="28"/>
+          <w:szCs w:val="28"/>
+        </w:rPr>
+        <w:t>danh</w:t>
+      </w:r>
+      <w:proofErr w:type="spellEnd"/>
+      <w:r>
+        <w:rPr>
+          <w:sz w:val="28"/>
+          <w:szCs w:val="28"/>
+        </w:rPr>
+        <w:t xml:space="preserve"> </w:t>
+      </w:r>
+      <w:proofErr w:type="spellStart"/>
+      <w:r>
+        <w:rPr>
+          <w:sz w:val="28"/>
+          <w:szCs w:val="28"/>
+        </w:rPr>
+        <w:t>sách</w:t>
+      </w:r>
+      <w:proofErr w:type="spellEnd"/>
+      <w:r>
+        <w:rPr>
+          <w:sz w:val="28"/>
+          <w:szCs w:val="28"/>
+        </w:rPr>
+        <w:t xml:space="preserve"> set </w:t>
+      </w:r>
+      <w:proofErr w:type="spellStart"/>
+      <w:r>
+        <w:rPr>
+          <w:sz w:val="28"/>
+          <w:szCs w:val="28"/>
+        </w:rPr>
+        <w:t>thẻ</w:t>
+      </w:r>
+      <w:proofErr w:type="spellEnd"/>
+      <w:r>
+        <w:rPr>
+          <w:sz w:val="28"/>
+          <w:szCs w:val="28"/>
+        </w:rPr>
+        <w:t xml:space="preserve"> </w:t>
+      </w:r>
+      <w:proofErr w:type="spellStart"/>
+      <w:r>
+        <w:rPr>
+          <w:sz w:val="28"/>
+          <w:szCs w:val="28"/>
+        </w:rPr>
+        <w:t>nhớ</w:t>
+      </w:r>
+      <w:proofErr w:type="spellEnd"/>
+      <w:r>
+        <w:rPr>
+          <w:sz w:val="28"/>
+          <w:szCs w:val="28"/>
+        </w:rPr>
+        <w:t xml:space="preserve"> </w:t>
+      </w:r>
+      <w:proofErr w:type="spellStart"/>
+      <w:r>
+        <w:rPr>
+          <w:sz w:val="28"/>
+          <w:szCs w:val="28"/>
+        </w:rPr>
+        <w:t>từ</w:t>
+      </w:r>
+      <w:proofErr w:type="spellEnd"/>
+      <w:r>
+        <w:rPr>
+          <w:sz w:val="28"/>
+          <w:szCs w:val="28"/>
+        </w:rPr>
+        <w:t xml:space="preserve"> </w:t>
+      </w:r>
+      <w:proofErr w:type="spellStart"/>
+      <w:r>
+        <w:rPr>
+          <w:sz w:val="28"/>
+          <w:szCs w:val="28"/>
+        </w:rPr>
+        <w:t>csdl</w:t>
+      </w:r>
+      <w:proofErr w:type="spellEnd"/>
+      <w:r>
+        <w:rPr>
+          <w:sz w:val="28"/>
+          <w:szCs w:val="28"/>
+        </w:rPr>
+        <w:t>:</w:t>
+      </w:r>
+    </w:p>
+    <w:p>
+      <w:pPr>
+        <w:jc w:val="center"/>
+        <w:rPr>
+          <w:sz w:val="28"/>
+          <w:szCs w:val="28"/>
+        </w:rPr>
+      </w:pPr>
+      <w:r>
+        <w:rPr>
+          <w:sz w:val="28"/>
+          <w:szCs w:val="28"/>
+        </w:rPr>
+        <w:lastRenderedPageBreak/>
+        <w:drawing>
+          <wp:inline distT="0" distB="0" distL="0" distR="0" wp14:anchorId="1B1EF443" wp14:editId="7EF69D45">
+            <wp:extent cx="4043494" cy="3031325"/>
+            <wp:effectExtent l="0" t="0" r="0" b="0"/>
+            <wp:docPr id="7" name="Picture 7"/>
+            <wp:cNvGraphicFramePr>
+              <a:graphicFrameLocks xmlns:a="http://schemas.openxmlformats.org/drawingml/2006/main" noChangeAspect="1"/>
+            </wp:cNvGraphicFramePr>
+            <a:graphic xmlns:a="http://schemas.openxmlformats.org/drawingml/2006/main">
+              <a:graphicData uri="http://schemas.openxmlformats.org/drawingml/2006/picture">
+                <pic:pic xmlns:pic="http://schemas.openxmlformats.org/drawingml/2006/picture">
+                  <pic:nvPicPr>
+                    <pic:cNvPr id="1" name=""/>
+                    <pic:cNvPicPr/>
+                  </pic:nvPicPr>
+                  <pic:blipFill>
+                    <a:blip r:embed="rId8"/>
+                    <a:stretch>
+                      <a:fillRect/>
+                    </a:stretch>
+                  </pic:blipFill>
+                  <pic:spPr>
+                    <a:xfrm>
+                      <a:off x="0" y="0"/>
+                      <a:ext cx="4051100" cy="3037027"/>
+                    </a:xfrm>
+                    <a:prstGeom prst="rect">
+                      <a:avLst/>
+                    </a:prstGeom>
+                  </pic:spPr>
+                </pic:pic>
+              </a:graphicData>
+            </a:graphic>
+          </wp:inline>
+        </w:drawing>
+      </w:r>
+    </w:p>
+    <w:p>
+      <w:pPr>
+        <w:rPr>
+          <w:sz w:val="28"/>
+          <w:szCs w:val="28"/>
+        </w:rPr>
+      </w:pPr>
+      <w:r>
+        <w:rPr>
+          <w:sz w:val="28"/>
+          <w:szCs w:val="28"/>
+        </w:rPr>
+        <w:t>-</w:t>
+      </w:r>
+      <w:proofErr w:type="spellStart"/>
+      <w:r>
+        <w:rPr>
+          <w:sz w:val="28"/>
+          <w:szCs w:val="28"/>
+        </w:rPr>
+        <w:t>Phía</w:t>
+      </w:r>
+      <w:proofErr w:type="spellEnd"/>
+      <w:r>
+        <w:rPr>
+          <w:sz w:val="28"/>
+          <w:szCs w:val="28"/>
+        </w:rPr>
+        <w:t xml:space="preserve"> </w:t>
+      </w:r>
+      <w:proofErr w:type="spellStart"/>
+      <w:r>
+        <w:rPr>
+          <w:sz w:val="28"/>
+          <w:szCs w:val="28"/>
+        </w:rPr>
+        <w:t>dưới</w:t>
+      </w:r>
+      <w:proofErr w:type="spellEnd"/>
+      <w:r>
+        <w:rPr>
+          <w:sz w:val="28"/>
+          <w:szCs w:val="28"/>
+        </w:rPr>
+        <w:t xml:space="preserve"> </w:t>
+      </w:r>
+      <w:proofErr w:type="spellStart"/>
+      <w:r>
+        <w:rPr>
+          <w:sz w:val="28"/>
+          <w:szCs w:val="28"/>
+        </w:rPr>
+        <w:t>cùng</w:t>
+      </w:r>
+      <w:proofErr w:type="spellEnd"/>
+      <w:r>
+        <w:rPr>
+          <w:sz w:val="28"/>
+          <w:szCs w:val="28"/>
+        </w:rPr>
+        <w:t xml:space="preserve"> </w:t>
+      </w:r>
+      <w:proofErr w:type="spellStart"/>
+      <w:r>
+        <w:rPr>
+          <w:sz w:val="28"/>
+          <w:szCs w:val="28"/>
+        </w:rPr>
+        <w:t>bên</w:t>
+      </w:r>
+      <w:proofErr w:type="spellEnd"/>
+      <w:r>
+        <w:rPr>
+          <w:sz w:val="28"/>
+          <w:szCs w:val="28"/>
+        </w:rPr>
+        <w:t xml:space="preserve"> </w:t>
+      </w:r>
+      <w:proofErr w:type="spellStart"/>
+      <w:r>
+        <w:rPr>
+          <w:sz w:val="28"/>
+          <w:szCs w:val="28"/>
+        </w:rPr>
+        <w:t>phải</w:t>
+      </w:r>
+      <w:proofErr w:type="spellEnd"/>
+      <w:r>
+        <w:rPr>
+          <w:sz w:val="28"/>
+          <w:szCs w:val="28"/>
+        </w:rPr>
+        <w:t xml:space="preserve"> </w:t>
+      </w:r>
+      <w:proofErr w:type="spellStart"/>
+      <w:r>
+        <w:rPr>
+          <w:sz w:val="28"/>
+          <w:szCs w:val="28"/>
+        </w:rPr>
+        <w:t>là</w:t>
+      </w:r>
+      <w:proofErr w:type="spellEnd"/>
+      <w:r>
+        <w:rPr>
+          <w:sz w:val="28"/>
+          <w:szCs w:val="28"/>
+        </w:rPr>
+        <w:t xml:space="preserve"> </w:t>
+      </w:r>
+      <w:proofErr w:type="spellStart"/>
+      <w:r>
+        <w:rPr>
+          <w:sz w:val="28"/>
+          <w:szCs w:val="28"/>
+        </w:rPr>
+        <w:t>nút</w:t>
+      </w:r>
+      <w:proofErr w:type="spellEnd"/>
+      <w:r>
+        <w:rPr>
+          <w:sz w:val="28"/>
+          <w:szCs w:val="28"/>
+        </w:rPr>
+        <w:t xml:space="preserve"> </w:t>
+      </w:r>
+      <w:proofErr w:type="spellStart"/>
+      <w:r>
+        <w:rPr>
+          <w:sz w:val="28"/>
+          <w:szCs w:val="28"/>
+        </w:rPr>
+        <w:t>thêm</w:t>
+      </w:r>
+      <w:proofErr w:type="spellEnd"/>
+      <w:r>
+        <w:rPr>
+          <w:sz w:val="28"/>
+          <w:szCs w:val="28"/>
+        </w:rPr>
+        <w:t xml:space="preserve"> </w:t>
+      </w:r>
+      <w:proofErr w:type="spellStart"/>
+      <w:r>
+        <w:rPr>
+          <w:sz w:val="28"/>
+          <w:szCs w:val="28"/>
+        </w:rPr>
+        <w:t>mới</w:t>
+      </w:r>
+      <w:proofErr w:type="spellEnd"/>
+      <w:r>
+        <w:rPr>
+          <w:sz w:val="28"/>
+          <w:szCs w:val="28"/>
+        </w:rPr>
+        <w:t xml:space="preserve"> set </w:t>
+      </w:r>
+      <w:proofErr w:type="spellStart"/>
+      <w:r>
+        <w:rPr>
+          <w:sz w:val="28"/>
+          <w:szCs w:val="28"/>
+        </w:rPr>
+        <w:t>thẻ</w:t>
+      </w:r>
+      <w:proofErr w:type="spellEnd"/>
+      <w:r>
+        <w:rPr>
+          <w:sz w:val="28"/>
+          <w:szCs w:val="28"/>
+        </w:rPr>
+        <w:t xml:space="preserve"> </w:t>
+      </w:r>
+      <w:proofErr w:type="spellStart"/>
+      <w:r>
+        <w:rPr>
+          <w:sz w:val="28"/>
+          <w:szCs w:val="28"/>
+        </w:rPr>
+        <w:t>nhớ</w:t>
+      </w:r>
+      <w:proofErr w:type="spellEnd"/>
+    </w:p>
+    <w:p>
+      <w:pPr>
+        <w:rPr>
+          <w:sz w:val="28"/>
+          <w:szCs w:val="28"/>
+        </w:rPr>
+      </w:pPr>
+      <w:r>
+        <w:rPr>
+          <w:sz w:val="28"/>
+          <w:szCs w:val="28"/>
+        </w:rPr>
+        <w:drawing>
+          <wp:inline distT="0" distB="0" distL="0" distR="0" wp14:anchorId="12E08571" wp14:editId="26D70CBE">
+            <wp:extent cx="4244829" cy="2594515"/>
+            <wp:effectExtent l="0" t="0" r="3810" b="0"/>
+            <wp:docPr id="3" name="Picture 3"/>
+            <wp:cNvGraphicFramePr>
+              <a:graphicFrameLocks xmlns:a="http://schemas.openxmlformats.org/drawingml/2006/main" noChangeAspect="1"/>
+            </wp:cNvGraphicFramePr>
+            <a:graphic xmlns:a="http://schemas.openxmlformats.org/drawingml/2006/main">
+              <a:graphicData uri="http://schemas.openxmlformats.org/drawingml/2006/picture">
+                <pic:pic xmlns:pic="http://schemas.openxmlformats.org/drawingml/2006/picture">
+                  <pic:nvPicPr>
+                    <pic:cNvPr id="1" name=""/>
+                    <pic:cNvPicPr/>
+                  </pic:nvPicPr>
+                  <pic:blipFill>
+                    <a:blip r:embed="rId9"/>
+                    <a:stretch>
+                      <a:fillRect/>
+                    </a:stretch>
+                  </pic:blipFill>
+                  <pic:spPr>
+                    <a:xfrm>
+                      <a:off x="0" y="0"/>
+                      <a:ext cx="4266782" cy="2607933"/>
+                    </a:xfrm>
+                    <a:prstGeom prst="rect">
+                      <a:avLst/>
+                    </a:prstGeom>
+                  </pic:spPr>
+                </pic:pic>
+              </a:graphicData>
+            </a:graphic>
+          </wp:inline>
+        </w:drawing>
+      </w:r>
+    </w:p>
+    <w:p>
+      <w:pPr>
+        <w:jc w:val="center"/>
+        <w:rPr>
+          <w:sz w:val="28"/>
+          <w:szCs w:val="28"/>
+        </w:rPr>
+      </w:pPr>
+      <w:r>
+        <w:rPr>
+          <w:sz w:val="28"/>
+          <w:szCs w:val="28"/>
+        </w:rPr>
+        <w:lastRenderedPageBreak/>
+        <w:drawing>
+          <wp:inline distT="0" distB="0" distL="0" distR="0" wp14:anchorId="216C0687" wp14:editId="51902428">
+            <wp:extent cx="2901322" cy="4983061"/>
+            <wp:effectExtent l="0" t="0" r="0" b="8255"/>
+            <wp:docPr id="6" name="Picture 6"/>
+            <wp:cNvGraphicFramePr>
+              <a:graphicFrameLocks xmlns:a="http://schemas.openxmlformats.org/drawingml/2006/main" noChangeAspect="1"/>
+            </wp:cNvGraphicFramePr>
+            <a:graphic xmlns:a="http://schemas.openxmlformats.org/drawingml/2006/main">
+              <a:graphicData uri="http://schemas.openxmlformats.org/drawingml/2006/picture">
+                <pic:pic xmlns:pic="http://schemas.openxmlformats.org/drawingml/2006/picture">
+                  <pic:nvPicPr>
+                    <pic:cNvPr id="1" name=""/>
+                    <pic:cNvPicPr/>
+                  </pic:nvPicPr>
+                  <pic:blipFill>
+                    <a:blip r:embed="rId10"/>
+                    <a:stretch>
+                      <a:fillRect/>
+                    </a:stretch>
+                  </pic:blipFill>
+                  <pic:spPr>
+                    <a:xfrm>
+                      <a:off x="0" y="0"/>
+                      <a:ext cx="2904984" cy="4989350"/>
+                    </a:xfrm>
+                    <a:prstGeom prst="rect">
+                      <a:avLst/>
+                    </a:prstGeom>
+                  </pic:spPr>
+                </pic:pic>
+              </a:graphicData>
+            </a:graphic>
+          </wp:inline>
+        </w:drawing>
+      </w:r>
+    </w:p>
+    <w:p>
+      <w:pPr>
+        <w:rPr>
+          <w:sz w:val="28"/>
+          <w:szCs w:val="28"/>
+        </w:rPr>
+      </w:pPr>
+      <w:r>
+        <w:rPr>
+          <w:sz w:val="28"/>
+          <w:szCs w:val="28"/>
+        </w:rPr>
+        <w:t>-</w:t>
+      </w:r>
+      <w:proofErr w:type="spellStart"/>
+      <w:r>
+        <w:rPr>
+          <w:sz w:val="28"/>
+          <w:szCs w:val="28"/>
+        </w:rPr>
+        <w:t>Thanh</w:t>
+      </w:r>
+      <w:proofErr w:type="spellEnd"/>
+      <w:r>
+        <w:rPr>
+          <w:sz w:val="28"/>
+          <w:szCs w:val="28"/>
+        </w:rPr>
+        <w:t xml:space="preserve"> </w:t>
+      </w:r>
+      <w:proofErr w:type="spellStart"/>
+      <w:r>
+        <w:rPr>
+          <w:sz w:val="28"/>
+          <w:szCs w:val="28"/>
+        </w:rPr>
+        <w:t>điều</w:t>
+      </w:r>
+      <w:proofErr w:type="spellEnd"/>
+      <w:r>
+        <w:rPr>
+          <w:sz w:val="28"/>
+          <w:szCs w:val="28"/>
+        </w:rPr>
+        <w:t xml:space="preserve"> </w:t>
+      </w:r>
+      <w:proofErr w:type="spellStart"/>
+      <w:r>
+        <w:rPr>
+          <w:sz w:val="28"/>
+          <w:szCs w:val="28"/>
+        </w:rPr>
+        <w:t>hướng</w:t>
+      </w:r>
+      <w:proofErr w:type="spellEnd"/>
+      <w:r>
+        <w:rPr>
+          <w:sz w:val="28"/>
+          <w:szCs w:val="28"/>
+        </w:rPr>
+        <w:t xml:space="preserve"> (Navigation drawer)</w:t>
+      </w:r>
+    </w:p>
+    <w:p>
+      <w:pPr>
+        <w:jc w:val="center"/>
+        <w:rPr>
+          <w:sz w:val="28"/>
+          <w:szCs w:val="28"/>
+        </w:rPr>
+      </w:pPr>
+      <w:r>
+        <w:rPr>
+          <w:sz w:val="28"/>
+          <w:szCs w:val="28"/>
+        </w:rPr>
+        <w:lastRenderedPageBreak/>
+        <w:drawing>
+          <wp:inline distT="0" distB="0" distL="0" distR="0" wp14:anchorId="00B5CEA4" wp14:editId="1EA73AE7">
+            <wp:extent cx="3360614" cy="6618914"/>
+            <wp:effectExtent l="0" t="0" r="0" b="0"/>
+            <wp:docPr id="4" name="Picture 4"/>
+            <wp:cNvGraphicFramePr>
+              <a:graphicFrameLocks xmlns:a="http://schemas.openxmlformats.org/drawingml/2006/main" noChangeAspect="1"/>
+            </wp:cNvGraphicFramePr>
+            <a:graphic xmlns:a="http://schemas.openxmlformats.org/drawingml/2006/main">
+              <a:graphicData uri="http://schemas.openxmlformats.org/drawingml/2006/picture">
+                <pic:pic xmlns:pic="http://schemas.openxmlformats.org/drawingml/2006/picture">
+                  <pic:nvPicPr>
+                    <pic:cNvPr id="1" name=""/>
+                    <pic:cNvPicPr/>
+                  </pic:nvPicPr>
+                  <pic:blipFill>
+                    <a:blip r:embed="rId11"/>
+                    <a:stretch>
+                      <a:fillRect/>
+                    </a:stretch>
+                  </pic:blipFill>
+                  <pic:spPr>
+                    <a:xfrm>
+                      <a:off x="0" y="0"/>
+                      <a:ext cx="3365871" cy="6629269"/>
+                    </a:xfrm>
+                    <a:prstGeom prst="rect">
+                      <a:avLst/>
+                    </a:prstGeom>
+                  </pic:spPr>
+                </pic:pic>
+              </a:graphicData>
+            </a:graphic>
+          </wp:inline>
+        </w:drawing>
+      </w:r>
+    </w:p>
+    <w:p>
+      <w:pPr>
+        <w:rPr>
+          <w:sz w:val="28"/>
+          <w:szCs w:val="28"/>
+        </w:rPr>
+      </w:pPr>
+      <w:r>
+        <w:rPr>
+          <w:sz w:val="28"/>
+          <w:szCs w:val="28"/>
+        </w:rPr>
+        <w:t xml:space="preserve">+Card Sets: </w:t>
+      </w:r>
+      <w:proofErr w:type="spellStart"/>
+      <w:r>
+        <w:rPr>
+          <w:sz w:val="28"/>
+          <w:szCs w:val="28"/>
+        </w:rPr>
+        <w:t>Hiển</w:t>
+      </w:r>
+      <w:proofErr w:type="spellEnd"/>
+      <w:r>
+        <w:rPr>
+          <w:sz w:val="28"/>
+          <w:szCs w:val="28"/>
+        </w:rPr>
+        <w:t xml:space="preserve"> </w:t>
+      </w:r>
+      <w:proofErr w:type="spellStart"/>
+      <w:r>
+        <w:rPr>
+          <w:sz w:val="28"/>
+          <w:szCs w:val="28"/>
+        </w:rPr>
+        <w:t>thị</w:t>
+      </w:r>
+      <w:proofErr w:type="spellEnd"/>
+      <w:r>
+        <w:rPr>
+          <w:sz w:val="28"/>
+          <w:szCs w:val="28"/>
+        </w:rPr>
+        <w:t xml:space="preserve"> </w:t>
+      </w:r>
+      <w:proofErr w:type="spellStart"/>
+      <w:r>
+        <w:rPr>
+          <w:sz w:val="28"/>
+          <w:szCs w:val="28"/>
+        </w:rPr>
+        <w:t>danh</w:t>
+      </w:r>
+      <w:proofErr w:type="spellEnd"/>
+      <w:r>
+        <w:rPr>
+          <w:sz w:val="28"/>
+          <w:szCs w:val="28"/>
+        </w:rPr>
+        <w:t xml:space="preserve"> </w:t>
+      </w:r>
+      <w:proofErr w:type="spellStart"/>
+      <w:r>
+        <w:rPr>
+          <w:sz w:val="28"/>
+          <w:szCs w:val="28"/>
+        </w:rPr>
+        <w:t>sách</w:t>
+      </w:r>
+      <w:proofErr w:type="spellEnd"/>
+      <w:r>
+        <w:rPr>
+          <w:sz w:val="28"/>
+          <w:szCs w:val="28"/>
+        </w:rPr>
+        <w:t xml:space="preserve"> set </w:t>
+      </w:r>
+      <w:proofErr w:type="spellStart"/>
+      <w:r>
+        <w:rPr>
+          <w:sz w:val="28"/>
+          <w:szCs w:val="28"/>
+        </w:rPr>
+        <w:t>thẻ</w:t>
+      </w:r>
+      <w:proofErr w:type="spellEnd"/>
+      <w:r>
+        <w:rPr>
+          <w:sz w:val="28"/>
+          <w:szCs w:val="28"/>
+        </w:rPr>
+        <w:t xml:space="preserve"> </w:t>
+      </w:r>
+      <w:proofErr w:type="spellStart"/>
+      <w:r>
+        <w:rPr>
+          <w:sz w:val="28"/>
+          <w:szCs w:val="28"/>
+        </w:rPr>
+        <w:t>nhớ</w:t>
+      </w:r>
+      <w:proofErr w:type="spellEnd"/>
+    </w:p>
+    <w:p>
+      <w:pPr>
+        <w:rPr>
+          <w:sz w:val="28"/>
+          <w:szCs w:val="28"/>
+        </w:rPr>
+      </w:pPr>
+      <w:r>
+        <w:rPr>
+          <w:sz w:val="28"/>
+          <w:szCs w:val="28"/>
+        </w:rPr>
+        <w:t>+</w:t>
+      </w:r>
+      <w:proofErr w:type="spellStart"/>
+      <w:r>
+        <w:rPr>
+          <w:sz w:val="28"/>
+          <w:szCs w:val="28"/>
+        </w:rPr>
+        <w:t>Staticstic</w:t>
+      </w:r>
+      <w:proofErr w:type="spellEnd"/>
+      <w:r>
+        <w:rPr>
+          <w:sz w:val="28"/>
+          <w:szCs w:val="28"/>
+        </w:rPr>
+        <w:t xml:space="preserve">: </w:t>
+      </w:r>
+      <w:proofErr w:type="spellStart"/>
+      <w:r>
+        <w:rPr>
+          <w:sz w:val="28"/>
+          <w:szCs w:val="28"/>
+        </w:rPr>
+        <w:t>Thống</w:t>
+      </w:r>
+      <w:proofErr w:type="spellEnd"/>
+      <w:r>
+        <w:rPr>
+          <w:sz w:val="28"/>
+          <w:szCs w:val="28"/>
+        </w:rPr>
+        <w:t xml:space="preserve"> </w:t>
+      </w:r>
+      <w:proofErr w:type="spellStart"/>
+      <w:r>
+        <w:rPr>
+          <w:sz w:val="28"/>
+          <w:szCs w:val="28"/>
+        </w:rPr>
+        <w:t>kê</w:t>
+      </w:r>
+      <w:proofErr w:type="spellEnd"/>
+      <w:r>
+        <w:rPr>
+          <w:sz w:val="28"/>
+          <w:szCs w:val="28"/>
+        </w:rPr>
+        <w:t xml:space="preserve"> </w:t>
+      </w:r>
+      <w:proofErr w:type="spellStart"/>
+      <w:r>
+        <w:rPr>
+          <w:sz w:val="28"/>
+          <w:szCs w:val="28"/>
+        </w:rPr>
+        <w:t>các</w:t>
+      </w:r>
+      <w:proofErr w:type="spellEnd"/>
+      <w:r>
+        <w:rPr>
+          <w:sz w:val="28"/>
+          <w:szCs w:val="28"/>
+        </w:rPr>
+        <w:t xml:space="preserve"> </w:t>
+      </w:r>
+      <w:proofErr w:type="spellStart"/>
+      <w:r>
+        <w:rPr>
+          <w:sz w:val="28"/>
+          <w:szCs w:val="28"/>
+        </w:rPr>
+        <w:t>thẻ</w:t>
+      </w:r>
+      <w:proofErr w:type="spellEnd"/>
+      <w:r>
+        <w:rPr>
+          <w:sz w:val="28"/>
+          <w:szCs w:val="28"/>
+        </w:rPr>
+        <w:t xml:space="preserve"> </w:t>
+      </w:r>
+      <w:proofErr w:type="spellStart"/>
+      <w:r>
+        <w:rPr>
+          <w:sz w:val="28"/>
+          <w:szCs w:val="28"/>
+        </w:rPr>
+        <w:t>nhớ</w:t>
+      </w:r>
+      <w:proofErr w:type="spellEnd"/>
+      <w:r>
+        <w:rPr>
+          <w:sz w:val="28"/>
+          <w:szCs w:val="28"/>
+        </w:rPr>
+        <w:t xml:space="preserve"> </w:t>
+      </w:r>
+      <w:proofErr w:type="spellStart"/>
+      <w:r>
+        <w:rPr>
+          <w:sz w:val="28"/>
+          <w:szCs w:val="28"/>
+        </w:rPr>
+        <w:t>đã</w:t>
+      </w:r>
+      <w:proofErr w:type="spellEnd"/>
+      <w:r>
+        <w:rPr>
+          <w:sz w:val="28"/>
+          <w:szCs w:val="28"/>
+        </w:rPr>
+        <w:t xml:space="preserve"> </w:t>
+      </w:r>
+      <w:proofErr w:type="spellStart"/>
+      <w:r>
+        <w:rPr>
+          <w:sz w:val="28"/>
+          <w:szCs w:val="28"/>
+        </w:rPr>
+        <w:t>học</w:t>
+      </w:r>
+      <w:proofErr w:type="spellEnd"/>
+    </w:p>
+    <w:p>
+      <w:pPr>
+        <w:rPr>
+          <w:sz w:val="28"/>
+          <w:szCs w:val="28"/>
+        </w:rPr>
+      </w:pPr>
+      <w:r>
+        <w:rPr>
+          <w:sz w:val="28"/>
+          <w:szCs w:val="28"/>
+        </w:rPr>
+        <w:t xml:space="preserve">+Settings: </w:t>
+      </w:r>
+      <w:proofErr w:type="spellStart"/>
+      <w:r>
+        <w:rPr>
+          <w:sz w:val="28"/>
+          <w:szCs w:val="28"/>
+        </w:rPr>
+        <w:t>Điều</w:t>
+      </w:r>
+      <w:proofErr w:type="spellEnd"/>
+      <w:r>
+        <w:rPr>
+          <w:sz w:val="28"/>
+          <w:szCs w:val="28"/>
+        </w:rPr>
+        <w:t xml:space="preserve"> </w:t>
+      </w:r>
+      <w:proofErr w:type="spellStart"/>
+      <w:r>
+        <w:rPr>
+          <w:sz w:val="28"/>
+          <w:szCs w:val="28"/>
+        </w:rPr>
+        <w:t>chỉnh</w:t>
+      </w:r>
+      <w:proofErr w:type="spellEnd"/>
+      <w:r>
+        <w:rPr>
+          <w:sz w:val="28"/>
+          <w:szCs w:val="28"/>
+        </w:rPr>
+        <w:t xml:space="preserve"> </w:t>
+      </w:r>
+      <w:proofErr w:type="spellStart"/>
+      <w:r>
+        <w:rPr>
+          <w:sz w:val="28"/>
+          <w:szCs w:val="28"/>
+        </w:rPr>
+        <w:t>cài</w:t>
+      </w:r>
+      <w:proofErr w:type="spellEnd"/>
+      <w:r>
+        <w:rPr>
+          <w:sz w:val="28"/>
+          <w:szCs w:val="28"/>
+        </w:rPr>
+        <w:t xml:space="preserve"> </w:t>
+      </w:r>
+      <w:proofErr w:type="spellStart"/>
+      <w:r>
+        <w:rPr>
+          <w:sz w:val="28"/>
+          <w:szCs w:val="28"/>
+        </w:rPr>
+        <w:t>đặt</w:t>
+      </w:r>
+      <w:proofErr w:type="spellEnd"/>
+      <w:r>
+        <w:rPr>
+          <w:sz w:val="28"/>
+          <w:szCs w:val="28"/>
+        </w:rPr>
+        <w:t xml:space="preserve"> </w:t>
+      </w:r>
+      <w:proofErr w:type="spellStart"/>
+      <w:r>
+        <w:rPr>
+          <w:sz w:val="28"/>
+          <w:szCs w:val="28"/>
+        </w:rPr>
+        <w:t>của</w:t>
+      </w:r>
+      <w:proofErr w:type="spellEnd"/>
+      <w:r>
+        <w:rPr>
+          <w:sz w:val="28"/>
+          <w:szCs w:val="28"/>
+        </w:rPr>
+        <w:t xml:space="preserve"> </w:t>
+      </w:r>
+      <w:proofErr w:type="spellStart"/>
+      <w:r>
+        <w:rPr>
+          <w:sz w:val="28"/>
+          <w:szCs w:val="28"/>
+        </w:rPr>
+        <w:t>ứng</w:t>
+      </w:r>
+      <w:proofErr w:type="spellEnd"/>
+      <w:r>
+        <w:rPr>
+          <w:sz w:val="28"/>
+          <w:szCs w:val="28"/>
+        </w:rPr>
+        <w:t xml:space="preserve"> </w:t>
+      </w:r>
+      <w:proofErr w:type="spellStart"/>
+      <w:r>
+        <w:rPr>
+          <w:sz w:val="28"/>
+          <w:szCs w:val="28"/>
+        </w:rPr>
+        <w:t>dụng</w:t>
+      </w:r>
+      <w:proofErr w:type="spellEnd"/>
+    </w:p>
+    <w:p>
+      <w:pPr>
+        <w:rPr>
+          <w:sz w:val="28"/>
+          <w:szCs w:val="28"/>
+        </w:rPr>
+      </w:pPr>
+      <w:r>
+        <w:rPr>
+          <w:sz w:val="28"/>
+          <w:szCs w:val="28"/>
+        </w:rPr>
+        <w:t xml:space="preserve">+Help: </w:t>
+      </w:r>
+      <w:proofErr w:type="spellStart"/>
+      <w:r>
+        <w:rPr>
+          <w:sz w:val="28"/>
+          <w:szCs w:val="28"/>
+        </w:rPr>
+        <w:t>Hỗ</w:t>
+      </w:r>
+      <w:proofErr w:type="spellEnd"/>
+      <w:r>
+        <w:rPr>
+          <w:sz w:val="28"/>
+          <w:szCs w:val="28"/>
+        </w:rPr>
+        <w:t xml:space="preserve"> </w:t>
+      </w:r>
+      <w:proofErr w:type="spellStart"/>
+      <w:r>
+        <w:rPr>
+          <w:sz w:val="28"/>
+          <w:szCs w:val="28"/>
+        </w:rPr>
+        <w:t>trợ</w:t>
+      </w:r>
+      <w:proofErr w:type="spellEnd"/>
+      <w:r>
+        <w:rPr>
+          <w:sz w:val="28"/>
+          <w:szCs w:val="28"/>
+        </w:rPr>
+        <w:t xml:space="preserve"> </w:t>
+      </w:r>
+      <w:proofErr w:type="spellStart"/>
+      <w:r>
+        <w:rPr>
+          <w:sz w:val="28"/>
+          <w:szCs w:val="28"/>
+        </w:rPr>
+        <w:t>người</w:t>
+      </w:r>
+      <w:proofErr w:type="spellEnd"/>
+      <w:r>
+        <w:rPr>
+          <w:sz w:val="28"/>
+          <w:szCs w:val="28"/>
+        </w:rPr>
+        <w:t xml:space="preserve"> dung</w:t>
+      </w:r>
+    </w:p>
+    <w:p>
+      <w:pPr>
+        <w:rPr>
+          <w:sz w:val="28"/>
+          <w:szCs w:val="28"/>
+        </w:rPr>
+      </w:pPr>
+      <w:r>
+        <w:rPr>
+          <w:sz w:val="28"/>
+          <w:szCs w:val="28"/>
+        </w:rPr>
+        <w:lastRenderedPageBreak/>
+        <w:t xml:space="preserve">+Support: </w:t>
+      </w:r>
+      <w:proofErr w:type="spellStart"/>
+      <w:r>
+        <w:rPr>
+          <w:sz w:val="28"/>
+          <w:szCs w:val="28"/>
+        </w:rPr>
+        <w:t>Ủng</w:t>
+      </w:r>
+      <w:proofErr w:type="spellEnd"/>
+      <w:r>
+        <w:rPr>
+          <w:sz w:val="28"/>
+          <w:szCs w:val="28"/>
+        </w:rPr>
+        <w:t xml:space="preserve"> </w:t>
+      </w:r>
+      <w:proofErr w:type="spellStart"/>
+      <w:r>
+        <w:rPr>
+          <w:sz w:val="28"/>
+          <w:szCs w:val="28"/>
+        </w:rPr>
+        <w:t>hộ</w:t>
+      </w:r>
+      <w:proofErr w:type="spellEnd"/>
+      <w:r>
+        <w:rPr>
+          <w:sz w:val="28"/>
+          <w:szCs w:val="28"/>
+        </w:rPr>
+        <w:t xml:space="preserve"> </w:t>
+      </w:r>
+      <w:proofErr w:type="spellStart"/>
+      <w:r>
+        <w:rPr>
+          <w:sz w:val="28"/>
+          <w:szCs w:val="28"/>
+        </w:rPr>
+        <w:t>nhà</w:t>
+      </w:r>
+      <w:proofErr w:type="spellEnd"/>
+      <w:r>
+        <w:rPr>
+          <w:sz w:val="28"/>
+          <w:szCs w:val="28"/>
+        </w:rPr>
+        <w:t xml:space="preserve"> </w:t>
+      </w:r>
+      <w:proofErr w:type="spellStart"/>
+      <w:r>
+        <w:rPr>
+          <w:sz w:val="28"/>
+          <w:szCs w:val="28"/>
+        </w:rPr>
+        <w:t>phát</w:t>
+      </w:r>
+      <w:proofErr w:type="spellEnd"/>
+      <w:r>
+        <w:rPr>
+          <w:sz w:val="28"/>
+          <w:szCs w:val="28"/>
+        </w:rPr>
+        <w:t xml:space="preserve"> </w:t>
+      </w:r>
+      <w:proofErr w:type="spellStart"/>
+      <w:r>
+        <w:rPr>
+          <w:sz w:val="28"/>
+          <w:szCs w:val="28"/>
+        </w:rPr>
+        <w:t>triển</w:t>
+      </w:r>
+      <w:proofErr w:type="spellEnd"/>
+    </w:p>
+    <w:p>
+      <w:pPr>
+        <w:rPr>
+          <w:sz w:val="28"/>
+          <w:szCs w:val="28"/>
+        </w:rPr>
+      </w:pPr>
     </w:p>
     <w:sectPr>
       <w:pgSz w:w="12240" w:h="15840"/>
@@ -53,8 +1692,105 @@
 </w:document>
 </file>
 
+<file path=word/numbering.xml><?xml version="1.0" encoding="utf-8"?>
+<w:numbering xmlns:wpc="http://schemas.microsoft.com/office/word/2010/wordprocessingCanvas" xmlns:cx="http://schemas.microsoft.com/office/drawing/2014/chartex" xmlns:mc="http://schemas.openxmlformats.org/markup-compatibility/2006" xmlns:o="urn:schemas-microsoft-com:office:office" xmlns:r="http://schemas.openxmlformats.org/officeDocument/2006/relationships" xmlns:m="http://schemas.openxmlformats.org/officeDocument/2006/math" xmlns:v="urn:schemas-microsoft-com:vml" xmlns:wp14="http://schemas.microsoft.com/office/word/2010/wordprocessingDrawing" xmlns:wp="http://schemas.openxmlformats.org/drawingml/2006/wordprocessingDrawing" xmlns:w10="urn:schemas-microsoft-com:office:word" xmlns:w="http://schemas.openxmlformats.org/wordprocessingml/2006/main" xmlns:w14="http://schemas.microsoft.com/office/word/2010/wordml" xmlns:w15="http://schemas.microsoft.com/office/word/2012/wordml" xmlns:w16se="http://schemas.microsoft.com/office/word/2015/wordml/symex" xmlns:wpg="http://schemas.microsoft.com/office/word/2010/wordprocessingGroup" xmlns:wpi="http://schemas.microsoft.com/office/word/2010/wordprocessingInk" xmlns:wne="http://schemas.microsoft.com/office/word/2006/wordml" xmlns:wps="http://schemas.microsoft.com/office/word/2010/wordprocessingShape" mc:Ignorable="w14 w15 w16se wp14">
+  <w:abstractNum w:abstractNumId="0" w15:restartNumberingAfterBreak="0">
+    <w:nsid w:val="441C361C"/>
+    <w:multiLevelType w:val="hybridMultilevel"/>
+    <w:tmpl w:val="12A6C738"/>
+    <w:lvl w:ilvl="0" w:tplc="0409000F">
+      <w:start w:val="1"/>
+      <w:numFmt w:val="decimal"/>
+      <w:lvlText w:val="%1."/>
+      <w:lvlJc w:val="left"/>
+      <w:pPr>
+        <w:ind w:left="720" w:hanging="360"/>
+      </w:pPr>
+      <w:rPr>
+        <w:rFonts w:hint="default"/>
+      </w:rPr>
+    </w:lvl>
+    <w:lvl w:ilvl="1" w:tplc="04090019" w:tentative="1">
+      <w:start w:val="1"/>
+      <w:numFmt w:val="lowerLetter"/>
+      <w:lvlText w:val="%2."/>
+      <w:lvlJc w:val="left"/>
+      <w:pPr>
+        <w:ind w:left="1440" w:hanging="360"/>
+      </w:pPr>
+    </w:lvl>
+    <w:lvl w:ilvl="2" w:tplc="0409001B" w:tentative="1">
+      <w:start w:val="1"/>
+      <w:numFmt w:val="lowerRoman"/>
+      <w:lvlText w:val="%3."/>
+      <w:lvlJc w:val="right"/>
+      <w:pPr>
+        <w:ind w:left="2160" w:hanging="180"/>
+      </w:pPr>
+    </w:lvl>
+    <w:lvl w:ilvl="3" w:tplc="0409000F" w:tentative="1">
+      <w:start w:val="1"/>
+      <w:numFmt w:val="decimal"/>
+      <w:lvlText w:val="%4."/>
+      <w:lvlJc w:val="left"/>
+      <w:pPr>
+        <w:ind w:left="2880" w:hanging="360"/>
+      </w:pPr>
+    </w:lvl>
+    <w:lvl w:ilvl="4" w:tplc="04090019" w:tentative="1">
+      <w:start w:val="1"/>
+      <w:numFmt w:val="lowerLetter"/>
+      <w:lvlText w:val="%5."/>
+      <w:lvlJc w:val="left"/>
+      <w:pPr>
+        <w:ind w:left="3600" w:hanging="360"/>
+      </w:pPr>
+    </w:lvl>
+    <w:lvl w:ilvl="5" w:tplc="0409001B" w:tentative="1">
+      <w:start w:val="1"/>
+      <w:numFmt w:val="lowerRoman"/>
+      <w:lvlText w:val="%6."/>
+      <w:lvlJc w:val="right"/>
+      <w:pPr>
+        <w:ind w:left="4320" w:hanging="180"/>
+      </w:pPr>
+    </w:lvl>
+    <w:lvl w:ilvl="6" w:tplc="0409000F" w:tentative="1">
+      <w:start w:val="1"/>
+      <w:numFmt w:val="decimal"/>
+      <w:lvlText w:val="%7."/>
+      <w:lvlJc w:val="left"/>
+      <w:pPr>
+        <w:ind w:left="5040" w:hanging="360"/>
+      </w:pPr>
+    </w:lvl>
+    <w:lvl w:ilvl="7" w:tplc="04090019" w:tentative="1">
+      <w:start w:val="1"/>
+      <w:numFmt w:val="lowerLetter"/>
+      <w:lvlText w:val="%8."/>
+      <w:lvlJc w:val="left"/>
+      <w:pPr>
+        <w:ind w:left="5760" w:hanging="360"/>
+      </w:pPr>
+    </w:lvl>
+    <w:lvl w:ilvl="8" w:tplc="0409001B" w:tentative="1">
+      <w:start w:val="1"/>
+      <w:numFmt w:val="lowerRoman"/>
+      <w:lvlText w:val="%9."/>
+      <w:lvlJc w:val="right"/>
+      <w:pPr>
+        <w:ind w:left="6480" w:hanging="180"/>
+      </w:pPr>
+    </w:lvl>
+  </w:abstractNum>
+  <w:num w:numId="1">
+    <w:abstractNumId w:val="0"/>
+  </w:num>
+</w:numbering>
+</file>
+
 <file path=word/styles.xml><?xml version="1.0" encoding="utf-8"?>
-<w:styles xmlns:mc="http://schemas.openxmlformats.org/markup-compatibility/2006" xmlns:r="http://schemas.openxmlformats.org/officeDocument/2006/relationships" xmlns:w="http://schemas.openxmlformats.org/wordprocessingml/2006/main" xmlns:w14="http://schemas.microsoft.com/office/word/2010/wordml" xmlns:w15="http://schemas.microsoft.com/office/word/2012/wordml" mc:Ignorable="w14 w15">
+<w:styles xmlns:mc="http://schemas.openxmlformats.org/markup-compatibility/2006" xmlns:r="http://schemas.openxmlformats.org/officeDocument/2006/relationships" xmlns:w="http://schemas.openxmlformats.org/wordprocessingml/2006/main" xmlns:w14="http://schemas.microsoft.com/office/word/2010/wordml" xmlns:w15="http://schemas.microsoft.com/office/word/2012/wordml" xmlns:w16se="http://schemas.microsoft.com/office/word/2015/wordml/symex" mc:Ignorable="w14 w15 w16se">
   <w:docDefaults>
     <w:rPrDefault>
       <w:rPr>
@@ -474,6 +2210,17 @@
     <w:semiHidden/>
     <w:unhideWhenUsed/>
   </w:style>
+  <w:style w:type="paragraph" w:styleId="ListParagraph">
+    <w:name w:val="List Paragraph"/>
+    <w:basedOn w:val="Normal"/>
+    <w:uiPriority w:val="34"/>
+    <w:qFormat/>
+    <w:rsid w:val="003C44C0"/>
+    <w:pPr>
+      <w:ind w:left="720"/>
+      <w:contextualSpacing/>
+    </w:pPr>
+  </w:style>
 </w:styles>
 </file>
 

</xml_diff>

<commit_message>
Update document, remove secret password
</commit_message>
<xml_diff>
--- a/Document/Thiết_kế_hệ_thống.docx
+++ b/Document/Thiết_kế_hệ_thống.docx
@@ -1,6 +1,6 @@
 
 <file path=word/document.xml><?xml version="1.0" encoding="utf-8"?>
-<w:document xmlns:wpc="http://schemas.microsoft.com/office/word/2010/wordprocessingCanvas" xmlns:cx="http://schemas.microsoft.com/office/drawing/2014/chartex" xmlns:mc="http://schemas.openxmlformats.org/markup-compatibility/2006" xmlns:o="urn:schemas-microsoft-com:office:office" xmlns:r="http://schemas.openxmlformats.org/officeDocument/2006/relationships" xmlns:m="http://schemas.openxmlformats.org/officeDocument/2006/math" xmlns:v="urn:schemas-microsoft-com:vml" xmlns:wp14="http://schemas.microsoft.com/office/word/2010/wordprocessingDrawing" xmlns:wp="http://schemas.openxmlformats.org/drawingml/2006/wordprocessingDrawing" xmlns:w10="urn:schemas-microsoft-com:office:word" xmlns:w="http://schemas.openxmlformats.org/wordprocessingml/2006/main" xmlns:w14="http://schemas.microsoft.com/office/word/2010/wordml" xmlns:w15="http://schemas.microsoft.com/office/word/2012/wordml" xmlns:w16se="http://schemas.microsoft.com/office/word/2015/wordml/symex" xmlns:wpg="http://schemas.microsoft.com/office/word/2010/wordprocessingGroup" xmlns:wpi="http://schemas.microsoft.com/office/word/2010/wordprocessingInk" xmlns:wne="http://schemas.microsoft.com/office/word/2006/wordml" xmlns:wps="http://schemas.microsoft.com/office/word/2010/wordprocessingShape" mc:Ignorable="w14 w15 w16se wp14">
+<w:document xmlns:wpc="http://schemas.microsoft.com/office/word/2010/wordprocessingCanvas" xmlns:mc="http://schemas.openxmlformats.org/markup-compatibility/2006" xmlns:o="urn:schemas-microsoft-com:office:office" xmlns:r="http://schemas.openxmlformats.org/officeDocument/2006/relationships" xmlns:m="http://schemas.openxmlformats.org/officeDocument/2006/math" xmlns:v="urn:schemas-microsoft-com:vml" xmlns:wp14="http://schemas.microsoft.com/office/word/2010/wordprocessingDrawing" xmlns:wp="http://schemas.openxmlformats.org/drawingml/2006/wordprocessingDrawing" xmlns:w10="urn:schemas-microsoft-com:office:word" xmlns:w="http://schemas.openxmlformats.org/wordprocessingml/2006/main" xmlns:w14="http://schemas.microsoft.com/office/word/2010/wordml" xmlns:w15="http://schemas.microsoft.com/office/word/2012/wordml" xmlns:wpg="http://schemas.microsoft.com/office/word/2010/wordprocessingGroup" xmlns:wpi="http://schemas.microsoft.com/office/word/2010/wordprocessingInk" xmlns:wne="http://schemas.microsoft.com/office/word/2006/wordml" xmlns:wps="http://schemas.microsoft.com/office/word/2010/wordprocessingShape" mc:Ignorable="w14 w15 wp14">
   <w:body>
     <w:p>
       <w:pPr>
@@ -2496,6 +2496,7 @@
       </w:pPr>
       <w:r>
         <w:rPr>
+          <w:noProof/>
           <w:sz w:val="28"/>
           <w:szCs w:val="28"/>
         </w:rPr>
@@ -3015,6 +3016,7 @@
       </w:pPr>
       <w:r>
         <w:rPr>
+          <w:noProof/>
           <w:sz w:val="28"/>
           <w:szCs w:val="28"/>
         </w:rPr>
@@ -3288,6 +3290,7 @@
       </w:pPr>
       <w:r>
         <w:rPr>
+          <w:noProof/>
           <w:sz w:val="28"/>
           <w:szCs w:val="28"/>
         </w:rPr>
@@ -3496,6 +3499,7 @@
       </w:pPr>
       <w:r>
         <w:rPr>
+          <w:noProof/>
           <w:sz w:val="28"/>
           <w:szCs w:val="28"/>
         </w:rPr>
@@ -3625,6 +3629,7 @@
       </w:pPr>
       <w:r>
         <w:rPr>
+          <w:noProof/>
           <w:sz w:val="28"/>
           <w:szCs w:val="28"/>
         </w:rPr>
@@ -4036,6 +4041,7 @@
       </w:pPr>
       <w:r>
         <w:rPr>
+          <w:noProof/>
           <w:sz w:val="28"/>
           <w:szCs w:val="28"/>
         </w:rPr>
@@ -5516,113 +5522,106 @@
           <w:sz w:val="28"/>
           <w:szCs w:val="28"/>
         </w:rPr>
-        <w:t>+</w:t>
+        <w:t xml:space="preserve">+Chia </w:t>
+      </w:r>
+      <w:proofErr w:type="spellStart"/>
+      <w:r>
+        <w:rPr>
+          <w:sz w:val="28"/>
+          <w:szCs w:val="28"/>
+        </w:rPr>
+        <w:t>sẻ</w:t>
+      </w:r>
+      <w:proofErr w:type="spellEnd"/>
+      <w:r>
+        <w:rPr>
+          <w:sz w:val="28"/>
+          <w:szCs w:val="28"/>
+        </w:rPr>
+        <w:t xml:space="preserve"> </w:t>
+      </w:r>
+      <w:proofErr w:type="spellStart"/>
+      <w:r>
+        <w:rPr>
+          <w:sz w:val="28"/>
+          <w:szCs w:val="28"/>
+        </w:rPr>
+        <w:t>dữ</w:t>
+      </w:r>
+      <w:proofErr w:type="spellEnd"/>
+      <w:r>
+        <w:rPr>
+          <w:sz w:val="28"/>
+          <w:szCs w:val="28"/>
+        </w:rPr>
+        <w:t xml:space="preserve"> </w:t>
+      </w:r>
+      <w:proofErr w:type="spellStart"/>
+      <w:r>
+        <w:rPr>
+          <w:sz w:val="28"/>
+          <w:szCs w:val="28"/>
+        </w:rPr>
+        <w:t>liệu</w:t>
+      </w:r>
+      <w:proofErr w:type="spellEnd"/>
+      <w:r>
+        <w:rPr>
+          <w:sz w:val="28"/>
+          <w:szCs w:val="28"/>
+        </w:rPr>
+        <w:t xml:space="preserve"> </w:t>
+      </w:r>
+      <w:proofErr w:type="spellStart"/>
+      <w:r>
+        <w:rPr>
+          <w:sz w:val="28"/>
+          <w:szCs w:val="28"/>
+        </w:rPr>
+        <w:t>với</w:t>
+      </w:r>
+      <w:proofErr w:type="spellEnd"/>
+      <w:r>
+        <w:rPr>
+          <w:sz w:val="28"/>
+          <w:szCs w:val="28"/>
+        </w:rPr>
+        <w:t xml:space="preserve"> </w:t>
+      </w:r>
+      <w:proofErr w:type="spellStart"/>
+      <w:r>
+        <w:rPr>
+          <w:sz w:val="28"/>
+          <w:szCs w:val="28"/>
+        </w:rPr>
+        <w:t>người</w:t>
+      </w:r>
+      <w:proofErr w:type="spellEnd"/>
+      <w:r>
+        <w:rPr>
+          <w:sz w:val="28"/>
+          <w:szCs w:val="28"/>
+        </w:rPr>
+        <w:t xml:space="preserve"> dung: </w:t>
+      </w:r>
+      <w:proofErr w:type="spellStart"/>
+      <w:r>
+        <w:rPr>
+          <w:sz w:val="28"/>
+          <w:szCs w:val="28"/>
+        </w:rPr>
+        <w:t>Tạo</w:t>
+      </w:r>
+      <w:proofErr w:type="spellEnd"/>
+      <w:r>
+        <w:rPr>
+          <w:sz w:val="28"/>
+          <w:szCs w:val="28"/>
+        </w:rPr>
+        <w:t xml:space="preserve"> Server</w:t>
       </w:r>
       <w:bookmarkStart w:id="0" w:name="_GoBack"/>
       <w:bookmarkEnd w:id="0"/>
-      <w:r>
-        <w:rPr>
-          <w:sz w:val="28"/>
-          <w:szCs w:val="28"/>
-        </w:rPr>
-        <w:t xml:space="preserve">Chia </w:t>
-      </w:r>
-      <w:proofErr w:type="spellStart"/>
-      <w:r>
-        <w:rPr>
-          <w:sz w:val="28"/>
-          <w:szCs w:val="28"/>
-        </w:rPr>
-        <w:t>sẻ</w:t>
-      </w:r>
-      <w:proofErr w:type="spellEnd"/>
-      <w:r>
-        <w:rPr>
-          <w:sz w:val="28"/>
-          <w:szCs w:val="28"/>
-        </w:rPr>
-        <w:t xml:space="preserve"> </w:t>
-      </w:r>
-      <w:proofErr w:type="spellStart"/>
-      <w:r>
-        <w:rPr>
-          <w:sz w:val="28"/>
-          <w:szCs w:val="28"/>
-        </w:rPr>
-        <w:t>dữ</w:t>
-      </w:r>
-      <w:proofErr w:type="spellEnd"/>
-      <w:r>
-        <w:rPr>
-          <w:sz w:val="28"/>
-          <w:szCs w:val="28"/>
-        </w:rPr>
-        <w:t xml:space="preserve"> </w:t>
-      </w:r>
-      <w:proofErr w:type="spellStart"/>
-      <w:r>
-        <w:rPr>
-          <w:sz w:val="28"/>
-          <w:szCs w:val="28"/>
-        </w:rPr>
-        <w:t>liệu</w:t>
-      </w:r>
-      <w:proofErr w:type="spellEnd"/>
-      <w:r>
-        <w:rPr>
-          <w:sz w:val="28"/>
-          <w:szCs w:val="28"/>
-        </w:rPr>
-        <w:t xml:space="preserve"> </w:t>
-      </w:r>
-      <w:proofErr w:type="spellStart"/>
-      <w:r>
-        <w:rPr>
-          <w:sz w:val="28"/>
-          <w:szCs w:val="28"/>
-        </w:rPr>
-        <w:t>với</w:t>
-      </w:r>
-      <w:proofErr w:type="spellEnd"/>
-      <w:r>
-        <w:rPr>
-          <w:sz w:val="28"/>
-          <w:szCs w:val="28"/>
-        </w:rPr>
-        <w:t xml:space="preserve"> </w:t>
-      </w:r>
-      <w:proofErr w:type="spellStart"/>
-      <w:r>
-        <w:rPr>
-          <w:sz w:val="28"/>
-          <w:szCs w:val="28"/>
-        </w:rPr>
-        <w:t>người</w:t>
-      </w:r>
-      <w:proofErr w:type="spellEnd"/>
-      <w:r>
-        <w:rPr>
-          <w:sz w:val="28"/>
-          <w:szCs w:val="28"/>
-        </w:rPr>
-        <w:t xml:space="preserve"> dung: </w:t>
-      </w:r>
-      <w:proofErr w:type="spellStart"/>
-      <w:r>
-        <w:rPr>
-          <w:sz w:val="28"/>
-          <w:szCs w:val="28"/>
-        </w:rPr>
-        <w:t>Tạo</w:t>
-      </w:r>
-      <w:proofErr w:type="spellEnd"/>
-      <w:r>
-        <w:rPr>
-          <w:sz w:val="28"/>
-          <w:szCs w:val="28"/>
-        </w:rPr>
-        <w:t xml:space="preserve"> Server</w:t>
-      </w:r>
     </w:p>
     <w:p>
       <w:pPr>
@@ -5631,44 +5630,87 @@
           <w:szCs w:val="28"/>
         </w:rPr>
       </w:pPr>
-      <w:r>
-        <w:rPr>
-          <w:sz w:val="28"/>
-          <w:szCs w:val="28"/>
-        </w:rPr>
-        <w:t xml:space="preserve">-T4: </w:t>
-      </w:r>
-      <w:proofErr w:type="spellStart"/>
-      <w:r>
-        <w:rPr>
-          <w:sz w:val="28"/>
-          <w:szCs w:val="28"/>
-        </w:rPr>
-        <w:t>Hoàn</w:t>
-      </w:r>
-      <w:proofErr w:type="spellEnd"/>
-      <w:r>
-        <w:rPr>
-          <w:sz w:val="28"/>
-          <w:szCs w:val="28"/>
-        </w:rPr>
-        <w:t xml:space="preserve"> </w:t>
-      </w:r>
-      <w:proofErr w:type="spellStart"/>
-      <w:r>
-        <w:rPr>
-          <w:sz w:val="28"/>
-          <w:szCs w:val="28"/>
-        </w:rPr>
-        <w:t>thành</w:t>
-      </w:r>
-      <w:proofErr w:type="spellEnd"/>
-      <w:r>
-        <w:rPr>
-          <w:sz w:val="28"/>
-          <w:szCs w:val="28"/>
-        </w:rPr>
-        <w:t xml:space="preserve"> app Android</w:t>
+      <w:proofErr w:type="spellStart"/>
+      <w:proofErr w:type="gramStart"/>
+      <w:r>
+        <w:rPr>
+          <w:sz w:val="28"/>
+          <w:szCs w:val="28"/>
+        </w:rPr>
+        <w:t>javac</w:t>
+      </w:r>
+      <w:proofErr w:type="spellEnd"/>
+      <w:proofErr w:type="gramEnd"/>
+      <w:r>
+        <w:rPr>
+          <w:sz w:val="28"/>
+          <w:szCs w:val="28"/>
+        </w:rPr>
+        <w:t xml:space="preserve"> MySqlExample.java &amp;&amp; java -</w:t>
+      </w:r>
+      <w:proofErr w:type="spellStart"/>
+      <w:r>
+        <w:rPr>
+          <w:sz w:val="28"/>
+          <w:szCs w:val="28"/>
+        </w:rPr>
+        <w:t>cp</w:t>
+      </w:r>
+      <w:proofErr w:type="spellEnd"/>
+      <w:r>
+        <w:rPr>
+          <w:sz w:val="28"/>
+          <w:szCs w:val="28"/>
+        </w:rPr>
+        <w:t xml:space="preserve"> mysql-driver-8.0.28.jar:. </w:t>
+      </w:r>
+      <w:proofErr w:type="spellStart"/>
+      <w:r>
+        <w:rPr>
+          <w:sz w:val="28"/>
+          <w:szCs w:val="28"/>
+        </w:rPr>
+        <w:t>MySqlExample</w:t>
+      </w:r>
+      <w:proofErr w:type="spellEnd"/>
+      <w:r>
+        <w:rPr>
+          <w:sz w:val="28"/>
+          <w:szCs w:val="28"/>
+        </w:rPr>
+        <w:t xml:space="preserve"> -host mysql-26a06367-neekon250803.j.aivencloud.com -port 12350 -database </w:t>
+      </w:r>
+      <w:proofErr w:type="spellStart"/>
+      <w:r>
+        <w:rPr>
+          <w:sz w:val="28"/>
+          <w:szCs w:val="28"/>
+        </w:rPr>
+        <w:t>defaultdb</w:t>
+      </w:r>
+      <w:proofErr w:type="spellEnd"/>
+      <w:r>
+        <w:rPr>
+          <w:sz w:val="28"/>
+          <w:szCs w:val="28"/>
+        </w:rPr>
+        <w:t xml:space="preserve"> -username </w:t>
+      </w:r>
+      <w:proofErr w:type="spellStart"/>
+      <w:r>
+        <w:rPr>
+          <w:sz w:val="28"/>
+          <w:szCs w:val="28"/>
+        </w:rPr>
+        <w:t>avnadmin</w:t>
+      </w:r>
+      <w:proofErr w:type="spellEnd"/>
+      <w:r>
+        <w:rPr>
+          <w:sz w:val="28"/>
+          <w:szCs w:val="28"/>
+        </w:rPr>
+        <w:t xml:space="preserve"> -password AVNS_B2BPHB23YlxcEZtxfDW</w:t>
       </w:r>
     </w:p>
     <w:p>
@@ -5683,7 +5725,7 @@
           <w:sz w:val="28"/>
           <w:szCs w:val="28"/>
         </w:rPr>
-        <w:t xml:space="preserve">-T5: </w:t>
+        <w:t xml:space="preserve">-T4: </w:t>
       </w:r>
       <w:proofErr w:type="spellStart"/>
       <w:r>
@@ -5715,33 +5757,8 @@
           <w:sz w:val="28"/>
           <w:szCs w:val="28"/>
         </w:rPr>
-        <w:t xml:space="preserve"> </w:t>
-      </w:r>
-      <w:proofErr w:type="spellStart"/>
-      <w:r>
-        <w:rPr>
-          <w:sz w:val="28"/>
-          <w:szCs w:val="28"/>
-        </w:rPr>
-        <w:t>web+báo</w:t>
-      </w:r>
-      <w:proofErr w:type="spellEnd"/>
-      <w:r>
-        <w:rPr>
-          <w:sz w:val="28"/>
-          <w:szCs w:val="28"/>
-        </w:rPr>
-        <w:t xml:space="preserve"> </w:t>
-      </w:r>
-      <w:proofErr w:type="spellStart"/>
-      <w:r>
-        <w:rPr>
-          <w:sz w:val="28"/>
-          <w:szCs w:val="28"/>
-        </w:rPr>
-        <w:t>cáo</w:t>
-      </w:r>
-      <w:proofErr w:type="spellEnd"/>
+        <w:t xml:space="preserve"> app Android</w:t>
+      </w:r>
     </w:p>
     <w:p>
       <w:pPr>
@@ -5750,6 +5767,1941 @@
           <w:szCs w:val="28"/>
         </w:rPr>
       </w:pPr>
+      <w:r>
+        <w:rPr>
+          <w:sz w:val="28"/>
+          <w:szCs w:val="28"/>
+        </w:rPr>
+        <w:t xml:space="preserve">-T5: </w:t>
+      </w:r>
+      <w:proofErr w:type="spellStart"/>
+      <w:r>
+        <w:rPr>
+          <w:sz w:val="28"/>
+          <w:szCs w:val="28"/>
+        </w:rPr>
+        <w:t>Hoàn</w:t>
+      </w:r>
+      <w:proofErr w:type="spellEnd"/>
+      <w:r>
+        <w:rPr>
+          <w:sz w:val="28"/>
+          <w:szCs w:val="28"/>
+        </w:rPr>
+        <w:t xml:space="preserve"> </w:t>
+      </w:r>
+      <w:proofErr w:type="spellStart"/>
+      <w:r>
+        <w:rPr>
+          <w:sz w:val="28"/>
+          <w:szCs w:val="28"/>
+        </w:rPr>
+        <w:t>thành</w:t>
+      </w:r>
+      <w:proofErr w:type="spellEnd"/>
+      <w:r>
+        <w:rPr>
+          <w:sz w:val="28"/>
+          <w:szCs w:val="28"/>
+        </w:rPr>
+        <w:t xml:space="preserve"> </w:t>
+      </w:r>
+      <w:proofErr w:type="spellStart"/>
+      <w:r>
+        <w:rPr>
+          <w:sz w:val="28"/>
+          <w:szCs w:val="28"/>
+        </w:rPr>
+        <w:t>web+báo</w:t>
+      </w:r>
+      <w:proofErr w:type="spellEnd"/>
+      <w:r>
+        <w:rPr>
+          <w:sz w:val="28"/>
+          <w:szCs w:val="28"/>
+        </w:rPr>
+        <w:t xml:space="preserve"> </w:t>
+      </w:r>
+      <w:proofErr w:type="spellStart"/>
+      <w:r>
+        <w:rPr>
+          <w:sz w:val="28"/>
+          <w:szCs w:val="28"/>
+        </w:rPr>
+        <w:t>cáo</w:t>
+      </w:r>
+      <w:proofErr w:type="spellEnd"/>
+    </w:p>
+    <w:p>
+      <w:pPr>
+        <w:spacing w:before="100" w:beforeAutospacing="1" w:after="100" w:afterAutospacing="1" w:line="240" w:lineRule="auto"/>
+        <w:rPr>
+          <w:rFonts w:ascii="Times New Roman" w:eastAsia="Times New Roman" w:hAnsi="Times New Roman" w:cs="Times New Roman"/>
+          <w:sz w:val="24"/>
+          <w:szCs w:val="24"/>
+        </w:rPr>
+      </w:pPr>
+      <w:proofErr w:type="spellStart"/>
+      <w:r>
+        <w:rPr>
+          <w:rFonts w:ascii="Times New Roman" w:eastAsia="Times New Roman" w:hAnsi="Times New Roman" w:cs="Times New Roman"/>
+          <w:sz w:val="24"/>
+          <w:szCs w:val="24"/>
+        </w:rPr>
+        <w:t>Sau</w:t>
+      </w:r>
+      <w:proofErr w:type="spellEnd"/>
+      <w:r>
+        <w:rPr>
+          <w:rFonts w:ascii="Times New Roman" w:eastAsia="Times New Roman" w:hAnsi="Times New Roman" w:cs="Times New Roman"/>
+          <w:sz w:val="24"/>
+          <w:szCs w:val="24"/>
+        </w:rPr>
+        <w:t xml:space="preserve"> </w:t>
+      </w:r>
+      <w:proofErr w:type="spellStart"/>
+      <w:r>
+        <w:rPr>
+          <w:rFonts w:ascii="Times New Roman" w:eastAsia="Times New Roman" w:hAnsi="Times New Roman" w:cs="Times New Roman"/>
+          <w:sz w:val="24"/>
+          <w:szCs w:val="24"/>
+        </w:rPr>
+        <w:t>khi</w:t>
+      </w:r>
+      <w:proofErr w:type="spellEnd"/>
+      <w:r>
+        <w:rPr>
+          <w:rFonts w:ascii="Times New Roman" w:eastAsia="Times New Roman" w:hAnsi="Times New Roman" w:cs="Times New Roman"/>
+          <w:sz w:val="24"/>
+          <w:szCs w:val="24"/>
+        </w:rPr>
+        <w:t xml:space="preserve"> </w:t>
+      </w:r>
+      <w:proofErr w:type="spellStart"/>
+      <w:r>
+        <w:rPr>
+          <w:rFonts w:ascii="Times New Roman" w:eastAsia="Times New Roman" w:hAnsi="Times New Roman" w:cs="Times New Roman"/>
+          <w:sz w:val="24"/>
+          <w:szCs w:val="24"/>
+        </w:rPr>
+        <w:t>thiết</w:t>
+      </w:r>
+      <w:proofErr w:type="spellEnd"/>
+      <w:r>
+        <w:rPr>
+          <w:rFonts w:ascii="Times New Roman" w:eastAsia="Times New Roman" w:hAnsi="Times New Roman" w:cs="Times New Roman"/>
+          <w:sz w:val="24"/>
+          <w:szCs w:val="24"/>
+        </w:rPr>
+        <w:t xml:space="preserve"> </w:t>
+      </w:r>
+      <w:proofErr w:type="spellStart"/>
+      <w:r>
+        <w:rPr>
+          <w:rFonts w:ascii="Times New Roman" w:eastAsia="Times New Roman" w:hAnsi="Times New Roman" w:cs="Times New Roman"/>
+          <w:sz w:val="24"/>
+          <w:szCs w:val="24"/>
+        </w:rPr>
+        <w:t>lập</w:t>
+      </w:r>
+      <w:proofErr w:type="spellEnd"/>
+      <w:r>
+        <w:rPr>
+          <w:rFonts w:ascii="Times New Roman" w:eastAsia="Times New Roman" w:hAnsi="Times New Roman" w:cs="Times New Roman"/>
+          <w:sz w:val="24"/>
+          <w:szCs w:val="24"/>
+        </w:rPr>
+        <w:t xml:space="preserve"> API REST </w:t>
+      </w:r>
+      <w:proofErr w:type="spellStart"/>
+      <w:r>
+        <w:rPr>
+          <w:rFonts w:ascii="Times New Roman" w:eastAsia="Times New Roman" w:hAnsi="Times New Roman" w:cs="Times New Roman"/>
+          <w:sz w:val="24"/>
+          <w:szCs w:val="24"/>
+        </w:rPr>
+        <w:t>với</w:t>
+      </w:r>
+      <w:proofErr w:type="spellEnd"/>
+      <w:r>
+        <w:rPr>
+          <w:rFonts w:ascii="Times New Roman" w:eastAsia="Times New Roman" w:hAnsi="Times New Roman" w:cs="Times New Roman"/>
+          <w:sz w:val="24"/>
+          <w:szCs w:val="24"/>
+        </w:rPr>
+        <w:t xml:space="preserve"> Java </w:t>
+      </w:r>
+      <w:proofErr w:type="spellStart"/>
+      <w:r>
+        <w:rPr>
+          <w:rFonts w:ascii="Times New Roman" w:eastAsia="Times New Roman" w:hAnsi="Times New Roman" w:cs="Times New Roman"/>
+          <w:sz w:val="24"/>
+          <w:szCs w:val="24"/>
+        </w:rPr>
+        <w:t>và</w:t>
+      </w:r>
+      <w:proofErr w:type="spellEnd"/>
+      <w:r>
+        <w:rPr>
+          <w:rFonts w:ascii="Times New Roman" w:eastAsia="Times New Roman" w:hAnsi="Times New Roman" w:cs="Times New Roman"/>
+          <w:sz w:val="24"/>
+          <w:szCs w:val="24"/>
+        </w:rPr>
+        <w:t xml:space="preserve"> MySQL, </w:t>
+      </w:r>
+      <w:proofErr w:type="spellStart"/>
+      <w:r>
+        <w:rPr>
+          <w:rFonts w:ascii="Times New Roman" w:eastAsia="Times New Roman" w:hAnsi="Times New Roman" w:cs="Times New Roman"/>
+          <w:sz w:val="24"/>
+          <w:szCs w:val="24"/>
+        </w:rPr>
+        <w:t>bạn</w:t>
+      </w:r>
+      <w:proofErr w:type="spellEnd"/>
+      <w:r>
+        <w:rPr>
+          <w:rFonts w:ascii="Times New Roman" w:eastAsia="Times New Roman" w:hAnsi="Times New Roman" w:cs="Times New Roman"/>
+          <w:sz w:val="24"/>
+          <w:szCs w:val="24"/>
+        </w:rPr>
+        <w:t xml:space="preserve"> </w:t>
+      </w:r>
+      <w:proofErr w:type="spellStart"/>
+      <w:r>
+        <w:rPr>
+          <w:rFonts w:ascii="Times New Roman" w:eastAsia="Times New Roman" w:hAnsi="Times New Roman" w:cs="Times New Roman"/>
+          <w:sz w:val="24"/>
+          <w:szCs w:val="24"/>
+        </w:rPr>
+        <w:t>cần</w:t>
+      </w:r>
+      <w:proofErr w:type="spellEnd"/>
+      <w:r>
+        <w:rPr>
+          <w:rFonts w:ascii="Times New Roman" w:eastAsia="Times New Roman" w:hAnsi="Times New Roman" w:cs="Times New Roman"/>
+          <w:sz w:val="24"/>
+          <w:szCs w:val="24"/>
+        </w:rPr>
+        <w:t xml:space="preserve"> </w:t>
+      </w:r>
+      <w:proofErr w:type="spellStart"/>
+      <w:r>
+        <w:rPr>
+          <w:rFonts w:ascii="Times New Roman" w:eastAsia="Times New Roman" w:hAnsi="Times New Roman" w:cs="Times New Roman"/>
+          <w:sz w:val="24"/>
+          <w:szCs w:val="24"/>
+        </w:rPr>
+        <w:t>kiểm</w:t>
+      </w:r>
+      <w:proofErr w:type="spellEnd"/>
+      <w:r>
+        <w:rPr>
+          <w:rFonts w:ascii="Times New Roman" w:eastAsia="Times New Roman" w:hAnsi="Times New Roman" w:cs="Times New Roman"/>
+          <w:sz w:val="24"/>
+          <w:szCs w:val="24"/>
+        </w:rPr>
+        <w:t xml:space="preserve"> </w:t>
+      </w:r>
+      <w:proofErr w:type="spellStart"/>
+      <w:r>
+        <w:rPr>
+          <w:rFonts w:ascii="Times New Roman" w:eastAsia="Times New Roman" w:hAnsi="Times New Roman" w:cs="Times New Roman"/>
+          <w:sz w:val="24"/>
+          <w:szCs w:val="24"/>
+        </w:rPr>
+        <w:t>tra</w:t>
+      </w:r>
+      <w:proofErr w:type="spellEnd"/>
+      <w:r>
+        <w:rPr>
+          <w:rFonts w:ascii="Times New Roman" w:eastAsia="Times New Roman" w:hAnsi="Times New Roman" w:cs="Times New Roman"/>
+          <w:sz w:val="24"/>
+          <w:szCs w:val="24"/>
+        </w:rPr>
+        <w:t xml:space="preserve"> </w:t>
+      </w:r>
+      <w:proofErr w:type="spellStart"/>
+      <w:r>
+        <w:rPr>
+          <w:rFonts w:ascii="Times New Roman" w:eastAsia="Times New Roman" w:hAnsi="Times New Roman" w:cs="Times New Roman"/>
+          <w:sz w:val="24"/>
+          <w:szCs w:val="24"/>
+        </w:rPr>
+        <w:t>xem</w:t>
+      </w:r>
+      <w:proofErr w:type="spellEnd"/>
+      <w:r>
+        <w:rPr>
+          <w:rFonts w:ascii="Times New Roman" w:eastAsia="Times New Roman" w:hAnsi="Times New Roman" w:cs="Times New Roman"/>
+          <w:sz w:val="24"/>
+          <w:szCs w:val="24"/>
+        </w:rPr>
+        <w:t xml:space="preserve"> </w:t>
+      </w:r>
+      <w:proofErr w:type="spellStart"/>
+      <w:r>
+        <w:rPr>
+          <w:rFonts w:ascii="Times New Roman" w:eastAsia="Times New Roman" w:hAnsi="Times New Roman" w:cs="Times New Roman"/>
+          <w:sz w:val="24"/>
+          <w:szCs w:val="24"/>
+        </w:rPr>
+        <w:t>hệ</w:t>
+      </w:r>
+      <w:proofErr w:type="spellEnd"/>
+      <w:r>
+        <w:rPr>
+          <w:rFonts w:ascii="Times New Roman" w:eastAsia="Times New Roman" w:hAnsi="Times New Roman" w:cs="Times New Roman"/>
+          <w:sz w:val="24"/>
+          <w:szCs w:val="24"/>
+        </w:rPr>
+        <w:t xml:space="preserve"> </w:t>
+      </w:r>
+      <w:proofErr w:type="spellStart"/>
+      <w:r>
+        <w:rPr>
+          <w:rFonts w:ascii="Times New Roman" w:eastAsia="Times New Roman" w:hAnsi="Times New Roman" w:cs="Times New Roman"/>
+          <w:sz w:val="24"/>
+          <w:szCs w:val="24"/>
+        </w:rPr>
+        <w:t>thống</w:t>
+      </w:r>
+      <w:proofErr w:type="spellEnd"/>
+      <w:r>
+        <w:rPr>
+          <w:rFonts w:ascii="Times New Roman" w:eastAsia="Times New Roman" w:hAnsi="Times New Roman" w:cs="Times New Roman"/>
+          <w:sz w:val="24"/>
+          <w:szCs w:val="24"/>
+        </w:rPr>
+        <w:t xml:space="preserve"> </w:t>
+      </w:r>
+      <w:proofErr w:type="spellStart"/>
+      <w:r>
+        <w:rPr>
+          <w:rFonts w:ascii="Times New Roman" w:eastAsia="Times New Roman" w:hAnsi="Times New Roman" w:cs="Times New Roman"/>
+          <w:sz w:val="24"/>
+          <w:szCs w:val="24"/>
+        </w:rPr>
+        <w:t>hoạt</w:t>
+      </w:r>
+      <w:proofErr w:type="spellEnd"/>
+      <w:r>
+        <w:rPr>
+          <w:rFonts w:ascii="Times New Roman" w:eastAsia="Times New Roman" w:hAnsi="Times New Roman" w:cs="Times New Roman"/>
+          <w:sz w:val="24"/>
+          <w:szCs w:val="24"/>
+        </w:rPr>
+        <w:t xml:space="preserve"> </w:t>
+      </w:r>
+      <w:proofErr w:type="spellStart"/>
+      <w:r>
+        <w:rPr>
+          <w:rFonts w:ascii="Times New Roman" w:eastAsia="Times New Roman" w:hAnsi="Times New Roman" w:cs="Times New Roman"/>
+          <w:sz w:val="24"/>
+          <w:szCs w:val="24"/>
+        </w:rPr>
+        <w:t>động</w:t>
+      </w:r>
+      <w:proofErr w:type="spellEnd"/>
+      <w:r>
+        <w:rPr>
+          <w:rFonts w:ascii="Times New Roman" w:eastAsia="Times New Roman" w:hAnsi="Times New Roman" w:cs="Times New Roman"/>
+          <w:sz w:val="24"/>
+          <w:szCs w:val="24"/>
+        </w:rPr>
+        <w:t xml:space="preserve"> </w:t>
+      </w:r>
+      <w:proofErr w:type="spellStart"/>
+      <w:r>
+        <w:rPr>
+          <w:rFonts w:ascii="Times New Roman" w:eastAsia="Times New Roman" w:hAnsi="Times New Roman" w:cs="Times New Roman"/>
+          <w:sz w:val="24"/>
+          <w:szCs w:val="24"/>
+        </w:rPr>
+        <w:t>đúng</w:t>
+      </w:r>
+      <w:proofErr w:type="spellEnd"/>
+      <w:r>
+        <w:rPr>
+          <w:rFonts w:ascii="Times New Roman" w:eastAsia="Times New Roman" w:hAnsi="Times New Roman" w:cs="Times New Roman"/>
+          <w:sz w:val="24"/>
+          <w:szCs w:val="24"/>
+        </w:rPr>
+        <w:t xml:space="preserve"> </w:t>
+      </w:r>
+      <w:proofErr w:type="spellStart"/>
+      <w:r>
+        <w:rPr>
+          <w:rFonts w:ascii="Times New Roman" w:eastAsia="Times New Roman" w:hAnsi="Times New Roman" w:cs="Times New Roman"/>
+          <w:sz w:val="24"/>
+          <w:szCs w:val="24"/>
+        </w:rPr>
+        <w:t>cách</w:t>
+      </w:r>
+      <w:proofErr w:type="spellEnd"/>
+      <w:r>
+        <w:rPr>
+          <w:rFonts w:ascii="Times New Roman" w:eastAsia="Times New Roman" w:hAnsi="Times New Roman" w:cs="Times New Roman"/>
+          <w:sz w:val="24"/>
+          <w:szCs w:val="24"/>
+        </w:rPr>
+        <w:t xml:space="preserve"> </w:t>
+      </w:r>
+      <w:proofErr w:type="spellStart"/>
+      <w:r>
+        <w:rPr>
+          <w:rFonts w:ascii="Times New Roman" w:eastAsia="Times New Roman" w:hAnsi="Times New Roman" w:cs="Times New Roman"/>
+          <w:sz w:val="24"/>
+          <w:szCs w:val="24"/>
+        </w:rPr>
+        <w:t>và</w:t>
+      </w:r>
+      <w:proofErr w:type="spellEnd"/>
+      <w:r>
+        <w:rPr>
+          <w:rFonts w:ascii="Times New Roman" w:eastAsia="Times New Roman" w:hAnsi="Times New Roman" w:cs="Times New Roman"/>
+          <w:sz w:val="24"/>
+          <w:szCs w:val="24"/>
+        </w:rPr>
+        <w:t xml:space="preserve"> </w:t>
+      </w:r>
+      <w:proofErr w:type="spellStart"/>
+      <w:r>
+        <w:rPr>
+          <w:rFonts w:ascii="Times New Roman" w:eastAsia="Times New Roman" w:hAnsi="Times New Roman" w:cs="Times New Roman"/>
+          <w:sz w:val="24"/>
+          <w:szCs w:val="24"/>
+        </w:rPr>
+        <w:t>triển</w:t>
+      </w:r>
+      <w:proofErr w:type="spellEnd"/>
+      <w:r>
+        <w:rPr>
+          <w:rFonts w:ascii="Times New Roman" w:eastAsia="Times New Roman" w:hAnsi="Times New Roman" w:cs="Times New Roman"/>
+          <w:sz w:val="24"/>
+          <w:szCs w:val="24"/>
+        </w:rPr>
+        <w:t xml:space="preserve"> </w:t>
+      </w:r>
+      <w:proofErr w:type="spellStart"/>
+      <w:r>
+        <w:rPr>
+          <w:rFonts w:ascii="Times New Roman" w:eastAsia="Times New Roman" w:hAnsi="Times New Roman" w:cs="Times New Roman"/>
+          <w:sz w:val="24"/>
+          <w:szCs w:val="24"/>
+        </w:rPr>
+        <w:t>khai</w:t>
+      </w:r>
+      <w:proofErr w:type="spellEnd"/>
+      <w:r>
+        <w:rPr>
+          <w:rFonts w:ascii="Times New Roman" w:eastAsia="Times New Roman" w:hAnsi="Times New Roman" w:cs="Times New Roman"/>
+          <w:sz w:val="24"/>
+          <w:szCs w:val="24"/>
+        </w:rPr>
+        <w:t xml:space="preserve"> </w:t>
+      </w:r>
+      <w:proofErr w:type="spellStart"/>
+      <w:r>
+        <w:rPr>
+          <w:rFonts w:ascii="Times New Roman" w:eastAsia="Times New Roman" w:hAnsi="Times New Roman" w:cs="Times New Roman"/>
+          <w:sz w:val="24"/>
+          <w:szCs w:val="24"/>
+        </w:rPr>
+        <w:t>lên</w:t>
+      </w:r>
+      <w:proofErr w:type="spellEnd"/>
+      <w:r>
+        <w:rPr>
+          <w:rFonts w:ascii="Times New Roman" w:eastAsia="Times New Roman" w:hAnsi="Times New Roman" w:cs="Times New Roman"/>
+          <w:sz w:val="24"/>
+          <w:szCs w:val="24"/>
+        </w:rPr>
+        <w:t xml:space="preserve"> </w:t>
+      </w:r>
+      <w:proofErr w:type="spellStart"/>
+      <w:r>
+        <w:rPr>
+          <w:rFonts w:ascii="Times New Roman" w:eastAsia="Times New Roman" w:hAnsi="Times New Roman" w:cs="Times New Roman"/>
+          <w:sz w:val="24"/>
+          <w:szCs w:val="24"/>
+        </w:rPr>
+        <w:t>máy</w:t>
+      </w:r>
+      <w:proofErr w:type="spellEnd"/>
+      <w:r>
+        <w:rPr>
+          <w:rFonts w:ascii="Times New Roman" w:eastAsia="Times New Roman" w:hAnsi="Times New Roman" w:cs="Times New Roman"/>
+          <w:sz w:val="24"/>
+          <w:szCs w:val="24"/>
+        </w:rPr>
+        <w:t xml:space="preserve"> </w:t>
+      </w:r>
+      <w:proofErr w:type="spellStart"/>
+      <w:r>
+        <w:rPr>
+          <w:rFonts w:ascii="Times New Roman" w:eastAsia="Times New Roman" w:hAnsi="Times New Roman" w:cs="Times New Roman"/>
+          <w:sz w:val="24"/>
+          <w:szCs w:val="24"/>
+        </w:rPr>
+        <w:t>chủ</w:t>
+      </w:r>
+      <w:proofErr w:type="spellEnd"/>
+      <w:r>
+        <w:rPr>
+          <w:rFonts w:ascii="Times New Roman" w:eastAsia="Times New Roman" w:hAnsi="Times New Roman" w:cs="Times New Roman"/>
+          <w:sz w:val="24"/>
+          <w:szCs w:val="24"/>
+        </w:rPr>
+        <w:t xml:space="preserve"> </w:t>
+      </w:r>
+      <w:proofErr w:type="spellStart"/>
+      <w:r>
+        <w:rPr>
+          <w:rFonts w:ascii="Times New Roman" w:eastAsia="Times New Roman" w:hAnsi="Times New Roman" w:cs="Times New Roman"/>
+          <w:sz w:val="24"/>
+          <w:szCs w:val="24"/>
+        </w:rPr>
+        <w:t>nếu</w:t>
+      </w:r>
+      <w:proofErr w:type="spellEnd"/>
+      <w:r>
+        <w:rPr>
+          <w:rFonts w:ascii="Times New Roman" w:eastAsia="Times New Roman" w:hAnsi="Times New Roman" w:cs="Times New Roman"/>
+          <w:sz w:val="24"/>
+          <w:szCs w:val="24"/>
+        </w:rPr>
+        <w:t xml:space="preserve"> </w:t>
+      </w:r>
+      <w:proofErr w:type="spellStart"/>
+      <w:r>
+        <w:rPr>
+          <w:rFonts w:ascii="Times New Roman" w:eastAsia="Times New Roman" w:hAnsi="Times New Roman" w:cs="Times New Roman"/>
+          <w:sz w:val="24"/>
+          <w:szCs w:val="24"/>
+        </w:rPr>
+        <w:t>muốn</w:t>
+      </w:r>
+      <w:proofErr w:type="spellEnd"/>
+      <w:r>
+        <w:rPr>
+          <w:rFonts w:ascii="Times New Roman" w:eastAsia="Times New Roman" w:hAnsi="Times New Roman" w:cs="Times New Roman"/>
+          <w:sz w:val="24"/>
+          <w:szCs w:val="24"/>
+        </w:rPr>
+        <w:t xml:space="preserve"> </w:t>
+      </w:r>
+      <w:proofErr w:type="spellStart"/>
+      <w:r>
+        <w:rPr>
+          <w:rFonts w:ascii="Times New Roman" w:eastAsia="Times New Roman" w:hAnsi="Times New Roman" w:cs="Times New Roman"/>
+          <w:sz w:val="24"/>
+          <w:szCs w:val="24"/>
+        </w:rPr>
+        <w:t>ứng</w:t>
+      </w:r>
+      <w:proofErr w:type="spellEnd"/>
+      <w:r>
+        <w:rPr>
+          <w:rFonts w:ascii="Times New Roman" w:eastAsia="Times New Roman" w:hAnsi="Times New Roman" w:cs="Times New Roman"/>
+          <w:sz w:val="24"/>
+          <w:szCs w:val="24"/>
+        </w:rPr>
+        <w:t xml:space="preserve"> </w:t>
+      </w:r>
+      <w:proofErr w:type="spellStart"/>
+      <w:r>
+        <w:rPr>
+          <w:rFonts w:ascii="Times New Roman" w:eastAsia="Times New Roman" w:hAnsi="Times New Roman" w:cs="Times New Roman"/>
+          <w:sz w:val="24"/>
+          <w:szCs w:val="24"/>
+        </w:rPr>
+        <w:t>dụng</w:t>
+      </w:r>
+      <w:proofErr w:type="spellEnd"/>
+      <w:r>
+        <w:rPr>
+          <w:rFonts w:ascii="Times New Roman" w:eastAsia="Times New Roman" w:hAnsi="Times New Roman" w:cs="Times New Roman"/>
+          <w:sz w:val="24"/>
+          <w:szCs w:val="24"/>
+        </w:rPr>
+        <w:t xml:space="preserve"> </w:t>
+      </w:r>
+      <w:proofErr w:type="spellStart"/>
+      <w:r>
+        <w:rPr>
+          <w:rFonts w:ascii="Times New Roman" w:eastAsia="Times New Roman" w:hAnsi="Times New Roman" w:cs="Times New Roman"/>
+          <w:sz w:val="24"/>
+          <w:szCs w:val="24"/>
+        </w:rPr>
+        <w:t>của</w:t>
+      </w:r>
+      <w:proofErr w:type="spellEnd"/>
+      <w:r>
+        <w:rPr>
+          <w:rFonts w:ascii="Times New Roman" w:eastAsia="Times New Roman" w:hAnsi="Times New Roman" w:cs="Times New Roman"/>
+          <w:sz w:val="24"/>
+          <w:szCs w:val="24"/>
+        </w:rPr>
+        <w:t xml:space="preserve"> </w:t>
+      </w:r>
+      <w:proofErr w:type="spellStart"/>
+      <w:r>
+        <w:rPr>
+          <w:rFonts w:ascii="Times New Roman" w:eastAsia="Times New Roman" w:hAnsi="Times New Roman" w:cs="Times New Roman"/>
+          <w:sz w:val="24"/>
+          <w:szCs w:val="24"/>
+        </w:rPr>
+        <w:t>mình</w:t>
+      </w:r>
+      <w:proofErr w:type="spellEnd"/>
+      <w:r>
+        <w:rPr>
+          <w:rFonts w:ascii="Times New Roman" w:eastAsia="Times New Roman" w:hAnsi="Times New Roman" w:cs="Times New Roman"/>
+          <w:sz w:val="24"/>
+          <w:szCs w:val="24"/>
+        </w:rPr>
+        <w:t xml:space="preserve"> </w:t>
+      </w:r>
+      <w:proofErr w:type="spellStart"/>
+      <w:r>
+        <w:rPr>
+          <w:rFonts w:ascii="Times New Roman" w:eastAsia="Times New Roman" w:hAnsi="Times New Roman" w:cs="Times New Roman"/>
+          <w:sz w:val="24"/>
+          <w:szCs w:val="24"/>
+        </w:rPr>
+        <w:t>có</w:t>
+      </w:r>
+      <w:proofErr w:type="spellEnd"/>
+      <w:r>
+        <w:rPr>
+          <w:rFonts w:ascii="Times New Roman" w:eastAsia="Times New Roman" w:hAnsi="Times New Roman" w:cs="Times New Roman"/>
+          <w:sz w:val="24"/>
+          <w:szCs w:val="24"/>
+        </w:rPr>
+        <w:t xml:space="preserve"> </w:t>
+      </w:r>
+      <w:proofErr w:type="spellStart"/>
+      <w:r>
+        <w:rPr>
+          <w:rFonts w:ascii="Times New Roman" w:eastAsia="Times New Roman" w:hAnsi="Times New Roman" w:cs="Times New Roman"/>
+          <w:sz w:val="24"/>
+          <w:szCs w:val="24"/>
+        </w:rPr>
+        <w:t>thể</w:t>
+      </w:r>
+      <w:proofErr w:type="spellEnd"/>
+      <w:r>
+        <w:rPr>
+          <w:rFonts w:ascii="Times New Roman" w:eastAsia="Times New Roman" w:hAnsi="Times New Roman" w:cs="Times New Roman"/>
+          <w:sz w:val="24"/>
+          <w:szCs w:val="24"/>
+        </w:rPr>
+        <w:t xml:space="preserve"> </w:t>
+      </w:r>
+      <w:proofErr w:type="spellStart"/>
+      <w:r>
+        <w:rPr>
+          <w:rFonts w:ascii="Times New Roman" w:eastAsia="Times New Roman" w:hAnsi="Times New Roman" w:cs="Times New Roman"/>
+          <w:sz w:val="24"/>
+          <w:szCs w:val="24"/>
+        </w:rPr>
+        <w:t>truy</w:t>
+      </w:r>
+      <w:proofErr w:type="spellEnd"/>
+      <w:r>
+        <w:rPr>
+          <w:rFonts w:ascii="Times New Roman" w:eastAsia="Times New Roman" w:hAnsi="Times New Roman" w:cs="Times New Roman"/>
+          <w:sz w:val="24"/>
+          <w:szCs w:val="24"/>
+        </w:rPr>
+        <w:t xml:space="preserve"> </w:t>
+      </w:r>
+      <w:proofErr w:type="spellStart"/>
+      <w:r>
+        <w:rPr>
+          <w:rFonts w:ascii="Times New Roman" w:eastAsia="Times New Roman" w:hAnsi="Times New Roman" w:cs="Times New Roman"/>
+          <w:sz w:val="24"/>
+          <w:szCs w:val="24"/>
+        </w:rPr>
+        <w:t>cập</w:t>
+      </w:r>
+      <w:proofErr w:type="spellEnd"/>
+      <w:r>
+        <w:rPr>
+          <w:rFonts w:ascii="Times New Roman" w:eastAsia="Times New Roman" w:hAnsi="Times New Roman" w:cs="Times New Roman"/>
+          <w:sz w:val="24"/>
+          <w:szCs w:val="24"/>
+        </w:rPr>
+        <w:t xml:space="preserve"> </w:t>
+      </w:r>
+      <w:proofErr w:type="spellStart"/>
+      <w:r>
+        <w:rPr>
+          <w:rFonts w:ascii="Times New Roman" w:eastAsia="Times New Roman" w:hAnsi="Times New Roman" w:cs="Times New Roman"/>
+          <w:sz w:val="24"/>
+          <w:szCs w:val="24"/>
+        </w:rPr>
+        <w:t>từ</w:t>
+      </w:r>
+      <w:proofErr w:type="spellEnd"/>
+      <w:r>
+        <w:rPr>
+          <w:rFonts w:ascii="Times New Roman" w:eastAsia="Times New Roman" w:hAnsi="Times New Roman" w:cs="Times New Roman"/>
+          <w:sz w:val="24"/>
+          <w:szCs w:val="24"/>
+        </w:rPr>
+        <w:t xml:space="preserve"> </w:t>
+      </w:r>
+      <w:proofErr w:type="spellStart"/>
+      <w:r>
+        <w:rPr>
+          <w:rFonts w:ascii="Times New Roman" w:eastAsia="Times New Roman" w:hAnsi="Times New Roman" w:cs="Times New Roman"/>
+          <w:sz w:val="24"/>
+          <w:szCs w:val="24"/>
+        </w:rPr>
+        <w:t>bất</w:t>
+      </w:r>
+      <w:proofErr w:type="spellEnd"/>
+      <w:r>
+        <w:rPr>
+          <w:rFonts w:ascii="Times New Roman" w:eastAsia="Times New Roman" w:hAnsi="Times New Roman" w:cs="Times New Roman"/>
+          <w:sz w:val="24"/>
+          <w:szCs w:val="24"/>
+        </w:rPr>
+        <w:t xml:space="preserve"> </w:t>
+      </w:r>
+      <w:proofErr w:type="spellStart"/>
+      <w:r>
+        <w:rPr>
+          <w:rFonts w:ascii="Times New Roman" w:eastAsia="Times New Roman" w:hAnsi="Times New Roman" w:cs="Times New Roman"/>
+          <w:sz w:val="24"/>
+          <w:szCs w:val="24"/>
+        </w:rPr>
+        <w:t>kỳ</w:t>
+      </w:r>
+      <w:proofErr w:type="spellEnd"/>
+      <w:r>
+        <w:rPr>
+          <w:rFonts w:ascii="Times New Roman" w:eastAsia="Times New Roman" w:hAnsi="Times New Roman" w:cs="Times New Roman"/>
+          <w:sz w:val="24"/>
+          <w:szCs w:val="24"/>
+        </w:rPr>
+        <w:t xml:space="preserve"> </w:t>
+      </w:r>
+      <w:proofErr w:type="spellStart"/>
+      <w:r>
+        <w:rPr>
+          <w:rFonts w:ascii="Times New Roman" w:eastAsia="Times New Roman" w:hAnsi="Times New Roman" w:cs="Times New Roman"/>
+          <w:sz w:val="24"/>
+          <w:szCs w:val="24"/>
+        </w:rPr>
+        <w:t>đâu</w:t>
+      </w:r>
+      <w:proofErr w:type="spellEnd"/>
+      <w:r>
+        <w:rPr>
+          <w:rFonts w:ascii="Times New Roman" w:eastAsia="Times New Roman" w:hAnsi="Times New Roman" w:cs="Times New Roman"/>
+          <w:sz w:val="24"/>
+          <w:szCs w:val="24"/>
+        </w:rPr>
+        <w:t xml:space="preserve">. </w:t>
+      </w:r>
+      <w:proofErr w:type="spellStart"/>
+      <w:r>
+        <w:rPr>
+          <w:rFonts w:ascii="Times New Roman" w:eastAsia="Times New Roman" w:hAnsi="Times New Roman" w:cs="Times New Roman"/>
+          <w:sz w:val="24"/>
+          <w:szCs w:val="24"/>
+        </w:rPr>
+        <w:t>Dưới</w:t>
+      </w:r>
+      <w:proofErr w:type="spellEnd"/>
+      <w:r>
+        <w:rPr>
+          <w:rFonts w:ascii="Times New Roman" w:eastAsia="Times New Roman" w:hAnsi="Times New Roman" w:cs="Times New Roman"/>
+          <w:sz w:val="24"/>
+          <w:szCs w:val="24"/>
+        </w:rPr>
+        <w:t xml:space="preserve"> </w:t>
+      </w:r>
+      <w:proofErr w:type="spellStart"/>
+      <w:r>
+        <w:rPr>
+          <w:rFonts w:ascii="Times New Roman" w:eastAsia="Times New Roman" w:hAnsi="Times New Roman" w:cs="Times New Roman"/>
+          <w:sz w:val="24"/>
+          <w:szCs w:val="24"/>
+        </w:rPr>
+        <w:t>đây</w:t>
+      </w:r>
+      <w:proofErr w:type="spellEnd"/>
+      <w:r>
+        <w:rPr>
+          <w:rFonts w:ascii="Times New Roman" w:eastAsia="Times New Roman" w:hAnsi="Times New Roman" w:cs="Times New Roman"/>
+          <w:sz w:val="24"/>
+          <w:szCs w:val="24"/>
+        </w:rPr>
+        <w:t xml:space="preserve"> </w:t>
+      </w:r>
+      <w:proofErr w:type="spellStart"/>
+      <w:r>
+        <w:rPr>
+          <w:rFonts w:ascii="Times New Roman" w:eastAsia="Times New Roman" w:hAnsi="Times New Roman" w:cs="Times New Roman"/>
+          <w:sz w:val="24"/>
+          <w:szCs w:val="24"/>
+        </w:rPr>
+        <w:t>là</w:t>
+      </w:r>
+      <w:proofErr w:type="spellEnd"/>
+      <w:r>
+        <w:rPr>
+          <w:rFonts w:ascii="Times New Roman" w:eastAsia="Times New Roman" w:hAnsi="Times New Roman" w:cs="Times New Roman"/>
+          <w:sz w:val="24"/>
+          <w:szCs w:val="24"/>
+        </w:rPr>
+        <w:t xml:space="preserve"> </w:t>
+      </w:r>
+      <w:proofErr w:type="spellStart"/>
+      <w:r>
+        <w:rPr>
+          <w:rFonts w:ascii="Times New Roman" w:eastAsia="Times New Roman" w:hAnsi="Times New Roman" w:cs="Times New Roman"/>
+          <w:sz w:val="24"/>
+          <w:szCs w:val="24"/>
+        </w:rPr>
+        <w:t>các</w:t>
+      </w:r>
+      <w:proofErr w:type="spellEnd"/>
+      <w:r>
+        <w:rPr>
+          <w:rFonts w:ascii="Times New Roman" w:eastAsia="Times New Roman" w:hAnsi="Times New Roman" w:cs="Times New Roman"/>
+          <w:sz w:val="24"/>
+          <w:szCs w:val="24"/>
+        </w:rPr>
+        <w:t xml:space="preserve"> </w:t>
+      </w:r>
+      <w:proofErr w:type="spellStart"/>
+      <w:r>
+        <w:rPr>
+          <w:rFonts w:ascii="Times New Roman" w:eastAsia="Times New Roman" w:hAnsi="Times New Roman" w:cs="Times New Roman"/>
+          <w:sz w:val="24"/>
+          <w:szCs w:val="24"/>
+        </w:rPr>
+        <w:t>bước</w:t>
+      </w:r>
+      <w:proofErr w:type="spellEnd"/>
+      <w:r>
+        <w:rPr>
+          <w:rFonts w:ascii="Times New Roman" w:eastAsia="Times New Roman" w:hAnsi="Times New Roman" w:cs="Times New Roman"/>
+          <w:sz w:val="24"/>
+          <w:szCs w:val="24"/>
+        </w:rPr>
+        <w:t xml:space="preserve"> </w:t>
+      </w:r>
+      <w:proofErr w:type="spellStart"/>
+      <w:r>
+        <w:rPr>
+          <w:rFonts w:ascii="Times New Roman" w:eastAsia="Times New Roman" w:hAnsi="Times New Roman" w:cs="Times New Roman"/>
+          <w:sz w:val="24"/>
+          <w:szCs w:val="24"/>
+        </w:rPr>
+        <w:t>tiếp</w:t>
+      </w:r>
+      <w:proofErr w:type="spellEnd"/>
+      <w:r>
+        <w:rPr>
+          <w:rFonts w:ascii="Times New Roman" w:eastAsia="Times New Roman" w:hAnsi="Times New Roman" w:cs="Times New Roman"/>
+          <w:sz w:val="24"/>
+          <w:szCs w:val="24"/>
+        </w:rPr>
+        <w:t xml:space="preserve"> </w:t>
+      </w:r>
+      <w:proofErr w:type="spellStart"/>
+      <w:proofErr w:type="gramStart"/>
+      <w:r>
+        <w:rPr>
+          <w:rFonts w:ascii="Times New Roman" w:eastAsia="Times New Roman" w:hAnsi="Times New Roman" w:cs="Times New Roman"/>
+          <w:sz w:val="24"/>
+          <w:szCs w:val="24"/>
+        </w:rPr>
+        <w:t>theo</w:t>
+      </w:r>
+      <w:proofErr w:type="spellEnd"/>
+      <w:proofErr w:type="gramEnd"/>
+      <w:r>
+        <w:rPr>
+          <w:rFonts w:ascii="Times New Roman" w:eastAsia="Times New Roman" w:hAnsi="Times New Roman" w:cs="Times New Roman"/>
+          <w:sz w:val="24"/>
+          <w:szCs w:val="24"/>
+        </w:rPr>
+        <w:t>:</w:t>
+      </w:r>
+    </w:p>
+    <w:p>
+      <w:pPr>
+        <w:spacing w:before="100" w:beforeAutospacing="1" w:after="100" w:afterAutospacing="1" w:line="240" w:lineRule="auto"/>
+        <w:rPr>
+          <w:rFonts w:ascii="Times New Roman" w:eastAsia="Times New Roman" w:hAnsi="Times New Roman" w:cs="Times New Roman"/>
+          <w:sz w:val="24"/>
+          <w:szCs w:val="24"/>
+        </w:rPr>
+      </w:pPr>
+      <w:r>
+        <w:rPr>
+          <w:rFonts w:ascii="Segoe UI Symbol" w:eastAsia="Times New Roman" w:hAnsi="Segoe UI Symbol" w:cs="Segoe UI Symbol"/>
+          <w:sz w:val="24"/>
+          <w:szCs w:val="24"/>
+        </w:rPr>
+        <w:t>🔹</w:t>
+      </w:r>
+      <w:r>
+        <w:rPr>
+          <w:rFonts w:ascii="Times New Roman" w:eastAsia="Times New Roman" w:hAnsi="Times New Roman" w:cs="Times New Roman"/>
+          <w:sz w:val="24"/>
+          <w:szCs w:val="24"/>
+        </w:rPr>
+        <w:t xml:space="preserve"> </w:t>
+      </w:r>
+      <w:r>
+        <w:rPr>
+          <w:rFonts w:ascii="Times New Roman" w:eastAsia="Times New Roman" w:hAnsi="Times New Roman" w:cs="Times New Roman"/>
+          <w:b/>
+          <w:bCs/>
+          <w:sz w:val="24"/>
+          <w:szCs w:val="24"/>
+        </w:rPr>
+        <w:t xml:space="preserve">3. </w:t>
+      </w:r>
+      <w:proofErr w:type="spellStart"/>
+      <w:r>
+        <w:rPr>
+          <w:rFonts w:ascii="Times New Roman" w:eastAsia="Times New Roman" w:hAnsi="Times New Roman" w:cs="Times New Roman"/>
+          <w:b/>
+          <w:bCs/>
+          <w:sz w:val="24"/>
+          <w:szCs w:val="24"/>
+        </w:rPr>
+        <w:t>Kết</w:t>
+      </w:r>
+      <w:proofErr w:type="spellEnd"/>
+      <w:r>
+        <w:rPr>
+          <w:rFonts w:ascii="Times New Roman" w:eastAsia="Times New Roman" w:hAnsi="Times New Roman" w:cs="Times New Roman"/>
+          <w:b/>
+          <w:bCs/>
+          <w:sz w:val="24"/>
+          <w:szCs w:val="24"/>
+        </w:rPr>
+        <w:t xml:space="preserve"> </w:t>
+      </w:r>
+      <w:proofErr w:type="spellStart"/>
+      <w:r>
+        <w:rPr>
+          <w:rFonts w:ascii="Times New Roman" w:eastAsia="Times New Roman" w:hAnsi="Times New Roman" w:cs="Times New Roman"/>
+          <w:b/>
+          <w:bCs/>
+          <w:sz w:val="24"/>
+          <w:szCs w:val="24"/>
+        </w:rPr>
+        <w:t>nối</w:t>
+      </w:r>
+      <w:proofErr w:type="spellEnd"/>
+      <w:r>
+        <w:rPr>
+          <w:rFonts w:ascii="Times New Roman" w:eastAsia="Times New Roman" w:hAnsi="Times New Roman" w:cs="Times New Roman"/>
+          <w:b/>
+          <w:bCs/>
+          <w:sz w:val="24"/>
+          <w:szCs w:val="24"/>
+        </w:rPr>
+        <w:t xml:space="preserve"> API </w:t>
+      </w:r>
+      <w:proofErr w:type="spellStart"/>
+      <w:r>
+        <w:rPr>
+          <w:rFonts w:ascii="Times New Roman" w:eastAsia="Times New Roman" w:hAnsi="Times New Roman" w:cs="Times New Roman"/>
+          <w:b/>
+          <w:bCs/>
+          <w:sz w:val="24"/>
+          <w:szCs w:val="24"/>
+        </w:rPr>
+        <w:t>với</w:t>
+      </w:r>
+      <w:proofErr w:type="spellEnd"/>
+      <w:r>
+        <w:rPr>
+          <w:rFonts w:ascii="Times New Roman" w:eastAsia="Times New Roman" w:hAnsi="Times New Roman" w:cs="Times New Roman"/>
+          <w:b/>
+          <w:bCs/>
+          <w:sz w:val="24"/>
+          <w:szCs w:val="24"/>
+        </w:rPr>
+        <w:t xml:space="preserve"> </w:t>
+      </w:r>
+      <w:proofErr w:type="spellStart"/>
+      <w:r>
+        <w:rPr>
+          <w:rFonts w:ascii="Times New Roman" w:eastAsia="Times New Roman" w:hAnsi="Times New Roman" w:cs="Times New Roman"/>
+          <w:b/>
+          <w:bCs/>
+          <w:sz w:val="24"/>
+          <w:szCs w:val="24"/>
+        </w:rPr>
+        <w:t>ứng</w:t>
+      </w:r>
+      <w:proofErr w:type="spellEnd"/>
+      <w:r>
+        <w:rPr>
+          <w:rFonts w:ascii="Times New Roman" w:eastAsia="Times New Roman" w:hAnsi="Times New Roman" w:cs="Times New Roman"/>
+          <w:b/>
+          <w:bCs/>
+          <w:sz w:val="24"/>
+          <w:szCs w:val="24"/>
+        </w:rPr>
+        <w:t xml:space="preserve"> </w:t>
+      </w:r>
+      <w:proofErr w:type="spellStart"/>
+      <w:r>
+        <w:rPr>
+          <w:rFonts w:ascii="Times New Roman" w:eastAsia="Times New Roman" w:hAnsi="Times New Roman" w:cs="Times New Roman"/>
+          <w:b/>
+          <w:bCs/>
+          <w:sz w:val="24"/>
+          <w:szCs w:val="24"/>
+        </w:rPr>
+        <w:t>dụng</w:t>
+      </w:r>
+      <w:proofErr w:type="spellEnd"/>
+      <w:r>
+        <w:rPr>
+          <w:rFonts w:ascii="Times New Roman" w:eastAsia="Times New Roman" w:hAnsi="Times New Roman" w:cs="Times New Roman"/>
+          <w:b/>
+          <w:bCs/>
+          <w:sz w:val="24"/>
+          <w:szCs w:val="24"/>
+        </w:rPr>
+        <w:t xml:space="preserve"> Android</w:t>
+      </w:r>
+    </w:p>
+    <w:p>
+      <w:pPr>
+        <w:numPr>
+          <w:ilvl w:val="0"/>
+          <w:numId w:val="4"/>
+        </w:numPr>
+        <w:spacing w:before="100" w:beforeAutospacing="1" w:after="100" w:afterAutospacing="1" w:line="240" w:lineRule="auto"/>
+        <w:rPr>
+          <w:rFonts w:ascii="Times New Roman" w:eastAsia="Times New Roman" w:hAnsi="Times New Roman" w:cs="Times New Roman"/>
+          <w:sz w:val="24"/>
+          <w:szCs w:val="24"/>
+        </w:rPr>
+      </w:pPr>
+      <w:proofErr w:type="spellStart"/>
+      <w:r>
+        <w:rPr>
+          <w:rFonts w:ascii="Times New Roman" w:eastAsia="Times New Roman" w:hAnsi="Times New Roman" w:cs="Times New Roman"/>
+          <w:sz w:val="24"/>
+          <w:szCs w:val="24"/>
+        </w:rPr>
+        <w:t>Trong</w:t>
+      </w:r>
+      <w:proofErr w:type="spellEnd"/>
+      <w:r>
+        <w:rPr>
+          <w:rFonts w:ascii="Times New Roman" w:eastAsia="Times New Roman" w:hAnsi="Times New Roman" w:cs="Times New Roman"/>
+          <w:sz w:val="24"/>
+          <w:szCs w:val="24"/>
+        </w:rPr>
+        <w:t xml:space="preserve"> Android, </w:t>
+      </w:r>
+      <w:proofErr w:type="spellStart"/>
+      <w:r>
+        <w:rPr>
+          <w:rFonts w:ascii="Times New Roman" w:eastAsia="Times New Roman" w:hAnsi="Times New Roman" w:cs="Times New Roman"/>
+          <w:sz w:val="24"/>
+          <w:szCs w:val="24"/>
+        </w:rPr>
+        <w:t>bạn</w:t>
+      </w:r>
+      <w:proofErr w:type="spellEnd"/>
+      <w:r>
+        <w:rPr>
+          <w:rFonts w:ascii="Times New Roman" w:eastAsia="Times New Roman" w:hAnsi="Times New Roman" w:cs="Times New Roman"/>
+          <w:sz w:val="24"/>
+          <w:szCs w:val="24"/>
+        </w:rPr>
+        <w:t xml:space="preserve"> </w:t>
+      </w:r>
+      <w:proofErr w:type="spellStart"/>
+      <w:r>
+        <w:rPr>
+          <w:rFonts w:ascii="Times New Roman" w:eastAsia="Times New Roman" w:hAnsi="Times New Roman" w:cs="Times New Roman"/>
+          <w:sz w:val="24"/>
+          <w:szCs w:val="24"/>
+        </w:rPr>
+        <w:t>có</w:t>
+      </w:r>
+      <w:proofErr w:type="spellEnd"/>
+      <w:r>
+        <w:rPr>
+          <w:rFonts w:ascii="Times New Roman" w:eastAsia="Times New Roman" w:hAnsi="Times New Roman" w:cs="Times New Roman"/>
+          <w:sz w:val="24"/>
+          <w:szCs w:val="24"/>
+        </w:rPr>
+        <w:t xml:space="preserve"> </w:t>
+      </w:r>
+      <w:proofErr w:type="spellStart"/>
+      <w:r>
+        <w:rPr>
+          <w:rFonts w:ascii="Times New Roman" w:eastAsia="Times New Roman" w:hAnsi="Times New Roman" w:cs="Times New Roman"/>
+          <w:sz w:val="24"/>
+          <w:szCs w:val="24"/>
+        </w:rPr>
+        <w:t>thể</w:t>
+      </w:r>
+      <w:proofErr w:type="spellEnd"/>
+      <w:r>
+        <w:rPr>
+          <w:rFonts w:ascii="Times New Roman" w:eastAsia="Times New Roman" w:hAnsi="Times New Roman" w:cs="Times New Roman"/>
+          <w:sz w:val="24"/>
+          <w:szCs w:val="24"/>
+        </w:rPr>
+        <w:t xml:space="preserve"> </w:t>
+      </w:r>
+      <w:proofErr w:type="spellStart"/>
+      <w:r>
+        <w:rPr>
+          <w:rFonts w:ascii="Times New Roman" w:eastAsia="Times New Roman" w:hAnsi="Times New Roman" w:cs="Times New Roman"/>
+          <w:sz w:val="24"/>
+          <w:szCs w:val="24"/>
+        </w:rPr>
+        <w:t>dùng</w:t>
+      </w:r>
+      <w:proofErr w:type="spellEnd"/>
+      <w:r>
+        <w:rPr>
+          <w:rFonts w:ascii="Times New Roman" w:eastAsia="Times New Roman" w:hAnsi="Times New Roman" w:cs="Times New Roman"/>
+          <w:sz w:val="24"/>
+          <w:szCs w:val="24"/>
+        </w:rPr>
+        <w:t xml:space="preserve"> </w:t>
+      </w:r>
+      <w:r>
+        <w:rPr>
+          <w:rFonts w:ascii="Times New Roman" w:eastAsia="Times New Roman" w:hAnsi="Times New Roman" w:cs="Times New Roman"/>
+          <w:b/>
+          <w:bCs/>
+          <w:sz w:val="24"/>
+          <w:szCs w:val="24"/>
+        </w:rPr>
+        <w:t>Retrofit</w:t>
+      </w:r>
+      <w:r>
+        <w:rPr>
+          <w:rFonts w:ascii="Times New Roman" w:eastAsia="Times New Roman" w:hAnsi="Times New Roman" w:cs="Times New Roman"/>
+          <w:sz w:val="24"/>
+          <w:szCs w:val="24"/>
+        </w:rPr>
+        <w:t xml:space="preserve"> </w:t>
+      </w:r>
+      <w:proofErr w:type="spellStart"/>
+      <w:r>
+        <w:rPr>
+          <w:rFonts w:ascii="Times New Roman" w:eastAsia="Times New Roman" w:hAnsi="Times New Roman" w:cs="Times New Roman"/>
+          <w:sz w:val="24"/>
+          <w:szCs w:val="24"/>
+        </w:rPr>
+        <w:t>hoặc</w:t>
+      </w:r>
+      <w:proofErr w:type="spellEnd"/>
+      <w:r>
+        <w:rPr>
+          <w:rFonts w:ascii="Times New Roman" w:eastAsia="Times New Roman" w:hAnsi="Times New Roman" w:cs="Times New Roman"/>
+          <w:sz w:val="24"/>
+          <w:szCs w:val="24"/>
+        </w:rPr>
+        <w:t xml:space="preserve"> </w:t>
+      </w:r>
+      <w:r>
+        <w:rPr>
+          <w:rFonts w:ascii="Times New Roman" w:eastAsia="Times New Roman" w:hAnsi="Times New Roman" w:cs="Times New Roman"/>
+          <w:b/>
+          <w:bCs/>
+          <w:sz w:val="24"/>
+          <w:szCs w:val="24"/>
+        </w:rPr>
+        <w:t>Volley</w:t>
+      </w:r>
+      <w:r>
+        <w:rPr>
+          <w:rFonts w:ascii="Times New Roman" w:eastAsia="Times New Roman" w:hAnsi="Times New Roman" w:cs="Times New Roman"/>
+          <w:sz w:val="24"/>
+          <w:szCs w:val="24"/>
+        </w:rPr>
+        <w:t xml:space="preserve"> </w:t>
+      </w:r>
+      <w:proofErr w:type="spellStart"/>
+      <w:r>
+        <w:rPr>
+          <w:rFonts w:ascii="Times New Roman" w:eastAsia="Times New Roman" w:hAnsi="Times New Roman" w:cs="Times New Roman"/>
+          <w:sz w:val="24"/>
+          <w:szCs w:val="24"/>
+        </w:rPr>
+        <w:t>để</w:t>
+      </w:r>
+      <w:proofErr w:type="spellEnd"/>
+      <w:r>
+        <w:rPr>
+          <w:rFonts w:ascii="Times New Roman" w:eastAsia="Times New Roman" w:hAnsi="Times New Roman" w:cs="Times New Roman"/>
+          <w:sz w:val="24"/>
+          <w:szCs w:val="24"/>
+        </w:rPr>
+        <w:t xml:space="preserve"> </w:t>
+      </w:r>
+      <w:proofErr w:type="spellStart"/>
+      <w:r>
+        <w:rPr>
+          <w:rFonts w:ascii="Times New Roman" w:eastAsia="Times New Roman" w:hAnsi="Times New Roman" w:cs="Times New Roman"/>
+          <w:sz w:val="24"/>
+          <w:szCs w:val="24"/>
+        </w:rPr>
+        <w:t>gọi</w:t>
+      </w:r>
+      <w:proofErr w:type="spellEnd"/>
+      <w:r>
+        <w:rPr>
+          <w:rFonts w:ascii="Times New Roman" w:eastAsia="Times New Roman" w:hAnsi="Times New Roman" w:cs="Times New Roman"/>
+          <w:sz w:val="24"/>
+          <w:szCs w:val="24"/>
+        </w:rPr>
+        <w:t xml:space="preserve"> API REST </w:t>
+      </w:r>
+      <w:proofErr w:type="spellStart"/>
+      <w:r>
+        <w:rPr>
+          <w:rFonts w:ascii="Times New Roman" w:eastAsia="Times New Roman" w:hAnsi="Times New Roman" w:cs="Times New Roman"/>
+          <w:sz w:val="24"/>
+          <w:szCs w:val="24"/>
+        </w:rPr>
+        <w:t>từ</w:t>
+      </w:r>
+      <w:proofErr w:type="spellEnd"/>
+      <w:r>
+        <w:rPr>
+          <w:rFonts w:ascii="Times New Roman" w:eastAsia="Times New Roman" w:hAnsi="Times New Roman" w:cs="Times New Roman"/>
+          <w:sz w:val="24"/>
+          <w:szCs w:val="24"/>
+        </w:rPr>
+        <w:t xml:space="preserve"> </w:t>
+      </w:r>
+      <w:proofErr w:type="spellStart"/>
+      <w:r>
+        <w:rPr>
+          <w:rFonts w:ascii="Times New Roman" w:eastAsia="Times New Roman" w:hAnsi="Times New Roman" w:cs="Times New Roman"/>
+          <w:sz w:val="24"/>
+          <w:szCs w:val="24"/>
+        </w:rPr>
+        <w:t>ứng</w:t>
+      </w:r>
+      <w:proofErr w:type="spellEnd"/>
+      <w:r>
+        <w:rPr>
+          <w:rFonts w:ascii="Times New Roman" w:eastAsia="Times New Roman" w:hAnsi="Times New Roman" w:cs="Times New Roman"/>
+          <w:sz w:val="24"/>
+          <w:szCs w:val="24"/>
+        </w:rPr>
+        <w:t xml:space="preserve"> </w:t>
+      </w:r>
+      <w:proofErr w:type="spellStart"/>
+      <w:r>
+        <w:rPr>
+          <w:rFonts w:ascii="Times New Roman" w:eastAsia="Times New Roman" w:hAnsi="Times New Roman" w:cs="Times New Roman"/>
+          <w:sz w:val="24"/>
+          <w:szCs w:val="24"/>
+        </w:rPr>
+        <w:t>dụng</w:t>
+      </w:r>
+      <w:proofErr w:type="spellEnd"/>
+      <w:r>
+        <w:rPr>
+          <w:rFonts w:ascii="Times New Roman" w:eastAsia="Times New Roman" w:hAnsi="Times New Roman" w:cs="Times New Roman"/>
+          <w:sz w:val="24"/>
+          <w:szCs w:val="24"/>
+        </w:rPr>
+        <w:t xml:space="preserve"> </w:t>
+      </w:r>
+      <w:proofErr w:type="spellStart"/>
+      <w:r>
+        <w:rPr>
+          <w:rFonts w:ascii="Times New Roman" w:eastAsia="Times New Roman" w:hAnsi="Times New Roman" w:cs="Times New Roman"/>
+          <w:sz w:val="24"/>
+          <w:szCs w:val="24"/>
+        </w:rPr>
+        <w:t>và</w:t>
+      </w:r>
+      <w:proofErr w:type="spellEnd"/>
+      <w:r>
+        <w:rPr>
+          <w:rFonts w:ascii="Times New Roman" w:eastAsia="Times New Roman" w:hAnsi="Times New Roman" w:cs="Times New Roman"/>
+          <w:sz w:val="24"/>
+          <w:szCs w:val="24"/>
+        </w:rPr>
+        <w:t xml:space="preserve"> </w:t>
+      </w:r>
+      <w:proofErr w:type="spellStart"/>
+      <w:r>
+        <w:rPr>
+          <w:rFonts w:ascii="Times New Roman" w:eastAsia="Times New Roman" w:hAnsi="Times New Roman" w:cs="Times New Roman"/>
+          <w:sz w:val="24"/>
+          <w:szCs w:val="24"/>
+        </w:rPr>
+        <w:t>hiển</w:t>
+      </w:r>
+      <w:proofErr w:type="spellEnd"/>
+      <w:r>
+        <w:rPr>
+          <w:rFonts w:ascii="Times New Roman" w:eastAsia="Times New Roman" w:hAnsi="Times New Roman" w:cs="Times New Roman"/>
+          <w:sz w:val="24"/>
+          <w:szCs w:val="24"/>
+        </w:rPr>
+        <w:t xml:space="preserve"> </w:t>
+      </w:r>
+      <w:proofErr w:type="spellStart"/>
+      <w:r>
+        <w:rPr>
+          <w:rFonts w:ascii="Times New Roman" w:eastAsia="Times New Roman" w:hAnsi="Times New Roman" w:cs="Times New Roman"/>
+          <w:sz w:val="24"/>
+          <w:szCs w:val="24"/>
+        </w:rPr>
+        <w:t>thị</w:t>
+      </w:r>
+      <w:proofErr w:type="spellEnd"/>
+      <w:r>
+        <w:rPr>
+          <w:rFonts w:ascii="Times New Roman" w:eastAsia="Times New Roman" w:hAnsi="Times New Roman" w:cs="Times New Roman"/>
+          <w:sz w:val="24"/>
+          <w:szCs w:val="24"/>
+        </w:rPr>
+        <w:t xml:space="preserve"> </w:t>
+      </w:r>
+      <w:proofErr w:type="spellStart"/>
+      <w:r>
+        <w:rPr>
+          <w:rFonts w:ascii="Times New Roman" w:eastAsia="Times New Roman" w:hAnsi="Times New Roman" w:cs="Times New Roman"/>
+          <w:sz w:val="24"/>
+          <w:szCs w:val="24"/>
+        </w:rPr>
+        <w:t>dữ</w:t>
+      </w:r>
+      <w:proofErr w:type="spellEnd"/>
+      <w:r>
+        <w:rPr>
+          <w:rFonts w:ascii="Times New Roman" w:eastAsia="Times New Roman" w:hAnsi="Times New Roman" w:cs="Times New Roman"/>
+          <w:sz w:val="24"/>
+          <w:szCs w:val="24"/>
+        </w:rPr>
+        <w:t xml:space="preserve"> </w:t>
+      </w:r>
+      <w:proofErr w:type="spellStart"/>
+      <w:r>
+        <w:rPr>
+          <w:rFonts w:ascii="Times New Roman" w:eastAsia="Times New Roman" w:hAnsi="Times New Roman" w:cs="Times New Roman"/>
+          <w:sz w:val="24"/>
+          <w:szCs w:val="24"/>
+        </w:rPr>
+        <w:t>liệu</w:t>
+      </w:r>
+      <w:proofErr w:type="spellEnd"/>
+      <w:r>
+        <w:rPr>
+          <w:rFonts w:ascii="Times New Roman" w:eastAsia="Times New Roman" w:hAnsi="Times New Roman" w:cs="Times New Roman"/>
+          <w:sz w:val="24"/>
+          <w:szCs w:val="24"/>
+        </w:rPr>
+        <w:t>.</w:t>
+      </w:r>
+    </w:p>
+    <w:p>
+      <w:pPr>
+        <w:numPr>
+          <w:ilvl w:val="0"/>
+          <w:numId w:val="4"/>
+        </w:numPr>
+        <w:spacing w:before="100" w:beforeAutospacing="1" w:after="100" w:afterAutospacing="1" w:line="240" w:lineRule="auto"/>
+        <w:rPr>
+          <w:rFonts w:ascii="Times New Roman" w:eastAsia="Times New Roman" w:hAnsi="Times New Roman" w:cs="Times New Roman"/>
+          <w:sz w:val="24"/>
+          <w:szCs w:val="24"/>
+        </w:rPr>
+      </w:pPr>
+      <w:proofErr w:type="spellStart"/>
+      <w:r>
+        <w:rPr>
+          <w:rFonts w:ascii="Times New Roman" w:eastAsia="Times New Roman" w:hAnsi="Times New Roman" w:cs="Times New Roman"/>
+          <w:sz w:val="24"/>
+          <w:szCs w:val="24"/>
+        </w:rPr>
+        <w:t>Ví</w:t>
+      </w:r>
+      <w:proofErr w:type="spellEnd"/>
+      <w:r>
+        <w:rPr>
+          <w:rFonts w:ascii="Times New Roman" w:eastAsia="Times New Roman" w:hAnsi="Times New Roman" w:cs="Times New Roman"/>
+          <w:sz w:val="24"/>
+          <w:szCs w:val="24"/>
+        </w:rPr>
+        <w:t xml:space="preserve"> </w:t>
+      </w:r>
+      <w:proofErr w:type="spellStart"/>
+      <w:r>
+        <w:rPr>
+          <w:rFonts w:ascii="Times New Roman" w:eastAsia="Times New Roman" w:hAnsi="Times New Roman" w:cs="Times New Roman"/>
+          <w:sz w:val="24"/>
+          <w:szCs w:val="24"/>
+        </w:rPr>
+        <w:t>dụ</w:t>
+      </w:r>
+      <w:proofErr w:type="spellEnd"/>
+      <w:r>
+        <w:rPr>
+          <w:rFonts w:ascii="Times New Roman" w:eastAsia="Times New Roman" w:hAnsi="Times New Roman" w:cs="Times New Roman"/>
+          <w:sz w:val="24"/>
+          <w:szCs w:val="24"/>
+        </w:rPr>
+        <w:t xml:space="preserve"> </w:t>
+      </w:r>
+      <w:proofErr w:type="spellStart"/>
+      <w:r>
+        <w:rPr>
+          <w:rFonts w:ascii="Times New Roman" w:eastAsia="Times New Roman" w:hAnsi="Times New Roman" w:cs="Times New Roman"/>
+          <w:sz w:val="24"/>
+          <w:szCs w:val="24"/>
+        </w:rPr>
+        <w:t>sử</w:t>
+      </w:r>
+      <w:proofErr w:type="spellEnd"/>
+      <w:r>
+        <w:rPr>
+          <w:rFonts w:ascii="Times New Roman" w:eastAsia="Times New Roman" w:hAnsi="Times New Roman" w:cs="Times New Roman"/>
+          <w:sz w:val="24"/>
+          <w:szCs w:val="24"/>
+        </w:rPr>
+        <w:t xml:space="preserve"> </w:t>
+      </w:r>
+      <w:proofErr w:type="spellStart"/>
+      <w:r>
+        <w:rPr>
+          <w:rFonts w:ascii="Times New Roman" w:eastAsia="Times New Roman" w:hAnsi="Times New Roman" w:cs="Times New Roman"/>
+          <w:sz w:val="24"/>
+          <w:szCs w:val="24"/>
+        </w:rPr>
+        <w:t>dụng</w:t>
+      </w:r>
+      <w:proofErr w:type="spellEnd"/>
+      <w:r>
+        <w:rPr>
+          <w:rFonts w:ascii="Times New Roman" w:eastAsia="Times New Roman" w:hAnsi="Times New Roman" w:cs="Times New Roman"/>
+          <w:sz w:val="24"/>
+          <w:szCs w:val="24"/>
+        </w:rPr>
+        <w:t xml:space="preserve"> Retrofit </w:t>
+      </w:r>
+      <w:proofErr w:type="spellStart"/>
+      <w:r>
+        <w:rPr>
+          <w:rFonts w:ascii="Times New Roman" w:eastAsia="Times New Roman" w:hAnsi="Times New Roman" w:cs="Times New Roman"/>
+          <w:sz w:val="24"/>
+          <w:szCs w:val="24"/>
+        </w:rPr>
+        <w:t>để</w:t>
+      </w:r>
+      <w:proofErr w:type="spellEnd"/>
+      <w:r>
+        <w:rPr>
+          <w:rFonts w:ascii="Times New Roman" w:eastAsia="Times New Roman" w:hAnsi="Times New Roman" w:cs="Times New Roman"/>
+          <w:sz w:val="24"/>
+          <w:szCs w:val="24"/>
+        </w:rPr>
+        <w:t xml:space="preserve"> </w:t>
+      </w:r>
+      <w:proofErr w:type="spellStart"/>
+      <w:r>
+        <w:rPr>
+          <w:rFonts w:ascii="Times New Roman" w:eastAsia="Times New Roman" w:hAnsi="Times New Roman" w:cs="Times New Roman"/>
+          <w:sz w:val="24"/>
+          <w:szCs w:val="24"/>
+        </w:rPr>
+        <w:t>lấy</w:t>
+      </w:r>
+      <w:proofErr w:type="spellEnd"/>
+      <w:r>
+        <w:rPr>
+          <w:rFonts w:ascii="Times New Roman" w:eastAsia="Times New Roman" w:hAnsi="Times New Roman" w:cs="Times New Roman"/>
+          <w:sz w:val="24"/>
+          <w:szCs w:val="24"/>
+        </w:rPr>
+        <w:t xml:space="preserve"> </w:t>
+      </w:r>
+      <w:proofErr w:type="spellStart"/>
+      <w:r>
+        <w:rPr>
+          <w:rFonts w:ascii="Times New Roman" w:eastAsia="Times New Roman" w:hAnsi="Times New Roman" w:cs="Times New Roman"/>
+          <w:sz w:val="24"/>
+          <w:szCs w:val="24"/>
+        </w:rPr>
+        <w:t>danh</w:t>
+      </w:r>
+      <w:proofErr w:type="spellEnd"/>
+      <w:r>
+        <w:rPr>
+          <w:rFonts w:ascii="Times New Roman" w:eastAsia="Times New Roman" w:hAnsi="Times New Roman" w:cs="Times New Roman"/>
+          <w:sz w:val="24"/>
+          <w:szCs w:val="24"/>
+        </w:rPr>
+        <w:t xml:space="preserve"> </w:t>
+      </w:r>
+      <w:proofErr w:type="spellStart"/>
+      <w:r>
+        <w:rPr>
+          <w:rFonts w:ascii="Times New Roman" w:eastAsia="Times New Roman" w:hAnsi="Times New Roman" w:cs="Times New Roman"/>
+          <w:sz w:val="24"/>
+          <w:szCs w:val="24"/>
+        </w:rPr>
+        <w:t>sách</w:t>
+      </w:r>
+      <w:proofErr w:type="spellEnd"/>
+      <w:r>
+        <w:rPr>
+          <w:rFonts w:ascii="Times New Roman" w:eastAsia="Times New Roman" w:hAnsi="Times New Roman" w:cs="Times New Roman"/>
+          <w:sz w:val="24"/>
+          <w:szCs w:val="24"/>
+        </w:rPr>
+        <w:t xml:space="preserve"> user:</w:t>
+      </w:r>
+    </w:p>
+    <w:p>
+      <w:pPr>
+        <w:spacing w:before="100" w:beforeAutospacing="1" w:after="100" w:afterAutospacing="1" w:line="240" w:lineRule="auto"/>
+        <w:ind w:left="720"/>
+        <w:rPr>
+          <w:rFonts w:ascii="Times New Roman" w:eastAsia="Times New Roman" w:hAnsi="Times New Roman" w:cs="Times New Roman"/>
+          <w:sz w:val="24"/>
+          <w:szCs w:val="24"/>
+        </w:rPr>
+      </w:pPr>
+      <w:proofErr w:type="spellStart"/>
+      <w:r>
+        <w:rPr>
+          <w:rFonts w:ascii="Times New Roman" w:eastAsia="Times New Roman" w:hAnsi="Times New Roman" w:cs="Times New Roman"/>
+          <w:sz w:val="24"/>
+          <w:szCs w:val="24"/>
+        </w:rPr>
+        <w:t>ApiService</w:t>
+      </w:r>
+      <w:proofErr w:type="spellEnd"/>
+      <w:r>
+        <w:rPr>
+          <w:rFonts w:ascii="Times New Roman" w:eastAsia="Times New Roman" w:hAnsi="Times New Roman" w:cs="Times New Roman"/>
+          <w:sz w:val="24"/>
+          <w:szCs w:val="24"/>
+        </w:rPr>
+        <w:t xml:space="preserve"> </w:t>
+      </w:r>
+      <w:proofErr w:type="spellStart"/>
+      <w:r>
+        <w:rPr>
+          <w:rFonts w:ascii="Times New Roman" w:eastAsia="Times New Roman" w:hAnsi="Times New Roman" w:cs="Times New Roman"/>
+          <w:sz w:val="24"/>
+          <w:szCs w:val="24"/>
+        </w:rPr>
+        <w:t>apiService</w:t>
+      </w:r>
+      <w:proofErr w:type="spellEnd"/>
+      <w:r>
+        <w:rPr>
+          <w:rFonts w:ascii="Times New Roman" w:eastAsia="Times New Roman" w:hAnsi="Times New Roman" w:cs="Times New Roman"/>
+          <w:sz w:val="24"/>
+          <w:szCs w:val="24"/>
+        </w:rPr>
+        <w:t xml:space="preserve"> = </w:t>
+      </w:r>
+      <w:proofErr w:type="spellStart"/>
+      <w:r>
+        <w:rPr>
+          <w:rFonts w:ascii="Times New Roman" w:eastAsia="Times New Roman" w:hAnsi="Times New Roman" w:cs="Times New Roman"/>
+          <w:sz w:val="24"/>
+          <w:szCs w:val="24"/>
+        </w:rPr>
+        <w:t>RetrofitClient.getClient</w:t>
+      </w:r>
+      <w:proofErr w:type="spellEnd"/>
+      <w:r>
+        <w:rPr>
+          <w:rFonts w:ascii="Times New Roman" w:eastAsia="Times New Roman" w:hAnsi="Times New Roman" w:cs="Times New Roman"/>
+          <w:sz w:val="24"/>
+          <w:szCs w:val="24"/>
+        </w:rPr>
+        <w:t>().create(</w:t>
+      </w:r>
+      <w:proofErr w:type="spellStart"/>
+      <w:r>
+        <w:rPr>
+          <w:rFonts w:ascii="Times New Roman" w:eastAsia="Times New Roman" w:hAnsi="Times New Roman" w:cs="Times New Roman"/>
+          <w:sz w:val="24"/>
+          <w:szCs w:val="24"/>
+        </w:rPr>
+        <w:t>ApiService.class</w:t>
+      </w:r>
+      <w:proofErr w:type="spellEnd"/>
+      <w:r>
+        <w:rPr>
+          <w:rFonts w:ascii="Times New Roman" w:eastAsia="Times New Roman" w:hAnsi="Times New Roman" w:cs="Times New Roman"/>
+          <w:sz w:val="24"/>
+          <w:szCs w:val="24"/>
+        </w:rPr>
+        <w:t xml:space="preserve">); Call&lt;List&gt; call = </w:t>
+      </w:r>
+      <w:proofErr w:type="spellStart"/>
+      <w:r>
+        <w:rPr>
+          <w:rFonts w:ascii="Times New Roman" w:eastAsia="Times New Roman" w:hAnsi="Times New Roman" w:cs="Times New Roman"/>
+          <w:sz w:val="24"/>
+          <w:szCs w:val="24"/>
+        </w:rPr>
+        <w:t>apiService.getUsers</w:t>
+      </w:r>
+      <w:proofErr w:type="spellEnd"/>
+      <w:r>
+        <w:rPr>
+          <w:rFonts w:ascii="Times New Roman" w:eastAsia="Times New Roman" w:hAnsi="Times New Roman" w:cs="Times New Roman"/>
+          <w:sz w:val="24"/>
+          <w:szCs w:val="24"/>
+        </w:rPr>
+        <w:t xml:space="preserve">(); </w:t>
+      </w:r>
+      <w:proofErr w:type="spellStart"/>
+      <w:r>
+        <w:rPr>
+          <w:rFonts w:ascii="Times New Roman" w:eastAsia="Times New Roman" w:hAnsi="Times New Roman" w:cs="Times New Roman"/>
+          <w:sz w:val="24"/>
+          <w:szCs w:val="24"/>
+        </w:rPr>
+        <w:t>call.enqueue</w:t>
+      </w:r>
+      <w:proofErr w:type="spellEnd"/>
+      <w:r>
+        <w:rPr>
+          <w:rFonts w:ascii="Times New Roman" w:eastAsia="Times New Roman" w:hAnsi="Times New Roman" w:cs="Times New Roman"/>
+          <w:sz w:val="24"/>
+          <w:szCs w:val="24"/>
+        </w:rPr>
+        <w:t xml:space="preserve">(new Callback&lt;List&gt;() { @Override public void </w:t>
+      </w:r>
+      <w:proofErr w:type="spellStart"/>
+      <w:r>
+        <w:rPr>
+          <w:rFonts w:ascii="Times New Roman" w:eastAsia="Times New Roman" w:hAnsi="Times New Roman" w:cs="Times New Roman"/>
+          <w:sz w:val="24"/>
+          <w:szCs w:val="24"/>
+        </w:rPr>
+        <w:t>onResponse</w:t>
+      </w:r>
+      <w:proofErr w:type="spellEnd"/>
+      <w:r>
+        <w:rPr>
+          <w:rFonts w:ascii="Times New Roman" w:eastAsia="Times New Roman" w:hAnsi="Times New Roman" w:cs="Times New Roman"/>
+          <w:sz w:val="24"/>
+          <w:szCs w:val="24"/>
+        </w:rPr>
+        <w:t xml:space="preserve">(Call&lt;List&gt; call, Response&lt;List&gt; response) { List users = </w:t>
+      </w:r>
+      <w:proofErr w:type="spellStart"/>
+      <w:r>
+        <w:rPr>
+          <w:rFonts w:ascii="Times New Roman" w:eastAsia="Times New Roman" w:hAnsi="Times New Roman" w:cs="Times New Roman"/>
+          <w:sz w:val="24"/>
+          <w:szCs w:val="24"/>
+        </w:rPr>
+        <w:t>response.body</w:t>
+      </w:r>
+      <w:proofErr w:type="spellEnd"/>
+      <w:r>
+        <w:rPr>
+          <w:rFonts w:ascii="Times New Roman" w:eastAsia="Times New Roman" w:hAnsi="Times New Roman" w:cs="Times New Roman"/>
+          <w:sz w:val="24"/>
+          <w:szCs w:val="24"/>
+        </w:rPr>
+        <w:t xml:space="preserve">(); // </w:t>
+      </w:r>
+      <w:proofErr w:type="spellStart"/>
+      <w:r>
+        <w:rPr>
+          <w:rFonts w:ascii="Times New Roman" w:eastAsia="Times New Roman" w:hAnsi="Times New Roman" w:cs="Times New Roman"/>
+          <w:sz w:val="24"/>
+          <w:szCs w:val="24"/>
+        </w:rPr>
+        <w:t>Hiển</w:t>
+      </w:r>
+      <w:proofErr w:type="spellEnd"/>
+      <w:r>
+        <w:rPr>
+          <w:rFonts w:ascii="Times New Roman" w:eastAsia="Times New Roman" w:hAnsi="Times New Roman" w:cs="Times New Roman"/>
+          <w:sz w:val="24"/>
+          <w:szCs w:val="24"/>
+        </w:rPr>
+        <w:t xml:space="preserve"> </w:t>
+      </w:r>
+      <w:proofErr w:type="spellStart"/>
+      <w:r>
+        <w:rPr>
+          <w:rFonts w:ascii="Times New Roman" w:eastAsia="Times New Roman" w:hAnsi="Times New Roman" w:cs="Times New Roman"/>
+          <w:sz w:val="24"/>
+          <w:szCs w:val="24"/>
+        </w:rPr>
+        <w:t>thị</w:t>
+      </w:r>
+      <w:proofErr w:type="spellEnd"/>
+      <w:r>
+        <w:rPr>
+          <w:rFonts w:ascii="Times New Roman" w:eastAsia="Times New Roman" w:hAnsi="Times New Roman" w:cs="Times New Roman"/>
+          <w:sz w:val="24"/>
+          <w:szCs w:val="24"/>
+        </w:rPr>
+        <w:t xml:space="preserve"> </w:t>
+      </w:r>
+      <w:proofErr w:type="spellStart"/>
+      <w:r>
+        <w:rPr>
+          <w:rFonts w:ascii="Times New Roman" w:eastAsia="Times New Roman" w:hAnsi="Times New Roman" w:cs="Times New Roman"/>
+          <w:sz w:val="24"/>
+          <w:szCs w:val="24"/>
+        </w:rPr>
+        <w:t>dữ</w:t>
+      </w:r>
+      <w:proofErr w:type="spellEnd"/>
+      <w:r>
+        <w:rPr>
+          <w:rFonts w:ascii="Times New Roman" w:eastAsia="Times New Roman" w:hAnsi="Times New Roman" w:cs="Times New Roman"/>
+          <w:sz w:val="24"/>
+          <w:szCs w:val="24"/>
+        </w:rPr>
+        <w:t xml:space="preserve"> </w:t>
+      </w:r>
+      <w:proofErr w:type="spellStart"/>
+      <w:r>
+        <w:rPr>
+          <w:rFonts w:ascii="Times New Roman" w:eastAsia="Times New Roman" w:hAnsi="Times New Roman" w:cs="Times New Roman"/>
+          <w:sz w:val="24"/>
+          <w:szCs w:val="24"/>
+        </w:rPr>
+        <w:t>liệu</w:t>
+      </w:r>
+      <w:proofErr w:type="spellEnd"/>
+      <w:r>
+        <w:rPr>
+          <w:rFonts w:ascii="Times New Roman" w:eastAsia="Times New Roman" w:hAnsi="Times New Roman" w:cs="Times New Roman"/>
+          <w:sz w:val="24"/>
+          <w:szCs w:val="24"/>
+        </w:rPr>
+        <w:t xml:space="preserve"> </w:t>
+      </w:r>
+      <w:proofErr w:type="spellStart"/>
+      <w:r>
+        <w:rPr>
+          <w:rFonts w:ascii="Times New Roman" w:eastAsia="Times New Roman" w:hAnsi="Times New Roman" w:cs="Times New Roman"/>
+          <w:sz w:val="24"/>
+          <w:szCs w:val="24"/>
+        </w:rPr>
+        <w:t>trên</w:t>
+      </w:r>
+      <w:proofErr w:type="spellEnd"/>
+      <w:r>
+        <w:rPr>
+          <w:rFonts w:ascii="Times New Roman" w:eastAsia="Times New Roman" w:hAnsi="Times New Roman" w:cs="Times New Roman"/>
+          <w:sz w:val="24"/>
+          <w:szCs w:val="24"/>
+        </w:rPr>
+        <w:t xml:space="preserve"> </w:t>
+      </w:r>
+      <w:proofErr w:type="spellStart"/>
+      <w:r>
+        <w:rPr>
+          <w:rFonts w:ascii="Times New Roman" w:eastAsia="Times New Roman" w:hAnsi="Times New Roman" w:cs="Times New Roman"/>
+          <w:sz w:val="24"/>
+          <w:szCs w:val="24"/>
+        </w:rPr>
+        <w:t>RecyclerView</w:t>
+      </w:r>
+      <w:proofErr w:type="spellEnd"/>
+      <w:r>
+        <w:rPr>
+          <w:rFonts w:ascii="Times New Roman" w:eastAsia="Times New Roman" w:hAnsi="Times New Roman" w:cs="Times New Roman"/>
+          <w:sz w:val="24"/>
+          <w:szCs w:val="24"/>
+        </w:rPr>
+        <w:t xml:space="preserve"> } @Override public void </w:t>
+      </w:r>
+      <w:proofErr w:type="spellStart"/>
+      <w:r>
+        <w:rPr>
+          <w:rFonts w:ascii="Times New Roman" w:eastAsia="Times New Roman" w:hAnsi="Times New Roman" w:cs="Times New Roman"/>
+          <w:sz w:val="24"/>
+          <w:szCs w:val="24"/>
+        </w:rPr>
+        <w:t>onFailure</w:t>
+      </w:r>
+      <w:proofErr w:type="spellEnd"/>
+      <w:r>
+        <w:rPr>
+          <w:rFonts w:ascii="Times New Roman" w:eastAsia="Times New Roman" w:hAnsi="Times New Roman" w:cs="Times New Roman"/>
+          <w:sz w:val="24"/>
+          <w:szCs w:val="24"/>
+        </w:rPr>
+        <w:t xml:space="preserve">(Call&lt;List&gt; call, </w:t>
+      </w:r>
+      <w:proofErr w:type="spellStart"/>
+      <w:r>
+        <w:rPr>
+          <w:rFonts w:ascii="Times New Roman" w:eastAsia="Times New Roman" w:hAnsi="Times New Roman" w:cs="Times New Roman"/>
+          <w:sz w:val="24"/>
+          <w:szCs w:val="24"/>
+        </w:rPr>
+        <w:t>Throwable</w:t>
+      </w:r>
+      <w:proofErr w:type="spellEnd"/>
+      <w:r>
+        <w:rPr>
+          <w:rFonts w:ascii="Times New Roman" w:eastAsia="Times New Roman" w:hAnsi="Times New Roman" w:cs="Times New Roman"/>
+          <w:sz w:val="24"/>
+          <w:szCs w:val="24"/>
+        </w:rPr>
+        <w:t xml:space="preserve"> t) { </w:t>
+      </w:r>
+      <w:proofErr w:type="spellStart"/>
+      <w:r>
+        <w:rPr>
+          <w:rFonts w:ascii="Times New Roman" w:eastAsia="Times New Roman" w:hAnsi="Times New Roman" w:cs="Times New Roman"/>
+          <w:sz w:val="24"/>
+          <w:szCs w:val="24"/>
+        </w:rPr>
+        <w:t>Log.e</w:t>
+      </w:r>
+      <w:proofErr w:type="spellEnd"/>
+      <w:r>
+        <w:rPr>
+          <w:rFonts w:ascii="Times New Roman" w:eastAsia="Times New Roman" w:hAnsi="Times New Roman" w:cs="Times New Roman"/>
+          <w:sz w:val="24"/>
+          <w:szCs w:val="24"/>
+        </w:rPr>
+        <w:t xml:space="preserve">("API Error", </w:t>
+      </w:r>
+      <w:proofErr w:type="spellStart"/>
+      <w:r>
+        <w:rPr>
+          <w:rFonts w:ascii="Times New Roman" w:eastAsia="Times New Roman" w:hAnsi="Times New Roman" w:cs="Times New Roman"/>
+          <w:sz w:val="24"/>
+          <w:szCs w:val="24"/>
+        </w:rPr>
+        <w:t>t.getMessage</w:t>
+      </w:r>
+      <w:proofErr w:type="spellEnd"/>
+      <w:r>
+        <w:rPr>
+          <w:rFonts w:ascii="Times New Roman" w:eastAsia="Times New Roman" w:hAnsi="Times New Roman" w:cs="Times New Roman"/>
+          <w:sz w:val="24"/>
+          <w:szCs w:val="24"/>
+        </w:rPr>
+        <w:t xml:space="preserve">()); } }); </w:t>
+      </w:r>
+    </w:p>
+    <w:p>
+      <w:pPr>
+        <w:spacing w:before="100" w:beforeAutospacing="1" w:after="100" w:afterAutospacing="1" w:line="240" w:lineRule="auto"/>
+        <w:rPr>
+          <w:rFonts w:ascii="Times New Roman" w:eastAsia="Times New Roman" w:hAnsi="Times New Roman" w:cs="Times New Roman"/>
+          <w:sz w:val="24"/>
+          <w:szCs w:val="24"/>
+        </w:rPr>
+      </w:pPr>
+      <w:r>
+        <w:rPr>
+          <w:rFonts w:ascii="Times New Roman" w:eastAsia="Times New Roman" w:hAnsi="Times New Roman" w:cs="Times New Roman"/>
+          <w:sz w:val="24"/>
+          <w:szCs w:val="24"/>
+        </w:rPr>
+        <w:t>-</w:t>
+      </w:r>
+      <w:proofErr w:type="spellStart"/>
+      <w:r>
+        <w:rPr>
+          <w:rFonts w:ascii="Times New Roman" w:eastAsia="Times New Roman" w:hAnsi="Times New Roman" w:cs="Times New Roman"/>
+          <w:sz w:val="24"/>
+          <w:szCs w:val="24"/>
+        </w:rPr>
+        <w:t>Triển</w:t>
+      </w:r>
+      <w:proofErr w:type="spellEnd"/>
+      <w:r>
+        <w:rPr>
+          <w:rFonts w:ascii="Times New Roman" w:eastAsia="Times New Roman" w:hAnsi="Times New Roman" w:cs="Times New Roman"/>
+          <w:sz w:val="24"/>
+          <w:szCs w:val="24"/>
+        </w:rPr>
+        <w:t xml:space="preserve"> </w:t>
+      </w:r>
+      <w:proofErr w:type="spellStart"/>
+      <w:r>
+        <w:rPr>
+          <w:rFonts w:ascii="Times New Roman" w:eastAsia="Times New Roman" w:hAnsi="Times New Roman" w:cs="Times New Roman"/>
+          <w:sz w:val="24"/>
+          <w:szCs w:val="24"/>
+        </w:rPr>
+        <w:t>khai</w:t>
+      </w:r>
+      <w:proofErr w:type="spellEnd"/>
+      <w:r>
+        <w:rPr>
+          <w:rFonts w:ascii="Times New Roman" w:eastAsia="Times New Roman" w:hAnsi="Times New Roman" w:cs="Times New Roman"/>
+          <w:sz w:val="24"/>
+          <w:szCs w:val="24"/>
+        </w:rPr>
+        <w:t xml:space="preserve"> web admin </w:t>
+      </w:r>
+      <w:proofErr w:type="spellStart"/>
+      <w:r>
+        <w:rPr>
+          <w:rFonts w:ascii="Times New Roman" w:eastAsia="Times New Roman" w:hAnsi="Times New Roman" w:cs="Times New Roman"/>
+          <w:sz w:val="24"/>
+          <w:szCs w:val="24"/>
+        </w:rPr>
+        <w:t>lên</w:t>
+      </w:r>
+      <w:proofErr w:type="spellEnd"/>
+      <w:r>
+        <w:rPr>
+          <w:rFonts w:ascii="Times New Roman" w:eastAsia="Times New Roman" w:hAnsi="Times New Roman" w:cs="Times New Roman"/>
+          <w:sz w:val="24"/>
+          <w:szCs w:val="24"/>
+        </w:rPr>
+        <w:t xml:space="preserve"> internet: AWS,  </w:t>
+      </w:r>
+      <w:proofErr w:type="spellStart"/>
+      <w:r>
+        <w:rPr>
+          <w:rFonts w:ascii="Times New Roman" w:eastAsia="Times New Roman" w:hAnsi="Times New Roman" w:cs="Times New Roman"/>
+          <w:sz w:val="24"/>
+          <w:szCs w:val="24"/>
+        </w:rPr>
+        <w:t>Heroku</w:t>
+      </w:r>
+      <w:proofErr w:type="spellEnd"/>
+      <w:r>
+        <w:rPr>
+          <w:rFonts w:ascii="Times New Roman" w:eastAsia="Times New Roman" w:hAnsi="Times New Roman" w:cs="Times New Roman"/>
+          <w:sz w:val="24"/>
+          <w:szCs w:val="24"/>
+        </w:rPr>
+        <w:t>, Digital Ocean, Railway.app</w:t>
+      </w:r>
     </w:p>
     <w:sectPr>
       <w:pgSz w:w="12240" w:h="15840"/>
@@ -5762,8 +7714,306 @@
 </file>
 
 <file path=word/numbering.xml><?xml version="1.0" encoding="utf-8"?>
-<w:numbering xmlns:wpc="http://schemas.microsoft.com/office/word/2010/wordprocessingCanvas" xmlns:cx="http://schemas.microsoft.com/office/drawing/2014/chartex" xmlns:mc="http://schemas.openxmlformats.org/markup-compatibility/2006" xmlns:o="urn:schemas-microsoft-com:office:office" xmlns:r="http://schemas.openxmlformats.org/officeDocument/2006/relationships" xmlns:m="http://schemas.openxmlformats.org/officeDocument/2006/math" xmlns:v="urn:schemas-microsoft-com:vml" xmlns:wp14="http://schemas.microsoft.com/office/word/2010/wordprocessingDrawing" xmlns:wp="http://schemas.openxmlformats.org/drawingml/2006/wordprocessingDrawing" xmlns:w10="urn:schemas-microsoft-com:office:word" xmlns:w="http://schemas.openxmlformats.org/wordprocessingml/2006/main" xmlns:w14="http://schemas.microsoft.com/office/word/2010/wordml" xmlns:w15="http://schemas.microsoft.com/office/word/2012/wordml" xmlns:w16se="http://schemas.microsoft.com/office/word/2015/wordml/symex" xmlns:wpg="http://schemas.microsoft.com/office/word/2010/wordprocessingGroup" xmlns:wpi="http://schemas.microsoft.com/office/word/2010/wordprocessingInk" xmlns:wne="http://schemas.microsoft.com/office/word/2006/wordml" xmlns:wps="http://schemas.microsoft.com/office/word/2010/wordprocessingShape" mc:Ignorable="w14 w15 w16se wp14">
-  <w:abstractNum w:abstractNumId="0" w15:restartNumberingAfterBreak="0">
+<w:numbering xmlns:wpc="http://schemas.microsoft.com/office/word/2010/wordprocessingCanvas" xmlns:mc="http://schemas.openxmlformats.org/markup-compatibility/2006" xmlns:o="urn:schemas-microsoft-com:office:office" xmlns:r="http://schemas.openxmlformats.org/officeDocument/2006/relationships" xmlns:m="http://schemas.openxmlformats.org/officeDocument/2006/math" xmlns:v="urn:schemas-microsoft-com:vml" xmlns:wp14="http://schemas.microsoft.com/office/word/2010/wordprocessingDrawing" xmlns:wp="http://schemas.openxmlformats.org/drawingml/2006/wordprocessingDrawing" xmlns:w10="urn:schemas-microsoft-com:office:word" xmlns:w="http://schemas.openxmlformats.org/wordprocessingml/2006/main" xmlns:w14="http://schemas.microsoft.com/office/word/2010/wordml" xmlns:w15="http://schemas.microsoft.com/office/word/2012/wordml" xmlns:wpg="http://schemas.microsoft.com/office/word/2010/wordprocessingGroup" xmlns:wpi="http://schemas.microsoft.com/office/word/2010/wordprocessingInk" xmlns:wne="http://schemas.microsoft.com/office/word/2006/wordml" xmlns:wps="http://schemas.microsoft.com/office/word/2010/wordprocessingShape" mc:Ignorable="w14 w15 wp14">
+  <w:abstractNum w:abstractNumId="0">
+    <w:nsid w:val="153F3EBC"/>
+    <w:multiLevelType w:val="multilevel"/>
+    <w:tmpl w:val="F7A038EA"/>
+    <w:lvl w:ilvl="0">
+      <w:start w:val="1"/>
+      <w:numFmt w:val="bullet"/>
+      <w:lvlText w:val=""/>
+      <w:lvlJc w:val="left"/>
+      <w:pPr>
+        <w:tabs>
+          <w:tab w:val="num" w:pos="720"/>
+        </w:tabs>
+        <w:ind w:left="720" w:hanging="360"/>
+      </w:pPr>
+      <w:rPr>
+        <w:rFonts w:ascii="Symbol" w:hAnsi="Symbol" w:hint="default"/>
+        <w:sz w:val="20"/>
+      </w:rPr>
+    </w:lvl>
+    <w:lvl w:ilvl="1" w:tentative="1">
+      <w:start w:val="1"/>
+      <w:numFmt w:val="bullet"/>
+      <w:lvlText w:val="o"/>
+      <w:lvlJc w:val="left"/>
+      <w:pPr>
+        <w:tabs>
+          <w:tab w:val="num" w:pos="1440"/>
+        </w:tabs>
+        <w:ind w:left="1440" w:hanging="360"/>
+      </w:pPr>
+      <w:rPr>
+        <w:rFonts w:ascii="Courier New" w:hAnsi="Courier New" w:hint="default"/>
+        <w:sz w:val="20"/>
+      </w:rPr>
+    </w:lvl>
+    <w:lvl w:ilvl="2" w:tentative="1">
+      <w:start w:val="1"/>
+      <w:numFmt w:val="bullet"/>
+      <w:lvlText w:val=""/>
+      <w:lvlJc w:val="left"/>
+      <w:pPr>
+        <w:tabs>
+          <w:tab w:val="num" w:pos="2160"/>
+        </w:tabs>
+        <w:ind w:left="2160" w:hanging="360"/>
+      </w:pPr>
+      <w:rPr>
+        <w:rFonts w:ascii="Wingdings" w:hAnsi="Wingdings" w:hint="default"/>
+        <w:sz w:val="20"/>
+      </w:rPr>
+    </w:lvl>
+    <w:lvl w:ilvl="3" w:tentative="1">
+      <w:start w:val="1"/>
+      <w:numFmt w:val="bullet"/>
+      <w:lvlText w:val=""/>
+      <w:lvlJc w:val="left"/>
+      <w:pPr>
+        <w:tabs>
+          <w:tab w:val="num" w:pos="2880"/>
+        </w:tabs>
+        <w:ind w:left="2880" w:hanging="360"/>
+      </w:pPr>
+      <w:rPr>
+        <w:rFonts w:ascii="Wingdings" w:hAnsi="Wingdings" w:hint="default"/>
+        <w:sz w:val="20"/>
+      </w:rPr>
+    </w:lvl>
+    <w:lvl w:ilvl="4" w:tentative="1">
+      <w:start w:val="1"/>
+      <w:numFmt w:val="bullet"/>
+      <w:lvlText w:val=""/>
+      <w:lvlJc w:val="left"/>
+      <w:pPr>
+        <w:tabs>
+          <w:tab w:val="num" w:pos="3600"/>
+        </w:tabs>
+        <w:ind w:left="3600" w:hanging="360"/>
+      </w:pPr>
+      <w:rPr>
+        <w:rFonts w:ascii="Wingdings" w:hAnsi="Wingdings" w:hint="default"/>
+        <w:sz w:val="20"/>
+      </w:rPr>
+    </w:lvl>
+    <w:lvl w:ilvl="5" w:tentative="1">
+      <w:start w:val="1"/>
+      <w:numFmt w:val="bullet"/>
+      <w:lvlText w:val=""/>
+      <w:lvlJc w:val="left"/>
+      <w:pPr>
+        <w:tabs>
+          <w:tab w:val="num" w:pos="4320"/>
+        </w:tabs>
+        <w:ind w:left="4320" w:hanging="360"/>
+      </w:pPr>
+      <w:rPr>
+        <w:rFonts w:ascii="Wingdings" w:hAnsi="Wingdings" w:hint="default"/>
+        <w:sz w:val="20"/>
+      </w:rPr>
+    </w:lvl>
+    <w:lvl w:ilvl="6" w:tentative="1">
+      <w:start w:val="1"/>
+      <w:numFmt w:val="bullet"/>
+      <w:lvlText w:val=""/>
+      <w:lvlJc w:val="left"/>
+      <w:pPr>
+        <w:tabs>
+          <w:tab w:val="num" w:pos="5040"/>
+        </w:tabs>
+        <w:ind w:left="5040" w:hanging="360"/>
+      </w:pPr>
+      <w:rPr>
+        <w:rFonts w:ascii="Wingdings" w:hAnsi="Wingdings" w:hint="default"/>
+        <w:sz w:val="20"/>
+      </w:rPr>
+    </w:lvl>
+    <w:lvl w:ilvl="7" w:tentative="1">
+      <w:start w:val="1"/>
+      <w:numFmt w:val="bullet"/>
+      <w:lvlText w:val=""/>
+      <w:lvlJc w:val="left"/>
+      <w:pPr>
+        <w:tabs>
+          <w:tab w:val="num" w:pos="5760"/>
+        </w:tabs>
+        <w:ind w:left="5760" w:hanging="360"/>
+      </w:pPr>
+      <w:rPr>
+        <w:rFonts w:ascii="Wingdings" w:hAnsi="Wingdings" w:hint="default"/>
+        <w:sz w:val="20"/>
+      </w:rPr>
+    </w:lvl>
+    <w:lvl w:ilvl="8" w:tentative="1">
+      <w:start w:val="1"/>
+      <w:numFmt w:val="bullet"/>
+      <w:lvlText w:val=""/>
+      <w:lvlJc w:val="left"/>
+      <w:pPr>
+        <w:tabs>
+          <w:tab w:val="num" w:pos="6480"/>
+        </w:tabs>
+        <w:ind w:left="6480" w:hanging="360"/>
+      </w:pPr>
+      <w:rPr>
+        <w:rFonts w:ascii="Wingdings" w:hAnsi="Wingdings" w:hint="default"/>
+        <w:sz w:val="20"/>
+      </w:rPr>
+    </w:lvl>
+  </w:abstractNum>
+  <w:abstractNum w:abstractNumId="1">
+    <w:nsid w:val="1A8F03CC"/>
+    <w:multiLevelType w:val="multilevel"/>
+    <w:tmpl w:val="A93A9D30"/>
+    <w:lvl w:ilvl="0">
+      <w:start w:val="1"/>
+      <w:numFmt w:val="bullet"/>
+      <w:lvlText w:val=""/>
+      <w:lvlJc w:val="left"/>
+      <w:pPr>
+        <w:tabs>
+          <w:tab w:val="num" w:pos="720"/>
+        </w:tabs>
+        <w:ind w:left="720" w:hanging="360"/>
+      </w:pPr>
+      <w:rPr>
+        <w:rFonts w:ascii="Symbol" w:hAnsi="Symbol" w:hint="default"/>
+        <w:sz w:val="20"/>
+      </w:rPr>
+    </w:lvl>
+    <w:lvl w:ilvl="1" w:tentative="1">
+      <w:start w:val="1"/>
+      <w:numFmt w:val="bullet"/>
+      <w:lvlText w:val="o"/>
+      <w:lvlJc w:val="left"/>
+      <w:pPr>
+        <w:tabs>
+          <w:tab w:val="num" w:pos="1440"/>
+        </w:tabs>
+        <w:ind w:left="1440" w:hanging="360"/>
+      </w:pPr>
+      <w:rPr>
+        <w:rFonts w:ascii="Courier New" w:hAnsi="Courier New" w:hint="default"/>
+        <w:sz w:val="20"/>
+      </w:rPr>
+    </w:lvl>
+    <w:lvl w:ilvl="2" w:tentative="1">
+      <w:start w:val="1"/>
+      <w:numFmt w:val="bullet"/>
+      <w:lvlText w:val=""/>
+      <w:lvlJc w:val="left"/>
+      <w:pPr>
+        <w:tabs>
+          <w:tab w:val="num" w:pos="2160"/>
+        </w:tabs>
+        <w:ind w:left="2160" w:hanging="360"/>
+      </w:pPr>
+      <w:rPr>
+        <w:rFonts w:ascii="Wingdings" w:hAnsi="Wingdings" w:hint="default"/>
+        <w:sz w:val="20"/>
+      </w:rPr>
+    </w:lvl>
+    <w:lvl w:ilvl="3" w:tentative="1">
+      <w:start w:val="1"/>
+      <w:numFmt w:val="bullet"/>
+      <w:lvlText w:val=""/>
+      <w:lvlJc w:val="left"/>
+      <w:pPr>
+        <w:tabs>
+          <w:tab w:val="num" w:pos="2880"/>
+        </w:tabs>
+        <w:ind w:left="2880" w:hanging="360"/>
+      </w:pPr>
+      <w:rPr>
+        <w:rFonts w:ascii="Wingdings" w:hAnsi="Wingdings" w:hint="default"/>
+        <w:sz w:val="20"/>
+      </w:rPr>
+    </w:lvl>
+    <w:lvl w:ilvl="4" w:tentative="1">
+      <w:start w:val="1"/>
+      <w:numFmt w:val="bullet"/>
+      <w:lvlText w:val=""/>
+      <w:lvlJc w:val="left"/>
+      <w:pPr>
+        <w:tabs>
+          <w:tab w:val="num" w:pos="3600"/>
+        </w:tabs>
+        <w:ind w:left="3600" w:hanging="360"/>
+      </w:pPr>
+      <w:rPr>
+        <w:rFonts w:ascii="Wingdings" w:hAnsi="Wingdings" w:hint="default"/>
+        <w:sz w:val="20"/>
+      </w:rPr>
+    </w:lvl>
+    <w:lvl w:ilvl="5" w:tentative="1">
+      <w:start w:val="1"/>
+      <w:numFmt w:val="bullet"/>
+      <w:lvlText w:val=""/>
+      <w:lvlJc w:val="left"/>
+      <w:pPr>
+        <w:tabs>
+          <w:tab w:val="num" w:pos="4320"/>
+        </w:tabs>
+        <w:ind w:left="4320" w:hanging="360"/>
+      </w:pPr>
+      <w:rPr>
+        <w:rFonts w:ascii="Wingdings" w:hAnsi="Wingdings" w:hint="default"/>
+        <w:sz w:val="20"/>
+      </w:rPr>
+    </w:lvl>
+    <w:lvl w:ilvl="6" w:tentative="1">
+      <w:start w:val="1"/>
+      <w:numFmt w:val="bullet"/>
+      <w:lvlText w:val=""/>
+      <w:lvlJc w:val="left"/>
+      <w:pPr>
+        <w:tabs>
+          <w:tab w:val="num" w:pos="5040"/>
+        </w:tabs>
+        <w:ind w:left="5040" w:hanging="360"/>
+      </w:pPr>
+      <w:rPr>
+        <w:rFonts w:ascii="Wingdings" w:hAnsi="Wingdings" w:hint="default"/>
+        <w:sz w:val="20"/>
+      </w:rPr>
+    </w:lvl>
+    <w:lvl w:ilvl="7" w:tentative="1">
+      <w:start w:val="1"/>
+      <w:numFmt w:val="bullet"/>
+      <w:lvlText w:val=""/>
+      <w:lvlJc w:val="left"/>
+      <w:pPr>
+        <w:tabs>
+          <w:tab w:val="num" w:pos="5760"/>
+        </w:tabs>
+        <w:ind w:left="5760" w:hanging="360"/>
+      </w:pPr>
+      <w:rPr>
+        <w:rFonts w:ascii="Wingdings" w:hAnsi="Wingdings" w:hint="default"/>
+        <w:sz w:val="20"/>
+      </w:rPr>
+    </w:lvl>
+    <w:lvl w:ilvl="8" w:tentative="1">
+      <w:start w:val="1"/>
+      <w:numFmt w:val="bullet"/>
+      <w:lvlText w:val=""/>
+      <w:lvlJc w:val="left"/>
+      <w:pPr>
+        <w:tabs>
+          <w:tab w:val="num" w:pos="6480"/>
+        </w:tabs>
+        <w:ind w:left="6480" w:hanging="360"/>
+      </w:pPr>
+      <w:rPr>
+        <w:rFonts w:ascii="Wingdings" w:hAnsi="Wingdings" w:hint="default"/>
+        <w:sz w:val="20"/>
+      </w:rPr>
+    </w:lvl>
+  </w:abstractNum>
+  <w:abstractNum w:abstractNumId="2">
     <w:nsid w:val="441C361C"/>
     <w:multiLevelType w:val="hybridMultilevel"/>
     <w:tmpl w:val="12A6C738"/>
@@ -5852,14 +8102,324 @@
       </w:pPr>
     </w:lvl>
   </w:abstractNum>
+  <w:abstractNum w:abstractNumId="3">
+    <w:nsid w:val="5EEE24FF"/>
+    <w:multiLevelType w:val="multilevel"/>
+    <w:tmpl w:val="F26A7E50"/>
+    <w:lvl w:ilvl="0">
+      <w:start w:val="1"/>
+      <w:numFmt w:val="bullet"/>
+      <w:lvlText w:val=""/>
+      <w:lvlJc w:val="left"/>
+      <w:pPr>
+        <w:tabs>
+          <w:tab w:val="num" w:pos="720"/>
+        </w:tabs>
+        <w:ind w:left="720" w:hanging="360"/>
+      </w:pPr>
+      <w:rPr>
+        <w:rFonts w:ascii="Symbol" w:hAnsi="Symbol" w:hint="default"/>
+        <w:sz w:val="20"/>
+      </w:rPr>
+    </w:lvl>
+    <w:lvl w:ilvl="1" w:tentative="1">
+      <w:start w:val="1"/>
+      <w:numFmt w:val="bullet"/>
+      <w:lvlText w:val="o"/>
+      <w:lvlJc w:val="left"/>
+      <w:pPr>
+        <w:tabs>
+          <w:tab w:val="num" w:pos="1440"/>
+        </w:tabs>
+        <w:ind w:left="1440" w:hanging="360"/>
+      </w:pPr>
+      <w:rPr>
+        <w:rFonts w:ascii="Courier New" w:hAnsi="Courier New" w:hint="default"/>
+        <w:sz w:val="20"/>
+      </w:rPr>
+    </w:lvl>
+    <w:lvl w:ilvl="2" w:tentative="1">
+      <w:start w:val="1"/>
+      <w:numFmt w:val="bullet"/>
+      <w:lvlText w:val=""/>
+      <w:lvlJc w:val="left"/>
+      <w:pPr>
+        <w:tabs>
+          <w:tab w:val="num" w:pos="2160"/>
+        </w:tabs>
+        <w:ind w:left="2160" w:hanging="360"/>
+      </w:pPr>
+      <w:rPr>
+        <w:rFonts w:ascii="Wingdings" w:hAnsi="Wingdings" w:hint="default"/>
+        <w:sz w:val="20"/>
+      </w:rPr>
+    </w:lvl>
+    <w:lvl w:ilvl="3" w:tentative="1">
+      <w:start w:val="1"/>
+      <w:numFmt w:val="bullet"/>
+      <w:lvlText w:val=""/>
+      <w:lvlJc w:val="left"/>
+      <w:pPr>
+        <w:tabs>
+          <w:tab w:val="num" w:pos="2880"/>
+        </w:tabs>
+        <w:ind w:left="2880" w:hanging="360"/>
+      </w:pPr>
+      <w:rPr>
+        <w:rFonts w:ascii="Wingdings" w:hAnsi="Wingdings" w:hint="default"/>
+        <w:sz w:val="20"/>
+      </w:rPr>
+    </w:lvl>
+    <w:lvl w:ilvl="4" w:tentative="1">
+      <w:start w:val="1"/>
+      <w:numFmt w:val="bullet"/>
+      <w:lvlText w:val=""/>
+      <w:lvlJc w:val="left"/>
+      <w:pPr>
+        <w:tabs>
+          <w:tab w:val="num" w:pos="3600"/>
+        </w:tabs>
+        <w:ind w:left="3600" w:hanging="360"/>
+      </w:pPr>
+      <w:rPr>
+        <w:rFonts w:ascii="Wingdings" w:hAnsi="Wingdings" w:hint="default"/>
+        <w:sz w:val="20"/>
+      </w:rPr>
+    </w:lvl>
+    <w:lvl w:ilvl="5" w:tentative="1">
+      <w:start w:val="1"/>
+      <w:numFmt w:val="bullet"/>
+      <w:lvlText w:val=""/>
+      <w:lvlJc w:val="left"/>
+      <w:pPr>
+        <w:tabs>
+          <w:tab w:val="num" w:pos="4320"/>
+        </w:tabs>
+        <w:ind w:left="4320" w:hanging="360"/>
+      </w:pPr>
+      <w:rPr>
+        <w:rFonts w:ascii="Wingdings" w:hAnsi="Wingdings" w:hint="default"/>
+        <w:sz w:val="20"/>
+      </w:rPr>
+    </w:lvl>
+    <w:lvl w:ilvl="6" w:tentative="1">
+      <w:start w:val="1"/>
+      <w:numFmt w:val="bullet"/>
+      <w:lvlText w:val=""/>
+      <w:lvlJc w:val="left"/>
+      <w:pPr>
+        <w:tabs>
+          <w:tab w:val="num" w:pos="5040"/>
+        </w:tabs>
+        <w:ind w:left="5040" w:hanging="360"/>
+      </w:pPr>
+      <w:rPr>
+        <w:rFonts w:ascii="Wingdings" w:hAnsi="Wingdings" w:hint="default"/>
+        <w:sz w:val="20"/>
+      </w:rPr>
+    </w:lvl>
+    <w:lvl w:ilvl="7" w:tentative="1">
+      <w:start w:val="1"/>
+      <w:numFmt w:val="bullet"/>
+      <w:lvlText w:val=""/>
+      <w:lvlJc w:val="left"/>
+      <w:pPr>
+        <w:tabs>
+          <w:tab w:val="num" w:pos="5760"/>
+        </w:tabs>
+        <w:ind w:left="5760" w:hanging="360"/>
+      </w:pPr>
+      <w:rPr>
+        <w:rFonts w:ascii="Wingdings" w:hAnsi="Wingdings" w:hint="default"/>
+        <w:sz w:val="20"/>
+      </w:rPr>
+    </w:lvl>
+    <w:lvl w:ilvl="8" w:tentative="1">
+      <w:start w:val="1"/>
+      <w:numFmt w:val="bullet"/>
+      <w:lvlText w:val=""/>
+      <w:lvlJc w:val="left"/>
+      <w:pPr>
+        <w:tabs>
+          <w:tab w:val="num" w:pos="6480"/>
+        </w:tabs>
+        <w:ind w:left="6480" w:hanging="360"/>
+      </w:pPr>
+      <w:rPr>
+        <w:rFonts w:ascii="Wingdings" w:hAnsi="Wingdings" w:hint="default"/>
+        <w:sz w:val="20"/>
+      </w:rPr>
+    </w:lvl>
+  </w:abstractNum>
+  <w:abstractNum w:abstractNumId="4">
+    <w:nsid w:val="644E4342"/>
+    <w:multiLevelType w:val="multilevel"/>
+    <w:tmpl w:val="ED8C92CE"/>
+    <w:lvl w:ilvl="0">
+      <w:start w:val="1"/>
+      <w:numFmt w:val="bullet"/>
+      <w:lvlText w:val=""/>
+      <w:lvlJc w:val="left"/>
+      <w:pPr>
+        <w:tabs>
+          <w:tab w:val="num" w:pos="720"/>
+        </w:tabs>
+        <w:ind w:left="720" w:hanging="360"/>
+      </w:pPr>
+      <w:rPr>
+        <w:rFonts w:ascii="Symbol" w:hAnsi="Symbol" w:hint="default"/>
+        <w:sz w:val="20"/>
+      </w:rPr>
+    </w:lvl>
+    <w:lvl w:ilvl="1" w:tentative="1">
+      <w:start w:val="1"/>
+      <w:numFmt w:val="bullet"/>
+      <w:lvlText w:val="o"/>
+      <w:lvlJc w:val="left"/>
+      <w:pPr>
+        <w:tabs>
+          <w:tab w:val="num" w:pos="1440"/>
+        </w:tabs>
+        <w:ind w:left="1440" w:hanging="360"/>
+      </w:pPr>
+      <w:rPr>
+        <w:rFonts w:ascii="Courier New" w:hAnsi="Courier New" w:hint="default"/>
+        <w:sz w:val="20"/>
+      </w:rPr>
+    </w:lvl>
+    <w:lvl w:ilvl="2" w:tentative="1">
+      <w:start w:val="1"/>
+      <w:numFmt w:val="bullet"/>
+      <w:lvlText w:val=""/>
+      <w:lvlJc w:val="left"/>
+      <w:pPr>
+        <w:tabs>
+          <w:tab w:val="num" w:pos="2160"/>
+        </w:tabs>
+        <w:ind w:left="2160" w:hanging="360"/>
+      </w:pPr>
+      <w:rPr>
+        <w:rFonts w:ascii="Wingdings" w:hAnsi="Wingdings" w:hint="default"/>
+        <w:sz w:val="20"/>
+      </w:rPr>
+    </w:lvl>
+    <w:lvl w:ilvl="3" w:tentative="1">
+      <w:start w:val="1"/>
+      <w:numFmt w:val="bullet"/>
+      <w:lvlText w:val=""/>
+      <w:lvlJc w:val="left"/>
+      <w:pPr>
+        <w:tabs>
+          <w:tab w:val="num" w:pos="2880"/>
+        </w:tabs>
+        <w:ind w:left="2880" w:hanging="360"/>
+      </w:pPr>
+      <w:rPr>
+        <w:rFonts w:ascii="Wingdings" w:hAnsi="Wingdings" w:hint="default"/>
+        <w:sz w:val="20"/>
+      </w:rPr>
+    </w:lvl>
+    <w:lvl w:ilvl="4" w:tentative="1">
+      <w:start w:val="1"/>
+      <w:numFmt w:val="bullet"/>
+      <w:lvlText w:val=""/>
+      <w:lvlJc w:val="left"/>
+      <w:pPr>
+        <w:tabs>
+          <w:tab w:val="num" w:pos="3600"/>
+        </w:tabs>
+        <w:ind w:left="3600" w:hanging="360"/>
+      </w:pPr>
+      <w:rPr>
+        <w:rFonts w:ascii="Wingdings" w:hAnsi="Wingdings" w:hint="default"/>
+        <w:sz w:val="20"/>
+      </w:rPr>
+    </w:lvl>
+    <w:lvl w:ilvl="5" w:tentative="1">
+      <w:start w:val="1"/>
+      <w:numFmt w:val="bullet"/>
+      <w:lvlText w:val=""/>
+      <w:lvlJc w:val="left"/>
+      <w:pPr>
+        <w:tabs>
+          <w:tab w:val="num" w:pos="4320"/>
+        </w:tabs>
+        <w:ind w:left="4320" w:hanging="360"/>
+      </w:pPr>
+      <w:rPr>
+        <w:rFonts w:ascii="Wingdings" w:hAnsi="Wingdings" w:hint="default"/>
+        <w:sz w:val="20"/>
+      </w:rPr>
+    </w:lvl>
+    <w:lvl w:ilvl="6" w:tentative="1">
+      <w:start w:val="1"/>
+      <w:numFmt w:val="bullet"/>
+      <w:lvlText w:val=""/>
+      <w:lvlJc w:val="left"/>
+      <w:pPr>
+        <w:tabs>
+          <w:tab w:val="num" w:pos="5040"/>
+        </w:tabs>
+        <w:ind w:left="5040" w:hanging="360"/>
+      </w:pPr>
+      <w:rPr>
+        <w:rFonts w:ascii="Wingdings" w:hAnsi="Wingdings" w:hint="default"/>
+        <w:sz w:val="20"/>
+      </w:rPr>
+    </w:lvl>
+    <w:lvl w:ilvl="7" w:tentative="1">
+      <w:start w:val="1"/>
+      <w:numFmt w:val="bullet"/>
+      <w:lvlText w:val=""/>
+      <w:lvlJc w:val="left"/>
+      <w:pPr>
+        <w:tabs>
+          <w:tab w:val="num" w:pos="5760"/>
+        </w:tabs>
+        <w:ind w:left="5760" w:hanging="360"/>
+      </w:pPr>
+      <w:rPr>
+        <w:rFonts w:ascii="Wingdings" w:hAnsi="Wingdings" w:hint="default"/>
+        <w:sz w:val="20"/>
+      </w:rPr>
+    </w:lvl>
+    <w:lvl w:ilvl="8" w:tentative="1">
+      <w:start w:val="1"/>
+      <w:numFmt w:val="bullet"/>
+      <w:lvlText w:val=""/>
+      <w:lvlJc w:val="left"/>
+      <w:pPr>
+        <w:tabs>
+          <w:tab w:val="num" w:pos="6480"/>
+        </w:tabs>
+        <w:ind w:left="6480" w:hanging="360"/>
+      </w:pPr>
+      <w:rPr>
+        <w:rFonts w:ascii="Wingdings" w:hAnsi="Wingdings" w:hint="default"/>
+        <w:sz w:val="20"/>
+      </w:rPr>
+    </w:lvl>
+  </w:abstractNum>
   <w:num w:numId="1">
+    <w:abstractNumId w:val="2"/>
+  </w:num>
+  <w:num w:numId="2">
     <w:abstractNumId w:val="0"/>
+  </w:num>
+  <w:num w:numId="3">
+    <w:abstractNumId w:val="3"/>
+  </w:num>
+  <w:num w:numId="4">
+    <w:abstractNumId w:val="1"/>
+  </w:num>
+  <w:num w:numId="5">
+    <w:abstractNumId w:val="4"/>
   </w:num>
 </w:numbering>
 </file>
 
 <file path=word/styles.xml><?xml version="1.0" encoding="utf-8"?>
-<w:styles xmlns:mc="http://schemas.openxmlformats.org/markup-compatibility/2006" xmlns:r="http://schemas.openxmlformats.org/officeDocument/2006/relationships" xmlns:w="http://schemas.openxmlformats.org/wordprocessingml/2006/main" xmlns:w14="http://schemas.microsoft.com/office/word/2010/wordml" xmlns:w15="http://schemas.microsoft.com/office/word/2012/wordml" xmlns:w16se="http://schemas.microsoft.com/office/word/2015/wordml/symex" mc:Ignorable="w14 w15 w16se">
+<w:styles xmlns:mc="http://schemas.openxmlformats.org/markup-compatibility/2006" xmlns:r="http://schemas.openxmlformats.org/officeDocument/2006/relationships" xmlns:w="http://schemas.openxmlformats.org/wordprocessingml/2006/main" xmlns:w14="http://schemas.microsoft.com/office/word/2010/wordml" xmlns:w15="http://schemas.microsoft.com/office/word/2012/wordml" mc:Ignorable="w14 w15">
   <w:docDefaults>
     <w:rPrDefault>
       <w:rPr>
@@ -6290,6 +8850,46 @@
       <w:contextualSpacing/>
     </w:pPr>
   </w:style>
+  <w:style w:type="paragraph" w:styleId="NormalWeb">
+    <w:name w:val="Normal (Web)"/>
+    <w:basedOn w:val="Normal"/>
+    <w:uiPriority w:val="99"/>
+    <w:semiHidden/>
+    <w:unhideWhenUsed/>
+    <w:rsid w:val="002C3027"/>
+    <w:pPr>
+      <w:spacing w:before="100" w:beforeAutospacing="1" w:after="100" w:afterAutospacing="1" w:line="240" w:lineRule="auto"/>
+    </w:pPr>
+    <w:rPr>
+      <w:rFonts w:ascii="Times New Roman" w:eastAsia="Times New Roman" w:hAnsi="Times New Roman" w:cs="Times New Roman"/>
+      <w:sz w:val="24"/>
+      <w:szCs w:val="24"/>
+    </w:rPr>
+  </w:style>
+  <w:style w:type="character" w:styleId="Strong">
+    <w:name w:val="Strong"/>
+    <w:basedOn w:val="DefaultParagraphFont"/>
+    <w:uiPriority w:val="22"/>
+    <w:qFormat/>
+    <w:rsid w:val="002C3027"/>
+    <w:rPr>
+      <w:b/>
+      <w:bCs/>
+    </w:rPr>
+  </w:style>
+  <w:style w:type="character" w:styleId="HTMLCode">
+    <w:name w:val="HTML Code"/>
+    <w:basedOn w:val="DefaultParagraphFont"/>
+    <w:uiPriority w:val="99"/>
+    <w:semiHidden/>
+    <w:unhideWhenUsed/>
+    <w:rsid w:val="002C3027"/>
+    <w:rPr>
+      <w:rFonts w:ascii="Courier New" w:eastAsia="Times New Roman" w:hAnsi="Courier New" w:cs="Courier New"/>
+      <w:sz w:val="20"/>
+      <w:szCs w:val="20"/>
+    </w:rPr>
+  </w:style>
 </w:styles>
 </file>
 

</xml_diff>

<commit_message>
Update security config + html Pages
</commit_message>
<xml_diff>
--- a/Document/Thiết_kế_hệ_thống.docx
+++ b/Document/Thiết_kế_hệ_thống.docx
@@ -1,6 +1,6 @@
 
 <file path=word/document.xml><?xml version="1.0" encoding="utf-8"?>
-<w:document xmlns:wpc="http://schemas.microsoft.com/office/word/2010/wordprocessingCanvas" xmlns:mc="http://schemas.openxmlformats.org/markup-compatibility/2006" xmlns:o="urn:schemas-microsoft-com:office:office" xmlns:r="http://schemas.openxmlformats.org/officeDocument/2006/relationships" xmlns:m="http://schemas.openxmlformats.org/officeDocument/2006/math" xmlns:v="urn:schemas-microsoft-com:vml" xmlns:wp14="http://schemas.microsoft.com/office/word/2010/wordprocessingDrawing" xmlns:wp="http://schemas.openxmlformats.org/drawingml/2006/wordprocessingDrawing" xmlns:w10="urn:schemas-microsoft-com:office:word" xmlns:w="http://schemas.openxmlformats.org/wordprocessingml/2006/main" xmlns:w14="http://schemas.microsoft.com/office/word/2010/wordml" xmlns:w15="http://schemas.microsoft.com/office/word/2012/wordml" xmlns:wpg="http://schemas.microsoft.com/office/word/2010/wordprocessingGroup" xmlns:wpi="http://schemas.microsoft.com/office/word/2010/wordprocessingInk" xmlns:wne="http://schemas.microsoft.com/office/word/2006/wordml" xmlns:wps="http://schemas.microsoft.com/office/word/2010/wordprocessingShape" mc:Ignorable="w14 w15 wp14">
+<w:document xmlns:wpc="http://schemas.microsoft.com/office/word/2010/wordprocessingCanvas" xmlns:cx="http://schemas.microsoft.com/office/drawing/2014/chartex" xmlns:mc="http://schemas.openxmlformats.org/markup-compatibility/2006" xmlns:o="urn:schemas-microsoft-com:office:office" xmlns:r="http://schemas.openxmlformats.org/officeDocument/2006/relationships" xmlns:m="http://schemas.openxmlformats.org/officeDocument/2006/math" xmlns:v="urn:schemas-microsoft-com:vml" xmlns:wp14="http://schemas.microsoft.com/office/word/2010/wordprocessingDrawing" xmlns:wp="http://schemas.openxmlformats.org/drawingml/2006/wordprocessingDrawing" xmlns:w10="urn:schemas-microsoft-com:office:word" xmlns:w="http://schemas.openxmlformats.org/wordprocessingml/2006/main" xmlns:w14="http://schemas.microsoft.com/office/word/2010/wordml" xmlns:w15="http://schemas.microsoft.com/office/word/2012/wordml" xmlns:w16se="http://schemas.microsoft.com/office/word/2015/wordml/symex" xmlns:wpg="http://schemas.microsoft.com/office/word/2010/wordprocessingGroup" xmlns:wpi="http://schemas.microsoft.com/office/word/2010/wordprocessingInk" xmlns:wne="http://schemas.microsoft.com/office/word/2006/wordml" xmlns:wps="http://schemas.microsoft.com/office/word/2010/wordprocessingShape" mc:Ignorable="w14 w15 w16se wp14">
   <w:body>
     <w:p>
       <w:pPr>
@@ -5620,8 +5620,6 @@
         </w:rPr>
         <w:t xml:space="preserve"> Server</w:t>
       </w:r>
-      <w:bookmarkStart w:id="0" w:name="_GoBack"/>
-      <w:bookmarkEnd w:id="0"/>
     </w:p>
     <w:p>
       <w:pPr>
@@ -5630,87 +5628,44 @@
           <w:szCs w:val="28"/>
         </w:rPr>
       </w:pPr>
-      <w:proofErr w:type="spellStart"/>
-      <w:proofErr w:type="gramStart"/>
-      <w:r>
-        <w:rPr>
-          <w:sz w:val="28"/>
-          <w:szCs w:val="28"/>
-        </w:rPr>
-        <w:t>javac</w:t>
-      </w:r>
-      <w:proofErr w:type="spellEnd"/>
-      <w:proofErr w:type="gramEnd"/>
-      <w:r>
-        <w:rPr>
-          <w:sz w:val="28"/>
-          <w:szCs w:val="28"/>
-        </w:rPr>
-        <w:t xml:space="preserve"> MySqlExample.java &amp;&amp; java -</w:t>
-      </w:r>
-      <w:proofErr w:type="spellStart"/>
-      <w:r>
-        <w:rPr>
-          <w:sz w:val="28"/>
-          <w:szCs w:val="28"/>
-        </w:rPr>
-        <w:t>cp</w:t>
-      </w:r>
-      <w:proofErr w:type="spellEnd"/>
-      <w:r>
-        <w:rPr>
-          <w:sz w:val="28"/>
-          <w:szCs w:val="28"/>
-        </w:rPr>
-        <w:t xml:space="preserve"> mysql-driver-8.0.28.jar:. </w:t>
-      </w:r>
-      <w:proofErr w:type="spellStart"/>
-      <w:r>
-        <w:rPr>
-          <w:sz w:val="28"/>
-          <w:szCs w:val="28"/>
-        </w:rPr>
-        <w:t>MySqlExample</w:t>
-      </w:r>
-      <w:proofErr w:type="spellEnd"/>
-      <w:r>
-        <w:rPr>
-          <w:sz w:val="28"/>
-          <w:szCs w:val="28"/>
-        </w:rPr>
-        <w:t xml:space="preserve"> -host mysql-26a06367-neekon250803.j.aivencloud.com -port 12350 -database </w:t>
-      </w:r>
-      <w:proofErr w:type="spellStart"/>
-      <w:r>
-        <w:rPr>
-          <w:sz w:val="28"/>
-          <w:szCs w:val="28"/>
-        </w:rPr>
-        <w:t>defaultdb</w:t>
-      </w:r>
-      <w:proofErr w:type="spellEnd"/>
-      <w:r>
-        <w:rPr>
-          <w:sz w:val="28"/>
-          <w:szCs w:val="28"/>
-        </w:rPr>
-        <w:t xml:space="preserve"> -username </w:t>
-      </w:r>
-      <w:proofErr w:type="spellStart"/>
-      <w:r>
-        <w:rPr>
-          <w:sz w:val="28"/>
-          <w:szCs w:val="28"/>
-        </w:rPr>
-        <w:t>avnadmin</w:t>
-      </w:r>
-      <w:proofErr w:type="spellEnd"/>
-      <w:r>
-        <w:rPr>
-          <w:sz w:val="28"/>
-          <w:szCs w:val="28"/>
-        </w:rPr>
-        <w:t xml:space="preserve"> -password AVNS_B2BPHB23YlxcEZtxfDW</w:t>
+      <w:r>
+        <w:rPr>
+          <w:sz w:val="28"/>
+          <w:szCs w:val="28"/>
+        </w:rPr>
+        <w:t xml:space="preserve">-T4: </w:t>
+      </w:r>
+      <w:proofErr w:type="spellStart"/>
+      <w:r>
+        <w:rPr>
+          <w:sz w:val="28"/>
+          <w:szCs w:val="28"/>
+        </w:rPr>
+        <w:t>Hoàn</w:t>
+      </w:r>
+      <w:proofErr w:type="spellEnd"/>
+      <w:r>
+        <w:rPr>
+          <w:sz w:val="28"/>
+          <w:szCs w:val="28"/>
+        </w:rPr>
+        <w:t xml:space="preserve"> </w:t>
+      </w:r>
+      <w:proofErr w:type="spellStart"/>
+      <w:r>
+        <w:rPr>
+          <w:sz w:val="28"/>
+          <w:szCs w:val="28"/>
+        </w:rPr>
+        <w:t>thành</w:t>
+      </w:r>
+      <w:proofErr w:type="spellEnd"/>
+      <w:r>
+        <w:rPr>
+          <w:sz w:val="28"/>
+          <w:szCs w:val="28"/>
+        </w:rPr>
+        <w:t xml:space="preserve"> app Android</w:t>
       </w:r>
     </w:p>
     <w:p>
@@ -5725,7 +5680,7 @@
           <w:sz w:val="28"/>
           <w:szCs w:val="28"/>
         </w:rPr>
-        <w:t xml:space="preserve">-T4: </w:t>
+        <w:t xml:space="preserve">-T5: </w:t>
       </w:r>
       <w:proofErr w:type="spellStart"/>
       <w:r>
@@ -5757,83 +5712,36 @@
           <w:sz w:val="28"/>
           <w:szCs w:val="28"/>
         </w:rPr>
-        <w:t xml:space="preserve"> app Android</w:t>
-      </w:r>
+        <w:t xml:space="preserve"> </w:t>
+      </w:r>
+      <w:proofErr w:type="spellStart"/>
+      <w:r>
+        <w:rPr>
+          <w:sz w:val="28"/>
+          <w:szCs w:val="28"/>
+        </w:rPr>
+        <w:t>web+báo</w:t>
+      </w:r>
+      <w:proofErr w:type="spellEnd"/>
+      <w:r>
+        <w:rPr>
+          <w:sz w:val="28"/>
+          <w:szCs w:val="28"/>
+        </w:rPr>
+        <w:t xml:space="preserve"> </w:t>
+      </w:r>
+      <w:proofErr w:type="spellStart"/>
+      <w:r>
+        <w:rPr>
+          <w:sz w:val="28"/>
+          <w:szCs w:val="28"/>
+        </w:rPr>
+        <w:t>cáo</w:t>
+      </w:r>
+      <w:proofErr w:type="spellEnd"/>
     </w:p>
     <w:p>
       <w:pPr>
-        <w:rPr>
-          <w:sz w:val="28"/>
-          <w:szCs w:val="28"/>
-        </w:rPr>
-      </w:pPr>
-      <w:r>
-        <w:rPr>
-          <w:sz w:val="28"/>
-          <w:szCs w:val="28"/>
-        </w:rPr>
-        <w:t xml:space="preserve">-T5: </w:t>
-      </w:r>
-      <w:proofErr w:type="spellStart"/>
-      <w:r>
-        <w:rPr>
-          <w:sz w:val="28"/>
-          <w:szCs w:val="28"/>
-        </w:rPr>
-        <w:t>Hoàn</w:t>
-      </w:r>
-      <w:proofErr w:type="spellEnd"/>
-      <w:r>
-        <w:rPr>
-          <w:sz w:val="28"/>
-          <w:szCs w:val="28"/>
-        </w:rPr>
-        <w:t xml:space="preserve"> </w:t>
-      </w:r>
-      <w:proofErr w:type="spellStart"/>
-      <w:r>
-        <w:rPr>
-          <w:sz w:val="28"/>
-          <w:szCs w:val="28"/>
-        </w:rPr>
-        <w:t>thành</w:t>
-      </w:r>
-      <w:proofErr w:type="spellEnd"/>
-      <w:r>
-        <w:rPr>
-          <w:sz w:val="28"/>
-          <w:szCs w:val="28"/>
-        </w:rPr>
-        <w:t xml:space="preserve"> </w:t>
-      </w:r>
-      <w:proofErr w:type="spellStart"/>
-      <w:r>
-        <w:rPr>
-          <w:sz w:val="28"/>
-          <w:szCs w:val="28"/>
-        </w:rPr>
-        <w:t>web+báo</w:t>
-      </w:r>
-      <w:proofErr w:type="spellEnd"/>
-      <w:r>
-        <w:rPr>
-          <w:sz w:val="28"/>
-          <w:szCs w:val="28"/>
-        </w:rPr>
-        <w:t xml:space="preserve"> </w:t>
-      </w:r>
-      <w:proofErr w:type="spellStart"/>
-      <w:r>
-        <w:rPr>
-          <w:sz w:val="28"/>
-          <w:szCs w:val="28"/>
-        </w:rPr>
-        <w:t>cáo</w:t>
-      </w:r>
-      <w:proofErr w:type="spellEnd"/>
-    </w:p>
-    <w:p>
-      <w:pPr>
         <w:spacing w:before="100" w:beforeAutospacing="1" w:after="100" w:afterAutospacing="1" w:line="240" w:lineRule="auto"/>
         <w:rPr>
           <w:rFonts w:ascii="Times New Roman" w:eastAsia="Times New Roman" w:hAnsi="Times New Roman" w:cs="Times New Roman"/>
@@ -6616,7 +6524,6 @@
         <w:t xml:space="preserve"> </w:t>
       </w:r>
       <w:proofErr w:type="spellStart"/>
-      <w:proofErr w:type="gramStart"/>
       <w:r>
         <w:rPr>
           <w:rFonts w:ascii="Times New Roman" w:eastAsia="Times New Roman" w:hAnsi="Times New Roman" w:cs="Times New Roman"/>
@@ -6626,7 +6533,6 @@
         <w:t>theo</w:t>
       </w:r>
       <w:proofErr w:type="spellEnd"/>
-      <w:proofErr w:type="gramEnd"/>
       <w:r>
         <w:rPr>
           <w:rFonts w:ascii="Times New Roman" w:eastAsia="Times New Roman" w:hAnsi="Times New Roman" w:cs="Times New Roman"/>
@@ -7682,7 +7588,16 @@
           <w:sz w:val="24"/>
           <w:szCs w:val="24"/>
         </w:rPr>
-        <w:t xml:space="preserve"> internet: AWS,  </w:t>
+        <w:t xml:space="preserve"> internet: </w:t>
+      </w:r>
+      <w:proofErr w:type="gramStart"/>
+      <w:r>
+        <w:rPr>
+          <w:rFonts w:ascii="Times New Roman" w:eastAsia="Times New Roman" w:hAnsi="Times New Roman" w:cs="Times New Roman"/>
+          <w:sz w:val="24"/>
+          <w:szCs w:val="24"/>
+        </w:rPr>
+        <w:t xml:space="preserve">AWS,  </w:t>
       </w:r>
       <w:proofErr w:type="spellStart"/>
       <w:r>
@@ -7694,14 +7609,273 @@
         <w:t>Heroku</w:t>
       </w:r>
       <w:proofErr w:type="spellEnd"/>
-      <w:r>
-        <w:rPr>
-          <w:rFonts w:ascii="Times New Roman" w:eastAsia="Times New Roman" w:hAnsi="Times New Roman" w:cs="Times New Roman"/>
-          <w:sz w:val="24"/>
-          <w:szCs w:val="24"/>
-        </w:rPr>
-        <w:t>, Digital Ocean, Railway.app</w:t>
-      </w:r>
+      <w:proofErr w:type="gramEnd"/>
+      <w:r>
+        <w:rPr>
+          <w:rFonts w:ascii="Times New Roman" w:eastAsia="Times New Roman" w:hAnsi="Times New Roman" w:cs="Times New Roman"/>
+          <w:sz w:val="24"/>
+          <w:szCs w:val="24"/>
+        </w:rPr>
+        <w:t>, Digita</w:t>
+      </w:r>
+      <w:bookmarkStart w:id="0" w:name="_GoBack"/>
+      <w:bookmarkEnd w:id="0"/>
+      <w:r>
+        <w:rPr>
+          <w:rFonts w:ascii="Times New Roman" w:eastAsia="Times New Roman" w:hAnsi="Times New Roman" w:cs="Times New Roman"/>
+          <w:sz w:val="24"/>
+          <w:szCs w:val="24"/>
+        </w:rPr>
+        <w:t xml:space="preserve">l Ocean, </w:t>
+      </w:r>
+      <w:proofErr w:type="spellStart"/>
+      <w:r>
+        <w:rPr>
+          <w:rFonts w:ascii="Times New Roman" w:eastAsia="Times New Roman" w:hAnsi="Times New Roman" w:cs="Times New Roman"/>
+          <w:sz w:val="24"/>
+          <w:szCs w:val="24"/>
+        </w:rPr>
+        <w:t>Railway.app</w:t>
+      </w:r>
+      <w:proofErr w:type="spellEnd"/>
+    </w:p>
+    <w:tbl>
+      <w:tblPr>
+        <w:tblStyle w:val="TableGrid"/>
+        <w:tblW w:w="0" w:type="auto"/>
+        <w:tblLook w:val="04A0" w:firstRow="1" w:lastRow="0" w:firstColumn="1" w:lastColumn="0" w:noHBand="0" w:noVBand="1"/>
+      </w:tblPr>
+      <w:tblGrid>
+        <w:gridCol w:w="4675"/>
+        <w:gridCol w:w="4675"/>
+      </w:tblGrid>
+      <w:tr>
+        <w:tc>
+          <w:tcPr>
+            <w:tcW w:w="4675" w:type="dxa"/>
+          </w:tcPr>
+          <w:p>
+            <w:pPr>
+              <w:spacing w:before="100" w:beforeAutospacing="1" w:after="100" w:afterAutospacing="1"/>
+              <w:rPr>
+                <w:rFonts w:ascii="Times New Roman" w:eastAsia="Times New Roman" w:hAnsi="Times New Roman" w:cs="Times New Roman"/>
+                <w:sz w:val="24"/>
+                <w:szCs w:val="24"/>
+              </w:rPr>
+            </w:pPr>
+            <w:proofErr w:type="spellStart"/>
+            <w:r>
+              <w:rPr>
+                <w:rFonts w:ascii="Times New Roman" w:eastAsia="Times New Roman" w:hAnsi="Times New Roman" w:cs="Times New Roman"/>
+                <w:sz w:val="24"/>
+                <w:szCs w:val="24"/>
+              </w:rPr>
+              <w:t>Thông</w:t>
+            </w:r>
+            <w:proofErr w:type="spellEnd"/>
+            <w:r>
+              <w:rPr>
+                <w:rFonts w:ascii="Times New Roman" w:eastAsia="Times New Roman" w:hAnsi="Times New Roman" w:cs="Times New Roman"/>
+                <w:sz w:val="24"/>
+                <w:szCs w:val="24"/>
+              </w:rPr>
+              <w:t xml:space="preserve"> tin MySQL Server</w:t>
+            </w:r>
+          </w:p>
+        </w:tc>
+        <w:tc>
+          <w:tcPr>
+            <w:tcW w:w="4675" w:type="dxa"/>
+          </w:tcPr>
+          <w:p>
+            <w:pPr>
+              <w:spacing w:before="100" w:beforeAutospacing="1" w:after="100" w:afterAutospacing="1"/>
+              <w:rPr>
+                <w:rFonts w:ascii="Times New Roman" w:eastAsia="Times New Roman" w:hAnsi="Times New Roman" w:cs="Times New Roman"/>
+                <w:sz w:val="24"/>
+                <w:szCs w:val="24"/>
+              </w:rPr>
+            </w:pPr>
+          </w:p>
+        </w:tc>
+      </w:tr>
+      <w:tr>
+        <w:tc>
+          <w:tcPr>
+            <w:tcW w:w="4675" w:type="dxa"/>
+          </w:tcPr>
+          <w:p>
+            <w:pPr>
+              <w:spacing w:before="100" w:beforeAutospacing="1" w:after="100" w:afterAutospacing="1"/>
+              <w:rPr>
+                <w:rFonts w:ascii="Times New Roman" w:eastAsia="Times New Roman" w:hAnsi="Times New Roman" w:cs="Times New Roman"/>
+                <w:sz w:val="24"/>
+                <w:szCs w:val="24"/>
+              </w:rPr>
+            </w:pPr>
+            <w:r>
+              <w:rPr>
+                <w:rFonts w:ascii="Times New Roman" w:eastAsia="Times New Roman" w:hAnsi="Times New Roman" w:cs="Times New Roman"/>
+                <w:sz w:val="24"/>
+                <w:szCs w:val="24"/>
+              </w:rPr>
+              <w:t xml:space="preserve">Host: </w:t>
+            </w:r>
+            <w:r>
+              <w:rPr>
+                <w:sz w:val="28"/>
+                <w:szCs w:val="28"/>
+              </w:rPr>
+              <w:t>mysql-26a06367-neekon250803.j.aivencloud.com</w:t>
+            </w:r>
+          </w:p>
+          <w:p>
+            <w:pPr>
+              <w:spacing w:before="100" w:beforeAutospacing="1" w:after="100" w:afterAutospacing="1"/>
+              <w:rPr>
+                <w:rFonts w:ascii="Times New Roman" w:eastAsia="Times New Roman" w:hAnsi="Times New Roman" w:cs="Times New Roman"/>
+                <w:sz w:val="24"/>
+                <w:szCs w:val="24"/>
+              </w:rPr>
+            </w:pPr>
+            <w:r>
+              <w:rPr>
+                <w:rFonts w:ascii="Times New Roman" w:eastAsia="Times New Roman" w:hAnsi="Times New Roman" w:cs="Times New Roman"/>
+                <w:sz w:val="24"/>
+                <w:szCs w:val="24"/>
+              </w:rPr>
+              <w:t>Port: 12350</w:t>
+            </w:r>
+          </w:p>
+          <w:p>
+            <w:pPr>
+              <w:spacing w:before="100" w:beforeAutospacing="1" w:after="100" w:afterAutospacing="1"/>
+              <w:rPr>
+                <w:rFonts w:ascii="Times New Roman" w:eastAsia="Times New Roman" w:hAnsi="Times New Roman" w:cs="Times New Roman"/>
+                <w:sz w:val="24"/>
+                <w:szCs w:val="24"/>
+              </w:rPr>
+            </w:pPr>
+            <w:r>
+              <w:rPr>
+                <w:rFonts w:ascii="Times New Roman" w:eastAsia="Times New Roman" w:hAnsi="Times New Roman" w:cs="Times New Roman"/>
+                <w:sz w:val="24"/>
+                <w:szCs w:val="24"/>
+              </w:rPr>
+              <w:t>Database: flashcard</w:t>
+            </w:r>
+          </w:p>
+          <w:p>
+            <w:pPr>
+              <w:spacing w:before="100" w:beforeAutospacing="1" w:after="100" w:afterAutospacing="1"/>
+              <w:rPr>
+                <w:sz w:val="28"/>
+                <w:szCs w:val="28"/>
+              </w:rPr>
+            </w:pPr>
+            <w:r>
+              <w:rPr>
+                <w:rFonts w:ascii="Times New Roman" w:eastAsia="Times New Roman" w:hAnsi="Times New Roman" w:cs="Times New Roman"/>
+                <w:sz w:val="24"/>
+                <w:szCs w:val="24"/>
+              </w:rPr>
+              <w:t xml:space="preserve">username: </w:t>
+            </w:r>
+            <w:proofErr w:type="spellStart"/>
+            <w:r>
+              <w:rPr>
+                <w:sz w:val="28"/>
+                <w:szCs w:val="28"/>
+              </w:rPr>
+              <w:t>avnadmin</w:t>
+            </w:r>
+            <w:proofErr w:type="spellEnd"/>
+          </w:p>
+          <w:p>
+            <w:pPr>
+              <w:spacing w:before="100" w:beforeAutospacing="1" w:after="100" w:afterAutospacing="1"/>
+              <w:rPr>
+                <w:sz w:val="28"/>
+                <w:szCs w:val="28"/>
+              </w:rPr>
+            </w:pPr>
+          </w:p>
+          <w:p>
+            <w:pPr>
+              <w:spacing w:before="100" w:beforeAutospacing="1" w:after="100" w:afterAutospacing="1"/>
+              <w:rPr>
+                <w:sz w:val="28"/>
+                <w:szCs w:val="28"/>
+              </w:rPr>
+            </w:pPr>
+            <w:r>
+              <w:rPr>
+                <w:sz w:val="28"/>
+                <w:szCs w:val="28"/>
+              </w:rPr>
+              <w:t xml:space="preserve">password: </w:t>
+            </w:r>
+            <w:r>
+              <w:rPr>
+                <w:sz w:val="28"/>
+                <w:szCs w:val="28"/>
+              </w:rPr>
+              <w:t>AVNS_B2BPHB23YlxcEZtxfDW</w:t>
+            </w:r>
+          </w:p>
+          <w:p>
+            <w:pPr>
+              <w:spacing w:before="100" w:beforeAutospacing="1" w:after="100" w:afterAutospacing="1"/>
+              <w:rPr>
+                <w:rFonts w:ascii="Times New Roman" w:eastAsia="Times New Roman" w:hAnsi="Times New Roman" w:cs="Times New Roman"/>
+                <w:sz w:val="24"/>
+                <w:szCs w:val="24"/>
+              </w:rPr>
+            </w:pPr>
+            <w:r>
+              <w:rPr>
+                <w:sz w:val="28"/>
+                <w:szCs w:val="28"/>
+              </w:rPr>
+              <w:t xml:space="preserve">SSL CA File: </w:t>
+            </w:r>
+            <w:proofErr w:type="spellStart"/>
+            <w:r>
+              <w:rPr>
+                <w:sz w:val="28"/>
+                <w:szCs w:val="28"/>
+              </w:rPr>
+              <w:t>ca.pem</w:t>
+            </w:r>
+            <w:proofErr w:type="spellEnd"/>
+          </w:p>
+        </w:tc>
+        <w:tc>
+          <w:tcPr>
+            <w:tcW w:w="4675" w:type="dxa"/>
+          </w:tcPr>
+          <w:p>
+            <w:pPr>
+              <w:spacing w:before="100" w:beforeAutospacing="1" w:after="100" w:afterAutospacing="1"/>
+              <w:rPr>
+                <w:rFonts w:ascii="Times New Roman" w:eastAsia="Times New Roman" w:hAnsi="Times New Roman" w:cs="Times New Roman"/>
+                <w:sz w:val="24"/>
+                <w:szCs w:val="24"/>
+              </w:rPr>
+            </w:pPr>
+          </w:p>
+        </w:tc>
+      </w:tr>
+    </w:tbl>
+    <w:p>
+      <w:pPr>
+        <w:spacing w:before="100" w:beforeAutospacing="1" w:after="100" w:afterAutospacing="1" w:line="240" w:lineRule="auto"/>
+        <w:rPr>
+          <w:rFonts w:ascii="Times New Roman" w:eastAsia="Times New Roman" w:hAnsi="Times New Roman" w:cs="Times New Roman"/>
+          <w:sz w:val="24"/>
+          <w:szCs w:val="24"/>
+        </w:rPr>
+      </w:pPr>
     </w:p>
     <w:sectPr>
       <w:pgSz w:w="12240" w:h="15840"/>
@@ -7714,8 +7888,8 @@
 </file>
 
 <file path=word/numbering.xml><?xml version="1.0" encoding="utf-8"?>
-<w:numbering xmlns:wpc="http://schemas.microsoft.com/office/word/2010/wordprocessingCanvas" xmlns:mc="http://schemas.openxmlformats.org/markup-compatibility/2006" xmlns:o="urn:schemas-microsoft-com:office:office" xmlns:r="http://schemas.openxmlformats.org/officeDocument/2006/relationships" xmlns:m="http://schemas.openxmlformats.org/officeDocument/2006/math" xmlns:v="urn:schemas-microsoft-com:vml" xmlns:wp14="http://schemas.microsoft.com/office/word/2010/wordprocessingDrawing" xmlns:wp="http://schemas.openxmlformats.org/drawingml/2006/wordprocessingDrawing" xmlns:w10="urn:schemas-microsoft-com:office:word" xmlns:w="http://schemas.openxmlformats.org/wordprocessingml/2006/main" xmlns:w14="http://schemas.microsoft.com/office/word/2010/wordml" xmlns:w15="http://schemas.microsoft.com/office/word/2012/wordml" xmlns:wpg="http://schemas.microsoft.com/office/word/2010/wordprocessingGroup" xmlns:wpi="http://schemas.microsoft.com/office/word/2010/wordprocessingInk" xmlns:wne="http://schemas.microsoft.com/office/word/2006/wordml" xmlns:wps="http://schemas.microsoft.com/office/word/2010/wordprocessingShape" mc:Ignorable="w14 w15 wp14">
-  <w:abstractNum w:abstractNumId="0">
+<w:numbering xmlns:wpc="http://schemas.microsoft.com/office/word/2010/wordprocessingCanvas" xmlns:cx="http://schemas.microsoft.com/office/drawing/2014/chartex" xmlns:mc="http://schemas.openxmlformats.org/markup-compatibility/2006" xmlns:o="urn:schemas-microsoft-com:office:office" xmlns:r="http://schemas.openxmlformats.org/officeDocument/2006/relationships" xmlns:m="http://schemas.openxmlformats.org/officeDocument/2006/math" xmlns:v="urn:schemas-microsoft-com:vml" xmlns:wp14="http://schemas.microsoft.com/office/word/2010/wordprocessingDrawing" xmlns:wp="http://schemas.openxmlformats.org/drawingml/2006/wordprocessingDrawing" xmlns:w10="urn:schemas-microsoft-com:office:word" xmlns:w="http://schemas.openxmlformats.org/wordprocessingml/2006/main" xmlns:w14="http://schemas.microsoft.com/office/word/2010/wordml" xmlns:w15="http://schemas.microsoft.com/office/word/2012/wordml" xmlns:w16se="http://schemas.microsoft.com/office/word/2015/wordml/symex" xmlns:wpg="http://schemas.microsoft.com/office/word/2010/wordprocessingGroup" xmlns:wpi="http://schemas.microsoft.com/office/word/2010/wordprocessingInk" xmlns:wne="http://schemas.microsoft.com/office/word/2006/wordml" xmlns:wps="http://schemas.microsoft.com/office/word/2010/wordprocessingShape" mc:Ignorable="w14 w15 w16se wp14">
+  <w:abstractNum w:abstractNumId="0" w15:restartNumberingAfterBreak="0">
     <w:nsid w:val="153F3EBC"/>
     <w:multiLevelType w:val="multilevel"/>
     <w:tmpl w:val="F7A038EA"/>
@@ -7864,7 +8038,7 @@
       </w:rPr>
     </w:lvl>
   </w:abstractNum>
-  <w:abstractNum w:abstractNumId="1">
+  <w:abstractNum w:abstractNumId="1" w15:restartNumberingAfterBreak="0">
     <w:nsid w:val="1A8F03CC"/>
     <w:multiLevelType w:val="multilevel"/>
     <w:tmpl w:val="A93A9D30"/>
@@ -8013,7 +8187,7 @@
       </w:rPr>
     </w:lvl>
   </w:abstractNum>
-  <w:abstractNum w:abstractNumId="2">
+  <w:abstractNum w:abstractNumId="2" w15:restartNumberingAfterBreak="0">
     <w:nsid w:val="441C361C"/>
     <w:multiLevelType w:val="hybridMultilevel"/>
     <w:tmpl w:val="12A6C738"/>
@@ -8102,7 +8276,7 @@
       </w:pPr>
     </w:lvl>
   </w:abstractNum>
-  <w:abstractNum w:abstractNumId="3">
+  <w:abstractNum w:abstractNumId="3" w15:restartNumberingAfterBreak="0">
     <w:nsid w:val="5EEE24FF"/>
     <w:multiLevelType w:val="multilevel"/>
     <w:tmpl w:val="F26A7E50"/>
@@ -8251,7 +8425,7 @@
       </w:rPr>
     </w:lvl>
   </w:abstractNum>
-  <w:abstractNum w:abstractNumId="4">
+  <w:abstractNum w:abstractNumId="4" w15:restartNumberingAfterBreak="0">
     <w:nsid w:val="644E4342"/>
     <w:multiLevelType w:val="multilevel"/>
     <w:tmpl w:val="ED8C92CE"/>
@@ -8419,7 +8593,7 @@
 </file>
 
 <file path=word/styles.xml><?xml version="1.0" encoding="utf-8"?>
-<w:styles xmlns:mc="http://schemas.openxmlformats.org/markup-compatibility/2006" xmlns:r="http://schemas.openxmlformats.org/officeDocument/2006/relationships" xmlns:w="http://schemas.openxmlformats.org/wordprocessingml/2006/main" xmlns:w14="http://schemas.microsoft.com/office/word/2010/wordml" xmlns:w15="http://schemas.microsoft.com/office/word/2012/wordml" mc:Ignorable="w14 w15">
+<w:styles xmlns:mc="http://schemas.openxmlformats.org/markup-compatibility/2006" xmlns:r="http://schemas.openxmlformats.org/officeDocument/2006/relationships" xmlns:w="http://schemas.openxmlformats.org/wordprocessingml/2006/main" xmlns:w14="http://schemas.microsoft.com/office/word/2010/wordml" xmlns:w15="http://schemas.microsoft.com/office/word/2012/wordml" xmlns:w16se="http://schemas.microsoft.com/office/word/2015/wordml/symex" mc:Ignorable="w14 w15 w16se">
   <w:docDefaults>
     <w:rPrDefault>
       <w:rPr>
@@ -8890,6 +9064,25 @@
       <w:szCs w:val="20"/>
     </w:rPr>
   </w:style>
+  <w:style w:type="table" w:styleId="TableGrid">
+    <w:name w:val="Table Grid"/>
+    <w:basedOn w:val="TableNormal"/>
+    <w:uiPriority w:val="39"/>
+    <w:rsid w:val="00866A06"/>
+    <w:pPr>
+      <w:spacing w:after="0" w:line="240" w:lineRule="auto"/>
+    </w:pPr>
+    <w:tblPr>
+      <w:tblBorders>
+        <w:top w:val="single" w:sz="4" w:space="0" w:color="auto"/>
+        <w:left w:val="single" w:sz="4" w:space="0" w:color="auto"/>
+        <w:bottom w:val="single" w:sz="4" w:space="0" w:color="auto"/>
+        <w:right w:val="single" w:sz="4" w:space="0" w:color="auto"/>
+        <w:insideH w:val="single" w:sz="4" w:space="0" w:color="auto"/>
+        <w:insideV w:val="single" w:sz="4" w:space="0" w:color="auto"/>
+      </w:tblBorders>
+    </w:tblPr>
+  </w:style>
 </w:styles>
 </file>
 

</xml_diff>

<commit_message>
Update Process User for Activity
</commit_message>
<xml_diff>
--- a/Document/Thiết_kế_hệ_thống.docx
+++ b/Document/Thiết_kế_hệ_thống.docx
@@ -12048,7 +12048,17 @@
                 <w:sz w:val="24"/>
                 <w:szCs w:val="24"/>
               </w:rPr>
-              <w:t>get_all</w:t>
+              <w:t>get</w:t>
+            </w:r>
+            <w:bookmarkStart w:id="0" w:name="_GoBack"/>
+            <w:bookmarkEnd w:id="0"/>
+            <w:r>
+              <w:rPr>
+                <w:rFonts w:ascii="Times New Roman" w:eastAsia="Times New Roman" w:hAnsi="Times New Roman" w:cs="Times New Roman"/>
+                <w:sz w:val="24"/>
+                <w:szCs w:val="24"/>
+              </w:rPr>
+              <w:t>_all</w:t>
             </w:r>
             <w:proofErr w:type="spellEnd"/>
           </w:p>
@@ -12187,18 +12197,8 @@
                 <w:sz w:val="24"/>
                 <w:szCs w:val="24"/>
               </w:rPr>
-              <w:t>/</w:t>
-            </w:r>
-            <w:proofErr w:type="spellStart"/>
-            <w:r>
-              <w:rPr>
-                <w:rFonts w:ascii="Times New Roman" w:eastAsia="Times New Roman" w:hAnsi="Times New Roman" w:cs="Times New Roman"/>
-                <w:sz w:val="24"/>
-                <w:szCs w:val="24"/>
-              </w:rPr>
-              <w:t>getById</w:t>
-            </w:r>
-            <w:proofErr w:type="spellEnd"/>
+              <w:t>/get/</w:t>
+            </w:r>
             <w:r>
               <w:rPr>
                 <w:rFonts w:ascii="Times New Roman" w:eastAsia="Times New Roman" w:hAnsi="Times New Roman" w:cs="Times New Roman"/>
@@ -12830,8 +12830,6 @@
               </w:rPr>
               <w:t>/upload</w:t>
             </w:r>
-            <w:bookmarkStart w:id="0" w:name="_GoBack"/>
-            <w:bookmarkEnd w:id="0"/>
           </w:p>
         </w:tc>
         <w:tc>
@@ -12914,6 +12912,36 @@
           <w:szCs w:val="24"/>
         </w:rPr>
       </w:pPr>
+      <w:hyperlink r:id="rId23" w:history="1">
+        <w:r>
+          <w:rPr>
+            <w:rStyle w:val="Hyperlink"/>
+            <w:rFonts w:ascii="Times New Roman" w:eastAsia="Times New Roman" w:hAnsi="Times New Roman" w:cs="Times New Roman"/>
+            <w:sz w:val="24"/>
+            <w:szCs w:val="24"/>
+          </w:rPr>
+          <w:t>https://www.scribd.com/document/692562684/Baocaodoancs2-Xay-D%E1%BB%B1ng-Website-Qu%E1%BA%A3n-L%C3%BD-%C4%90%E1%BB%93-An-Sinh-Vien</w:t>
+        </w:r>
+      </w:hyperlink>
+    </w:p>
+    <w:p>
+      <w:pPr>
+        <w:spacing w:before="100" w:beforeAutospacing="1" w:after="100" w:afterAutospacing="1" w:line="240" w:lineRule="auto"/>
+        <w:rPr>
+          <w:rFonts w:ascii="Times New Roman" w:eastAsia="Times New Roman" w:hAnsi="Times New Roman" w:cs="Times New Roman"/>
+          <w:sz w:val="24"/>
+          <w:szCs w:val="24"/>
+        </w:rPr>
+      </w:pPr>
+      <w:r>
+        <w:rPr>
+          <w:rFonts w:ascii="Times New Roman" w:eastAsia="Times New Roman" w:hAnsi="Times New Roman" w:cs="Times New Roman"/>
+          <w:sz w:val="24"/>
+          <w:szCs w:val="24"/>
+        </w:rPr>
+        <w:lastRenderedPageBreak/>
+        <w:t>https://lib.hpu.edu.vn/jspui/bitstream/123456789/25211/1/8_NguyenVanTuyen_CT1501.pdf</w:t>
+      </w:r>
     </w:p>
     <w:sectPr>
       <w:pgSz w:w="12240" w:h="15840"/>

</xml_diff>